<commit_message>
docs: fill real CNAME target for fund.kuja.org + clarify CNAME-only
Domain registered on the web service; required record is
CNAME fund -> u7b375h8.up.railway.app. Only a CNAME is needed (all
existing kuja.org subdomains are CNAME-only and verified). Note the
Railway CLI _railway-verify TXT line is not required and its printed
value has a doubled prefix bug.

Co-Authored-By: Claude Opus 4.8 <noreply@anthropic.com>
</commit_message>
<xml_diff>
--- a/docs/Kuja_Fund_Domain_Setup_fund.kuja.org.docx
+++ b/docs/Kuja_Fund_Domain_Setup_fund.kuja.org.docx
@@ -432,7 +432,19 @@
         <w:rPr>
           <w:rStyle w:val="VerbatimChar"/>
         </w:rPr>
-        <w:t xml:space="preserve">near.kuja.org</w:t>
+        <w:t xml:space="preserve">saxansaxo.kuja.org</w:t>
+      </w:r>
+      <w:r>
+        <w:t xml:space="preserve">,</w:t>
+      </w:r>
+      <w:r>
+        <w:t xml:space="preserve"> </w:t>
+      </w:r>
+      <w:r>
+        <w:rPr>
+          <w:rStyle w:val="VerbatimChar"/>
+        </w:rPr>
+        <w:t xml:space="preserve">sclr.kuja.org</w:t>
       </w:r>
       <w:r>
         <w:t xml:space="preserve">), so this is one more subdomain record.</w:t>
@@ -440,7 +452,56 @@
     </w:p>
     <w:p>
       <w:pPr>
-        <w:pStyle w:val="BodyText"/>
+        <w:pStyle w:val="BlockText"/>
+      </w:pPr>
+      <w:r>
+        <w:rPr>
+          <w:b/>
+          <w:bCs/>
+        </w:rPr>
+        <w:t xml:space="preserve">The custom domain is already registered in Railway</w:t>
+      </w:r>
+      <w:r>
+        <w:t xml:space="preserve"> </w:t>
+      </w:r>
+      <w:r>
+        <w:t xml:space="preserve">(Part B is done — see below), so the target value is known.</w:t>
+      </w:r>
+      <w:r>
+        <w:t xml:space="preserve"> </w:t>
+      </w:r>
+      <w:r>
+        <w:rPr>
+          <w:b/>
+          <w:bCs/>
+        </w:rPr>
+        <w:t xml:space="preserve">Add exactly ONE record — this CNAME. No TXT record is needed</w:t>
+      </w:r>
+      <w:r>
+        <w:t xml:space="preserve"> </w:t>
+      </w:r>
+      <w:r>
+        <w:t xml:space="preserve">(all three existing kuja.org subdomains are CNAME-only and verified; Railway verifies</w:t>
+      </w:r>
+      <w:r>
+        <w:t xml:space="preserve"> </w:t>
+      </w:r>
+      <w:r>
+        <w:rPr>
+          <w:rStyle w:val="VerbatimChar"/>
+        </w:rPr>
+        <w:t xml:space="preserve">fund</w:t>
+      </w:r>
+      <w:r>
+        <w:t xml:space="preserve"> </w:t>
+      </w:r>
+      <w:r>
+        <w:t xml:space="preserve">the same way).</w:t>
+      </w:r>
+    </w:p>
+    <w:p>
+      <w:pPr>
+        <w:pStyle w:val="FirstParagraph"/>
       </w:pPr>
       <w:r>
         <w:t xml:space="preserve">Add a single</w:t>
@@ -625,25 +686,21 @@
             </w:pPr>
             <w:r>
               <w:rPr>
+                <w:rStyle w:val="VerbatimChar"/>
                 <w:b/>
                 <w:bCs/>
               </w:rPr>
-              <w:t xml:space="preserve">the CNAME target Railway shows</w:t>
+              <w:t xml:space="preserve">u7b375h8.up.railway.app</w:t>
             </w:r>
             <w:r>
               <w:t xml:space="preserve"> </w:t>
             </w:r>
             <w:r>
-              <w:t xml:space="preserve">in Part B (e.g. </w:t>
-            </w:r>
-            <w:r>
               <w:rPr>
-                <w:rStyle w:val="VerbatimChar"/>
+                <w:i/>
+                <w:iCs/>
               </w:rPr>
-              <w:t xml:space="preserve">…​.up.railway.app</w:t>
-            </w:r>
-            <w:r>
-              <w:t xml:space="preserve">) — copy it exactly</w:t>
+              <w:t xml:space="preserve">(copy exactly)</w:t>
             </w:r>
           </w:p>
         </w:tc>
@@ -724,6 +781,68 @@
         </w:tc>
       </w:tr>
     </w:tbl>
+    <w:p>
+      <w:pPr>
+        <w:pStyle w:val="BlockText"/>
+      </w:pPr>
+      <w:r>
+        <w:rPr>
+          <w:b/>
+          <w:bCs/>
+        </w:rPr>
+        <w:t xml:space="preserve">Ignore any</w:t>
+      </w:r>
+      <w:r>
+        <w:rPr>
+          <w:b/>
+          <w:bCs/>
+        </w:rPr>
+        <w:t xml:space="preserve"> </w:t>
+      </w:r>
+      <w:r>
+        <w:rPr>
+          <w:rStyle w:val="VerbatimChar"/>
+          <w:b/>
+          <w:bCs/>
+        </w:rPr>
+        <w:t xml:space="preserve">_railway-verify</w:t>
+      </w:r>
+      <w:r>
+        <w:rPr>
+          <w:b/>
+          <w:bCs/>
+        </w:rPr>
+        <w:t xml:space="preserve"> </w:t>
+      </w:r>
+      <w:r>
+        <w:rPr>
+          <w:b/>
+          <w:bCs/>
+        </w:rPr>
+        <w:t xml:space="preserve">TXT line</w:t>
+      </w:r>
+      <w:r>
+        <w:t xml:space="preserve"> </w:t>
+      </w:r>
+      <w:r>
+        <w:t xml:space="preserve">you may see printed by the Railway CLI — it is not in Railway’s required-records list for this domain, its CLI rendering has a doubled</w:t>
+      </w:r>
+      <w:r>
+        <w:t xml:space="preserve"> </w:t>
+      </w:r>
+      <w:r>
+        <w:rPr>
+          <w:rStyle w:val="VerbatimChar"/>
+        </w:rPr>
+        <w:t xml:space="preserve">railway-verify=</w:t>
+      </w:r>
+      <w:r>
+        <w:t xml:space="preserve"> </w:t>
+      </w:r>
+      <w:r>
+        <w:t xml:space="preserve">prefix bug, and the CNAME alone is what flips the domain to Active.</w:t>
+      </w:r>
+    </w:p>
     <w:bookmarkStart w:id="9" w:name="X58dd89c8a3cebfd12abf3a6367acdb15887bf83"/>
     <w:p>
       <w:pPr>
@@ -1011,6 +1130,87 @@
     </w:p>
     <w:p>
       <w:pPr>
+        <w:pStyle w:val="BlockText"/>
+      </w:pPr>
+      <w:r>
+        <w:t xml:space="preserve">✅</w:t>
+      </w:r>
+      <w:r>
+        <w:t xml:space="preserve"> </w:t>
+      </w:r>
+      <w:r>
+        <w:rPr>
+          <w:b/>
+          <w:bCs/>
+        </w:rPr>
+        <w:t xml:space="preserve">Already done (2026-08-17).</w:t>
+      </w:r>
+      <w:r>
+        <w:t xml:space="preserve"> </w:t>
+      </w:r>
+      <w:r>
+        <w:rPr>
+          <w:rStyle w:val="VerbatimChar"/>
+        </w:rPr>
+        <w:t xml:space="preserve">fund.kuja.org</w:t>
+      </w:r>
+      <w:r>
+        <w:t xml:space="preserve"> </w:t>
+      </w:r>
+      <w:r>
+        <w:t xml:space="preserve">is registered on the</w:t>
+      </w:r>
+      <w:r>
+        <w:t xml:space="preserve"> </w:t>
+      </w:r>
+      <w:r>
+        <w:rPr>
+          <w:rStyle w:val="VerbatimChar"/>
+        </w:rPr>
+        <w:t xml:space="preserve">web</w:t>
+      </w:r>
+      <w:r>
+        <w:t xml:space="preserve"> </w:t>
+      </w:r>
+      <w:r>
+        <w:t xml:space="preserve">service; Railway’s required CNAME target is</w:t>
+      </w:r>
+      <w:r>
+        <w:t xml:space="preserve"> </w:t>
+      </w:r>
+      <w:r>
+        <w:rPr>
+          <w:rStyle w:val="VerbatimChar"/>
+          <w:b/>
+          <w:bCs/>
+        </w:rPr>
+        <w:t xml:space="preserve">u7b375h8.up.railway.app</w:t>
+      </w:r>
+      <w:r>
+        <w:t xml:space="preserve"> </w:t>
+      </w:r>
+      <w:r>
+        <w:t xml:space="preserve">(already filled into Part A). It shows</w:t>
+      </w:r>
+      <w:r>
+        <w:t xml:space="preserve"> </w:t>
+      </w:r>
+      <w:r>
+        <w:rPr>
+          <w:b/>
+          <w:bCs/>
+        </w:rPr>
+        <w:t xml:space="preserve">“Waiting for DNS update”</w:t>
+      </w:r>
+      <w:r>
+        <w:t xml:space="preserve"> </w:t>
+      </w:r>
+      <w:r>
+        <w:t xml:space="preserve">until Part A propagates — that is expected. You only need Part B if you ever have to re-create it.</w:t>
+      </w:r>
+    </w:p>
+    <w:p>
+      <w:pPr>
         <w:pStyle w:val="Compact"/>
         <w:numPr>
           <w:ilvl w:val="0"/>
@@ -1181,6 +1381,38 @@
       </w:r>
       <w:r>
         <w:t xml:space="preserve">to point at — give this to the DNS team for Part A.</w:t>
+      </w:r>
+      <w:r>
+        <w:t xml:space="preserve"> </w:t>
+      </w:r>
+      <w:r>
+        <w:rPr>
+          <w:i/>
+          <w:iCs/>
+        </w:rPr>
+        <w:t xml:space="preserve">(For this domain it is</w:t>
+      </w:r>
+      <w:r>
+        <w:rPr>
+          <w:i/>
+          <w:iCs/>
+        </w:rPr>
+        <w:t xml:space="preserve"> </w:t>
+      </w:r>
+      <w:r>
+        <w:rPr>
+          <w:rStyle w:val="VerbatimChar"/>
+          <w:i/>
+          <w:iCs/>
+        </w:rPr>
+        <w:t xml:space="preserve">u7b375h8.up.railway.app</w:t>
+      </w:r>
+      <w:r>
+        <w:rPr>
+          <w:i/>
+          <w:iCs/>
+        </w:rPr>
+        <w:t xml:space="preserve">.)</w:t>
       </w:r>
     </w:p>
     <w:p>
@@ -2487,22 +2719,22 @@
           <w:b/>
           <w:bCs/>
         </w:rPr>
-        <w:t xml:space="preserve">DNS record:</w:t>
-      </w:r>
-      <w:r>
-        <w:t xml:space="preserve"> </w:t>
-      </w:r>
-      <w:r>
-        <w:rPr>
-          <w:rStyle w:val="VerbatimChar"/>
-        </w:rPr>
-        <w:t xml:space="preserve">CNAME  fund  →  &lt;target Railway shows&gt;</w:t>
-      </w:r>
-      <w:r>
-        <w:t xml:space="preserve"> </w:t>
-      </w:r>
-      <w:r>
-        <w:t xml:space="preserve">(TTL 300, DNS-only if Cloudflare)</w:t>
+        <w:t xml:space="preserve">DNS record (the only one needed):</w:t>
+      </w:r>
+      <w:r>
+        <w:t xml:space="preserve"> </w:t>
+      </w:r>
+      <w:r>
+        <w:rPr>
+          <w:rStyle w:val="VerbatimChar"/>
+        </w:rPr>
+        <w:t xml:space="preserve">CNAME  fund  →  u7b375h8.up.railway.app</w:t>
+      </w:r>
+      <w:r>
+        <w:t xml:space="preserve"> </w:t>
+      </w:r>
+      <w:r>
+        <w:t xml:space="preserve">(TTL 300, DNS-only if Cloudflare; no TXT)</w:t>
       </w:r>
     </w:p>
     <w:p>

</xml_diff>

<commit_message>
Correct fund.kuja.org runbook: no TXT needed; blocker is Railway cert issuance
Verified against Railway's GraphQL API (source of truth): fund.kuja.org
requires only the CNAME (already propagated) — no _railway-verify TXT, same
as the working proximate/saxansaxo domains. The real blocker is Railway's
TLS cert status = VALIDATING_OWNERSHIP (edge still serving *.up.railway.app
wildcard → SEC_E_WRONG_PRINCIPAL / "Not Found"). Reframed the doc: CNAME is
the only DNS record; issuance is automatic; if stuck, remove+re-add the
domain in Railway (a Railway step, not DNS). Removes the earlier, incorrect
"add the _railway-verify TXT" guidance.

Co-Authored-By: Claude Opus 4.8 <noreply@anthropic.com>
</commit_message>
<xml_diff>
--- a/docs/Kuja_Fund_Domain_Setup_fund.kuja.org.docx
+++ b/docs/Kuja_Fund_Domain_Setup_fund.kuja.org.docx
@@ -2,7 +2,7 @@
 <file path=word/document.xml><?xml version="1.0" encoding="utf-8"?>
 <w:document xmlns:w="http://schemas.openxmlformats.org/wordprocessingml/2006/main" xmlns:m="http://schemas.openxmlformats.org/officeDocument/2006/math" xmlns:r="http://schemas.openxmlformats.org/officeDocument/2006/relationships" xmlns:o="urn:schemas-microsoft-com:office:office" xmlns:v="urn:schemas-microsoft-com:vml" xmlns:w10="urn:schemas-microsoft-com:office:word" xmlns:a="http://schemas.openxmlformats.org/drawingml/2006/main" xmlns:pic="http://schemas.openxmlformats.org/drawingml/2006/picture" xmlns:wp="http://schemas.openxmlformats.org/drawingml/2006/wordprocessingDrawing">
   <w:body>
-    <w:bookmarkStart w:id="17" w:name="X6c7546df9cadd2a584e4e31fbfad7bf4eb518c2"/>
+    <w:bookmarkStart w:id="18" w:name="X6c7546df9cadd2a584e4e31fbfad7bf4eb518c2"/>
     <w:p>
       <w:pPr>
         <w:pStyle w:val="Heading1"/>
@@ -68,164 +68,138 @@
           <w:b/>
           <w:bCs/>
         </w:rPr>
-        <w:t xml:space="preserve">corrected 2026-08-18.</w:t>
+        <w:t xml:space="preserve">re-verified against Railway’s API 2026-08-19.</w:t>
       </w:r>
     </w:p>
     <w:p>
       <w:pPr>
         <w:pStyle w:val="Heading2"/>
       </w:pPr>
-      <w:bookmarkStart w:id="9" w:name="Xd3752e3a7e988368cb45f2c8ca5b16defc5f4a6"/>
-      <w:r>
-        <w:t xml:space="preserve">⚠️ If you’re stuck right now (page shows Railway</w:t>
-      </w:r>
-      <w:r>
-        <w:t xml:space="preserve"> </w:t>
-      </w:r>
-      <w:r>
-        <w:t xml:space="preserve">“Not Found”</w:t>
+      <w:bookmarkStart w:id="9" w:name="X9e4b6b7a0795f18dbe1b99793a783a249de37d5"/>
+      <w:r>
+        <w:t xml:space="preserve">✅ Current status (checked 2026-08-19) — you’ve done the DNS part; it’s now Railway’s turn</w:t>
+      </w:r>
+      <w:bookmarkEnd w:id="9"/>
+    </w:p>
+    <w:p>
+      <w:pPr>
+        <w:pStyle w:val="BlockText"/>
+      </w:pPr>
+      <w:r>
+        <w:t xml:space="preserve">We queried Railway’s API directly. Here is the real state of</w:t>
+      </w:r>
+      <w:r>
+        <w:t xml:space="preserve"> </w:t>
+      </w:r>
+      <w:r>
+        <w:rPr>
+          <w:rStyle w:val="VerbatimChar"/>
+        </w:rPr>
+        <w:t xml:space="preserve">fund.kuja.org</w:t>
+      </w:r>
+      <w:r>
+        <w:t xml:space="preserve">:</w:t>
+      </w:r>
+      <w:r>
+        <w:t xml:space="preserve"> </w:t>
+      </w:r>
+      <w:r>
+        <w:t xml:space="preserve">- ✅ The</w:t>
+      </w:r>
+      <w:r>
+        <w:t xml:space="preserve"> </w:t>
+      </w:r>
+      <w:r>
+        <w:rPr>
+          <w:rStyle w:val="VerbatimChar"/>
+          <w:b/>
+          <w:bCs/>
+        </w:rPr>
+        <w:t xml:space="preserve">CNAME</w:t>
+      </w:r>
+      <w:r>
+        <w:t xml:space="preserve"> </w:t>
+      </w:r>
+      <w:r>
+        <w:t xml:space="preserve">(</w:t>
+      </w:r>
+      <w:r>
+        <w:rPr>
+          <w:rStyle w:val="VerbatimChar"/>
+        </w:rPr>
+        <w:t xml:space="preserve">fund</w:t>
+      </w:r>
+      <w:r>
+        <w:t xml:space="preserve"> </w:t>
+      </w:r>
+      <w:r>
+        <w:t xml:space="preserve">→</w:t>
+      </w:r>
+      <w:r>
+        <w:t xml:space="preserve"> </w:t>
+      </w:r>
+      <w:r>
+        <w:rPr>
+          <w:rStyle w:val="VerbatimChar"/>
+        </w:rPr>
+        <w:t xml:space="preserve">u7b375h8.up.railway.app</w:t>
       </w:r>
       <w:r>
         <w:t xml:space="preserve">)</w:t>
       </w:r>
-      <w:bookmarkEnd w:id="9"/>
-    </w:p>
-    <w:p>
-      <w:pPr>
-        <w:pStyle w:val="BlockText"/>
-      </w:pPr>
-      <w:r>
-        <w:rPr>
-          <w:b/>
-          <w:bCs/>
-        </w:rPr>
-        <w:t xml:space="preserve">This is a one-record fix.</w:t>
-      </w:r>
-      <w:r>
-        <w:t xml:space="preserve"> </w:t>
-      </w:r>
-      <w:r>
-        <w:t xml:space="preserve">As of 2026-08-18 the DNS is in this exact state:</w:t>
-      </w:r>
-      <w:r>
-        <w:t xml:space="preserve"> </w:t>
-      </w:r>
-      <w:r>
-        <w:t xml:space="preserve">- ✅ The</w:t>
-      </w:r>
-      <w:r>
-        <w:t xml:space="preserve"> </w:t>
-      </w:r>
-      <w:r>
-        <w:rPr>
-          <w:rStyle w:val="VerbatimChar"/>
-        </w:rPr>
-        <w:t xml:space="preserve">CNAME</w:t>
-      </w:r>
-      <w:r>
-        <w:t xml:space="preserve"> </w:t>
-      </w:r>
-      <w:r>
-        <w:t xml:space="preserve">(</w:t>
-      </w:r>
-      <w:r>
-        <w:rPr>
-          <w:rStyle w:val="VerbatimChar"/>
-        </w:rPr>
-        <w:t xml:space="preserve">fund</w:t>
-      </w:r>
-      <w:r>
-        <w:t xml:space="preserve"> </w:t>
-      </w:r>
-      <w:r>
-        <w:t xml:space="preserve">→</w:t>
-      </w:r>
-      <w:r>
-        <w:t xml:space="preserve"> </w:t>
-      </w:r>
-      <w:r>
-        <w:rPr>
-          <w:rStyle w:val="VerbatimChar"/>
-        </w:rPr>
-        <w:t xml:space="preserve">u7b375h8.up.railway.app</w:t>
-      </w:r>
-      <w:r>
-        <w:t xml:space="preserve">)</w:t>
-      </w:r>
-      <w:r>
-        <w:t xml:space="preserve"> </w:t>
-      </w:r>
-      <w:r>
-        <w:rPr>
-          <w:b/>
-          <w:bCs/>
-        </w:rPr>
-        <w:t xml:space="preserve">is in place and resolving.</w:t>
-      </w:r>
-      <w:r>
-        <w:t xml:space="preserve"> </w:t>
-      </w:r>
-      <w:r>
-        <w:t xml:space="preserve">- ❌ The domain-</w:t>
-      </w:r>
-      <w:r>
-        <w:rPr>
-          <w:b/>
-          <w:bCs/>
-        </w:rPr>
-        <w:t xml:space="preserve">verification</w:t>
-      </w:r>
-      <w:r>
-        <w:t xml:space="preserve"> </w:t>
-      </w:r>
-      <w:r>
-        <w:t xml:space="preserve">record</w:t>
-      </w:r>
-      <w:r>
-        <w:t xml:space="preserve"> </w:t>
-      </w:r>
-      <w:r>
-        <w:rPr>
-          <w:rStyle w:val="VerbatimChar"/>
-        </w:rPr>
-        <w:t xml:space="preserve">_railway-verify.fund</w:t>
-      </w:r>
-      <w:r>
-        <w:t xml:space="preserve"> </w:t>
-      </w:r>
-      <w:r>
-        <w:t xml:space="preserve">(a</w:t>
-      </w:r>
-      <w:r>
-        <w:t xml:space="preserve"> </w:t>
-      </w:r>
-      <w:r>
-        <w:rPr>
-          <w:b/>
-          <w:bCs/>
-        </w:rPr>
-        <w:t xml:space="preserve">TXT</w:t>
-      </w:r>
-      <w:r>
-        <w:t xml:space="preserve">)</w:t>
-      </w:r>
-      <w:r>
-        <w:t xml:space="preserve"> </w:t>
-      </w:r>
-      <w:r>
-        <w:rPr>
-          <w:b/>
-          <w:bCs/>
-        </w:rPr>
-        <w:t xml:space="preserve">is missing.</w:t>
-      </w:r>
-    </w:p>
-    <w:p>
-      <w:pPr>
-        <w:pStyle w:val="BlockText"/>
-      </w:pPr>
-      <w:r>
-        <w:t xml:space="preserve">Railway will not issue the HTTPS certificate or route the hostname until that TXT exists, so the edge shows</w:t>
+      <w:r>
+        <w:t xml:space="preserve"> </w:t>
+      </w:r>
+      <w:r>
+        <w:rPr>
+          <w:b/>
+          <w:bCs/>
+        </w:rPr>
+        <w:t xml:space="preserve">is in place, correct, and fully propagated.</w:t>
+      </w:r>
+      <w:r>
+        <w:t xml:space="preserve"> </w:t>
+      </w:r>
+      <w:r>
+        <w:t xml:space="preserve">This is the</w:t>
+      </w:r>
+      <w:r>
+        <w:t xml:space="preserve"> </w:t>
+      </w:r>
+      <w:r>
+        <w:rPr>
+          <w:b/>
+          <w:bCs/>
+        </w:rPr>
+        <w:t xml:space="preserve">only</w:t>
+      </w:r>
+      <w:r>
+        <w:t xml:space="preserve"> </w:t>
+      </w:r>
+      <w:r>
+        <w:t xml:space="preserve">DNS record Railway requires.</w:t>
+      </w:r>
+      <w:r>
+        <w:t xml:space="preserve"> </w:t>
+      </w:r>
+      <w:r>
+        <w:t xml:space="preserve">- ⏳ Railway’s</w:t>
+      </w:r>
+      <w:r>
+        <w:t xml:space="preserve"> </w:t>
+      </w:r>
+      <w:r>
+        <w:rPr>
+          <w:b/>
+          <w:bCs/>
+        </w:rPr>
+        <w:t xml:space="preserve">TLS certificate is still being issued</w:t>
+      </w:r>
+      <w:r>
+        <w:t xml:space="preserve"> </w:t>
+      </w:r>
+      <w:r>
+        <w:t xml:space="preserve">— its status is</w:t>
       </w:r>
       <w:r>
         <w:t xml:space="preserve"> </w:t>
@@ -235,60 +209,121 @@
           <w:i/>
           <w:iCs/>
         </w:rPr>
-        <w:t xml:space="preserve">“the train has not arrived at the station.”</w:t>
-      </w:r>
-      <w:r>
-        <w:t xml:space="preserve"> </w:t>
-      </w:r>
-      <w:r>
-        <w:rPr>
-          <w:b/>
-          <w:bCs/>
-        </w:rPr>
-        <w:t xml:space="preserve">An earlier version of this runbook wrongly said</w:t>
-      </w:r>
-      <w:r>
-        <w:rPr>
-          <w:b/>
-          <w:bCs/>
-        </w:rPr>
-        <w:t xml:space="preserve"> </w:t>
-      </w:r>
-      <w:r>
-        <w:rPr>
-          <w:b/>
-          <w:bCs/>
-        </w:rPr>
-        <w:t xml:space="preserve">“no TXT is needed”</w:t>
-      </w:r>
-      <w:r>
-        <w:rPr>
-          <w:b/>
-          <w:bCs/>
-        </w:rPr>
-        <w:t xml:space="preserve"> </w:t>
-      </w:r>
-      <w:r>
-        <w:rPr>
-          <w:b/>
-          <w:bCs/>
-        </w:rPr>
-        <w:t xml:space="preserve">— that was the blocker.</w:t>
-      </w:r>
-      <w:r>
-        <w:t xml:space="preserve"> </w:t>
-      </w:r>
-      <w:r>
-        <w:t xml:space="preserve">Proof: the two live tenants both have this record —</w:t>
-      </w:r>
-      <w:r>
-        <w:t xml:space="preserve"> </w:t>
-      </w:r>
-      <w:r>
-        <w:rPr>
-          <w:rStyle w:val="VerbatimChar"/>
-        </w:rPr>
-        <w:t xml:space="preserve">_railway-verify.proximate.kuja.org</w:t>
+        <w:t xml:space="preserve">“validating ownership.”</w:t>
+      </w:r>
+      <w:r>
+        <w:t xml:space="preserve"> </w:t>
+      </w:r>
+      <w:r>
+        <w:t xml:space="preserve">Until the certificate finishes, the edge serves its default</w:t>
+      </w:r>
+      <w:r>
+        <w:t xml:space="preserve"> </w:t>
+      </w:r>
+      <w:r>
+        <w:rPr>
+          <w:rStyle w:val="VerbatimChar"/>
+        </w:rPr>
+        <w:t xml:space="preserve">*.up.railway.app</w:t>
+      </w:r>
+      <w:r>
+        <w:t xml:space="preserve"> </w:t>
+      </w:r>
+      <w:r>
+        <w:t xml:space="preserve">certificate, which doesn’t match</w:t>
+      </w:r>
+      <w:r>
+        <w:t xml:space="preserve"> </w:t>
+      </w:r>
+      <w:r>
+        <w:rPr>
+          <w:rStyle w:val="VerbatimChar"/>
+        </w:rPr>
+        <w:t xml:space="preserve">fund.kuja.org</w:t>
+      </w:r>
+      <w:r>
+        <w:t xml:space="preserve">, so browsers show a certificate/</w:t>
+      </w:r>
+      <w:r>
+        <w:t xml:space="preserve">“Not Found”</w:t>
+      </w:r>
+      <w:r>
+        <w:t xml:space="preserve"> </w:t>
+      </w:r>
+      <w:r>
+        <w:t xml:space="preserve">error.</w:t>
+      </w:r>
+    </w:p>
+    <w:p>
+      <w:pPr>
+        <w:pStyle w:val="BlockText"/>
+      </w:pPr>
+      <w:r>
+        <w:rPr>
+          <w:b/>
+          <w:bCs/>
+        </w:rPr>
+        <w:t xml:space="preserve">There is nothing more to add in DNS.</w:t>
+      </w:r>
+      <w:r>
+        <w:t xml:space="preserve"> </w:t>
+      </w:r>
+      <w:r>
+        <w:t xml:space="preserve">In particular</w:t>
+      </w:r>
+      <w:r>
+        <w:t xml:space="preserve"> </w:t>
+      </w:r>
+      <w:r>
+        <w:rPr>
+          <w:b/>
+          <w:bCs/>
+        </w:rPr>
+        <w:t xml:space="preserve">no</w:t>
+      </w:r>
+      <w:r>
+        <w:rPr>
+          <w:b/>
+          <w:bCs/>
+        </w:rPr>
+        <w:t xml:space="preserve"> </w:t>
+      </w:r>
+      <w:r>
+        <w:rPr>
+          <w:rStyle w:val="VerbatimChar"/>
+          <w:b/>
+          <w:bCs/>
+        </w:rPr>
+        <w:t xml:space="preserve">_railway-verify</w:t>
+      </w:r>
+      <w:r>
+        <w:rPr>
+          <w:b/>
+          <w:bCs/>
+        </w:rPr>
+        <w:t xml:space="preserve"> </w:t>
+      </w:r>
+      <w:r>
+        <w:rPr>
+          <w:b/>
+          <w:bCs/>
+        </w:rPr>
+        <w:t xml:space="preserve">TXT record is needed</w:t>
+      </w:r>
+      <w:r>
+        <w:t xml:space="preserve"> </w:t>
+      </w:r>
+      <w:r>
+        <w:t xml:space="preserve">— Railway validates ownership automatically over the CNAME (an earlier version of this runbook wrongly told you to add a TXT; please ignore that — Railway’s own required-records list contains only the CNAME, exactly like the working</w:t>
+      </w:r>
+      <w:r>
+        <w:t xml:space="preserve"> </w:t>
+      </w:r>
+      <w:r>
+        <w:rPr>
+          <w:rStyle w:val="VerbatimChar"/>
+        </w:rPr>
+        <w:t xml:space="preserve">proximate</w:t>
       </w:r>
       <w:r>
         <w:t xml:space="preserve"> </w:t>
@@ -303,43 +338,13 @@
         <w:rPr>
           <w:rStyle w:val="VerbatimChar"/>
         </w:rPr>
-        <w:t xml:space="preserve">_railway-verify.saxansaxo.kuja.org</w:t>
-      </w:r>
-      <w:r>
-        <w:t xml:space="preserve"> </w:t>
-      </w:r>
-      <w:r>
-        <w:t xml:space="preserve">each resolve to a</w:t>
-      </w:r>
-      <w:r>
-        <w:t xml:space="preserve"> </w:t>
-      </w:r>
-      <w:r>
-        <w:rPr>
-          <w:rStyle w:val="VerbatimChar"/>
-        </w:rPr>
-        <w:t xml:space="preserve">railway-verify=…</w:t>
-      </w:r>
-      <w:r>
-        <w:t xml:space="preserve"> </w:t>
-      </w:r>
-      <w:r>
-        <w:t xml:space="preserve">value;</w:t>
-      </w:r>
-      <w:r>
-        <w:t xml:space="preserve"> </w:t>
-      </w:r>
-      <w:r>
-        <w:rPr>
-          <w:rStyle w:val="VerbatimChar"/>
-        </w:rPr>
-        <w:t xml:space="preserve">fund</w:t>
-      </w:r>
-      <w:r>
-        <w:t xml:space="preserve"> </w:t>
-      </w:r>
-      <w:r>
-        <w:t xml:space="preserve">does not.</w:t>
+        <w:t xml:space="preserve">saxansaxo</w:t>
+      </w:r>
+      <w:r>
+        <w:t xml:space="preserve"> </w:t>
+      </w:r>
+      <w:r>
+        <w:t xml:space="preserve">domains).</w:t>
       </w:r>
     </w:p>
     <w:p>
@@ -351,71 +356,56 @@
           <w:b/>
           <w:bCs/>
         </w:rPr>
-        <w:t xml:space="preserve">To finish: add the TXT record in Part A (record #2). Its value comes from Railway →</w:t>
-      </w:r>
-      <w:r>
-        <w:rPr>
-          <w:b/>
-          <w:bCs/>
-        </w:rPr>
-        <w:t xml:space="preserve"> </w:t>
-      </w:r>
-      <w:r>
-        <w:rPr>
-          <w:rStyle w:val="VerbatimChar"/>
-          <w:b/>
-          <w:bCs/>
-        </w:rPr>
-        <w:t xml:space="preserve">web</w:t>
-      </w:r>
-      <w:r>
-        <w:rPr>
-          <w:b/>
-          <w:bCs/>
-        </w:rPr>
-        <w:t xml:space="preserve"> </w:t>
-      </w:r>
-      <w:r>
-        <w:rPr>
-          <w:b/>
-          <w:bCs/>
-        </w:rPr>
-        <w:t xml:space="preserve">→ Settings → Networking → the</w:t>
-      </w:r>
-      <w:r>
-        <w:rPr>
-          <w:b/>
-          <w:bCs/>
-        </w:rPr>
-        <w:t xml:space="preserve"> </w:t>
-      </w:r>
-      <w:r>
-        <w:rPr>
-          <w:rStyle w:val="VerbatimChar"/>
-          <w:b/>
-          <w:bCs/>
+        <w:t xml:space="preserve">What happens next:</w:t>
+      </w:r>
+      <w:r>
+        <w:t xml:space="preserve"> </w:t>
+      </w:r>
+      <w:r>
+        <w:t xml:space="preserve">Railway issues the certificate automatically once it finishes validating — usually within ~30 minutes of the CNAME propagating, occasionally a few hours. When it’s done,</w:t>
+      </w:r>
+      <w:r>
+        <w:t xml:space="preserve"> </w:t>
+      </w:r>
+      <w:r>
+        <w:rPr>
+          <w:rStyle w:val="VerbatimChar"/>
         </w:rPr>
         <w:t xml:space="preserve">fund.kuja.org</w:t>
       </w:r>
       <w:r>
-        <w:rPr>
-          <w:b/>
-          <w:bCs/>
-        </w:rPr>
-        <w:t xml:space="preserve"> </w:t>
-      </w:r>
-      <w:r>
-        <w:rPr>
-          <w:b/>
-          <w:bCs/>
-        </w:rPr>
-        <w:t xml:space="preserve">entry.</w:t>
-      </w:r>
-      <w:r>
-        <w:t xml:space="preserve"> </w:t>
-      </w:r>
-      <w:r>
-        <w:t xml:space="preserve">Nothing else needs to change.</w:t>
+        <w:t xml:space="preserve"> </w:t>
+      </w:r>
+      <w:r>
+        <w:t xml:space="preserve">starts serving with no further action.</w:t>
+      </w:r>
+      <w:r>
+        <w:t xml:space="preserve"> </w:t>
+      </w:r>
+      <w:r>
+        <w:rPr>
+          <w:b/>
+          <w:bCs/>
+        </w:rPr>
+        <w:t xml:space="preserve">If it’s still stuck after a few hours,</w:t>
+      </w:r>
+      <w:r>
+        <w:t xml:space="preserve"> </w:t>
+      </w:r>
+      <w:r>
+        <w:t xml:space="preserve">the fix is on the Railway side (dev/ops), not DNS — see</w:t>
+      </w:r>
+      <w:r>
+        <w:t xml:space="preserve"> </w:t>
+      </w:r>
+      <w:r>
+        <w:t xml:space="preserve">“If it stays stuck”</w:t>
+      </w:r>
+      <w:r>
+        <w:t xml:space="preserve"> </w:t>
+      </w:r>
+      <w:r>
+        <w:t xml:space="preserve">below.</w:t>
       </w:r>
     </w:p>
     <w:p>
@@ -537,7 +527,60 @@
         <w:t xml:space="preserve">additive</w:t>
       </w:r>
       <w:r>
-        <w:t xml:space="preserve">. The existing Railway URL keeps working throughout, so you can set this up and verify before anyone relies on</w:t>
+        <w:t xml:space="preserve">. The existing Railway URL keeps working throughout.</w:t>
+      </w:r>
+      <w:r>
+        <w:t xml:space="preserve"> </w:t>
+      </w:r>
+      <w:r>
+        <w:t xml:space="preserve">-</w:t>
+      </w:r>
+      <w:r>
+        <w:t xml:space="preserve"> </w:t>
+      </w:r>
+      <w:r>
+        <w:rPr>
+          <w:b/>
+          <w:bCs/>
+        </w:rPr>
+        <w:t xml:space="preserve">No app routing change needed:</w:t>
+      </w:r>
+      <w:r>
+        <w:t xml:space="preserve"> </w:t>
+      </w:r>
+      <w:r>
+        <w:t xml:space="preserve">the app maps any un-recognised</w:t>
+      </w:r>
+      <w:r>
+        <w:t xml:space="preserve"> </w:t>
+      </w:r>
+      <w:r>
+        <w:rPr>
+          <w:rStyle w:val="VerbatimChar"/>
+        </w:rPr>
+        <w:t xml:space="preserve">*.kuja.org</w:t>
+      </w:r>
+      <w:r>
+        <w:t xml:space="preserve"> </w:t>
+      </w:r>
+      <w:r>
+        <w:t xml:space="preserve">host to the default</w:t>
+      </w:r>
+      <w:r>
+        <w:t xml:space="preserve"> </w:t>
+      </w:r>
+      <w:r>
+        <w:rPr>
+          <w:b/>
+          <w:bCs/>
+        </w:rPr>
+        <w:t xml:space="preserve">Kuja</w:t>
+      </w:r>
+      <w:r>
+        <w:t xml:space="preserve"> </w:t>
+      </w:r>
+      <w:r>
+        <w:t xml:space="preserve">tenant automatically, so</w:t>
       </w:r>
       <w:r>
         <w:t xml:space="preserve"> </w:t>
@@ -549,7 +592,60 @@
         <w:t xml:space="preserve">fund.kuja.org</w:t>
       </w:r>
       <w:r>
-        <w:t xml:space="preserve">.</w:t>
+        <w:t xml:space="preserve"> </w:t>
+      </w:r>
+      <w:r>
+        <w:t xml:space="preserve">lands on the right tenant with no code/DB change.</w:t>
+      </w:r>
+      <w:r>
+        <w:t xml:space="preserve"> </w:t>
+      </w:r>
+      <w:r>
+        <w:t xml:space="preserve">- TLS (HTTPS) is issued automatically by Railway (Let’s Encrypt) once the CNAME resolves — you do</w:t>
+      </w:r>
+      <w:r>
+        <w:t xml:space="preserve"> </w:t>
+      </w:r>
+      <w:r>
+        <w:rPr>
+          <w:b/>
+          <w:bCs/>
+        </w:rPr>
+        <w:t xml:space="preserve">not</w:t>
+      </w:r>
+      <w:r>
+        <w:t xml:space="preserve"> </w:t>
+      </w:r>
+      <w:r>
+        <w:t xml:space="preserve">upload a certificate, and you do</w:t>
+      </w:r>
+      <w:r>
+        <w:t xml:space="preserve"> </w:t>
+      </w:r>
+      <w:r>
+        <w:rPr>
+          <w:b/>
+          <w:bCs/>
+        </w:rPr>
+        <w:t xml:space="preserve">not</w:t>
+      </w:r>
+      <w:r>
+        <w:t xml:space="preserve"> </w:t>
+      </w:r>
+      <w:r>
+        <w:t xml:space="preserve">add any verification record.</w:t>
+      </w:r>
+    </w:p>
+    <w:p>
+      <w:pPr>
+        <w:pStyle w:val="BodyText"/>
+      </w:pPr>
+      <w:r>
+        <w:rPr>
+          <w:b/>
+          <w:bCs/>
+        </w:rPr>
+        <w:t xml:space="preserve">Who does what</w:t>
       </w:r>
       <w:r>
         <w:t xml:space="preserve"> </w:t>
@@ -565,93 +661,38 @@
           <w:b/>
           <w:bCs/>
         </w:rPr>
-        <w:t xml:space="preserve">No app routing change needed:</w:t>
-      </w:r>
-      <w:r>
-        <w:t xml:space="preserve"> </w:t>
-      </w:r>
-      <w:r>
-        <w:t xml:space="preserve">the app maps any un-recognised</w:t>
-      </w:r>
-      <w:r>
-        <w:t xml:space="preserve"> </w:t>
-      </w:r>
-      <w:r>
-        <w:rPr>
-          <w:rStyle w:val="VerbatimChar"/>
-        </w:rPr>
-        <w:t xml:space="preserve">*.kuja.org</w:t>
-      </w:r>
-      <w:r>
-        <w:t xml:space="preserve"> </w:t>
-      </w:r>
-      <w:r>
-        <w:t xml:space="preserve">host to the default</w:t>
-      </w:r>
-      <w:r>
-        <w:t xml:space="preserve"> </w:t>
-      </w:r>
-      <w:r>
-        <w:rPr>
-          <w:b/>
-          <w:bCs/>
-        </w:rPr>
-        <w:t xml:space="preserve">Kuja</w:t>
-      </w:r>
-      <w:r>
-        <w:t xml:space="preserve"> </w:t>
-      </w:r>
-      <w:r>
-        <w:t xml:space="preserve">tenant automatically, so</w:t>
-      </w:r>
-      <w:r>
-        <w:t xml:space="preserve"> </w:t>
-      </w:r>
-      <w:r>
-        <w:rPr>
-          <w:rStyle w:val="VerbatimChar"/>
-        </w:rPr>
-        <w:t xml:space="preserve">fund.kuja.org</w:t>
-      </w:r>
-      <w:r>
-        <w:t xml:space="preserve"> </w:t>
-      </w:r>
-      <w:r>
-        <w:t xml:space="preserve">lands on the right tenant with no code/DB change.</w:t>
-      </w:r>
-      <w:r>
-        <w:t xml:space="preserve"> </w:t>
-      </w:r>
-      <w:r>
-        <w:t xml:space="preserve">- TLS (HTTPS) is issued automatically by Railway (Let’s Encrypt) once DNS resolves — you do</w:t>
-      </w:r>
-      <w:r>
-        <w:t xml:space="preserve"> </w:t>
-      </w:r>
-      <w:r>
-        <w:rPr>
-          <w:b/>
-          <w:bCs/>
-        </w:rPr>
-        <w:t xml:space="preserve">not</w:t>
-      </w:r>
-      <w:r>
-        <w:t xml:space="preserve"> </w:t>
-      </w:r>
-      <w:r>
-        <w:t xml:space="preserve">upload a certificate.</w:t>
-      </w:r>
-    </w:p>
-    <w:p>
-      <w:pPr>
-        <w:pStyle w:val="BodyText"/>
-      </w:pPr>
-      <w:r>
-        <w:rPr>
-          <w:b/>
-          <w:bCs/>
-        </w:rPr>
-        <w:t xml:space="preserve">Who does what</w:t>
+        <w:t xml:space="preserve">Part A (DNS):</w:t>
+      </w:r>
+      <w:r>
+        <w:t xml:space="preserve"> </w:t>
+      </w:r>
+      <w:r>
+        <w:t xml:space="preserve">your DNS/IT team, in the</w:t>
+      </w:r>
+      <w:r>
+        <w:t xml:space="preserve"> </w:t>
+      </w:r>
+      <w:r>
+        <w:rPr>
+          <w:rStyle w:val="VerbatimChar"/>
+        </w:rPr>
+        <w:t xml:space="preserve">kuja.org</w:t>
+      </w:r>
+      <w:r>
+        <w:t xml:space="preserve"> </w:t>
+      </w:r>
+      <w:r>
+        <w:t xml:space="preserve">DNS zone.</w:t>
+      </w:r>
+      <w:r>
+        <w:t xml:space="preserve"> </w:t>
+      </w:r>
+      <w:r>
+        <w:rPr>
+          <w:b/>
+          <w:bCs/>
+        </w:rPr>
+        <w:t xml:space="preserve">This is a single CNAME — and per the status box above, it’s already done.</w:t>
       </w:r>
       <w:r>
         <w:t xml:space="preserve"> </w:t>
@@ -667,50 +708,13 @@
           <w:b/>
           <w:bCs/>
         </w:rPr>
-        <w:t xml:space="preserve">Part A (DNS):</w:t>
-      </w:r>
-      <w:r>
-        <w:t xml:space="preserve"> </w:t>
-      </w:r>
-      <w:r>
-        <w:t xml:space="preserve">your DNS/IT team, in the</w:t>
-      </w:r>
-      <w:r>
-        <w:t xml:space="preserve"> </w:t>
-      </w:r>
-      <w:r>
-        <w:rPr>
-          <w:rStyle w:val="VerbatimChar"/>
-        </w:rPr>
-        <w:t xml:space="preserve">kuja.org</w:t>
-      </w:r>
-      <w:r>
-        <w:t xml:space="preserve"> </w:t>
-      </w:r>
-      <w:r>
-        <w:t xml:space="preserve">DNS zone.</w:t>
-      </w:r>
-      <w:r>
-        <w:t xml:space="preserve"> </w:t>
-      </w:r>
-      <w:r>
-        <w:t xml:space="preserve">-</w:t>
-      </w:r>
-      <w:r>
-        <w:t xml:space="preserve"> </w:t>
-      </w:r>
-      <w:r>
-        <w:rPr>
-          <w:b/>
-          <w:bCs/>
-        </w:rPr>
         <w:t xml:space="preserve">Parts B–C (Railway domain + app config):</w:t>
       </w:r>
       <w:r>
         <w:t xml:space="preserve"> </w:t>
       </w:r>
       <w:r>
-        <w:t xml:space="preserve">whoever administers the Railway account (dev/ops). Parts B and A are done together (B gives you the exact value A needs).</w:t>
+        <w:t xml:space="preserve">whoever administers the Railway account (dev/ops).</w:t>
       </w:r>
       <w:r>
         <w:t xml:space="preserve"> </w:t>
@@ -792,159 +796,35 @@
         <w:t xml:space="preserve">saxansaxo.kuja.org</w:t>
       </w:r>
       <w:r>
-        <w:t xml:space="preserve">), so this is the same shape they used.</w:t>
-      </w:r>
-    </w:p>
-    <w:p>
-      <w:pPr>
-        <w:pStyle w:val="BlockText"/>
-      </w:pPr>
-      <w:r>
-        <w:rPr>
-          <w:b/>
-          <w:bCs/>
-        </w:rPr>
-        <w:t xml:space="preserve">The custom domain is already registered in Railway</w:t>
-      </w:r>
-      <w:r>
-        <w:t xml:space="preserve"> </w:t>
-      </w:r>
-      <w:r>
-        <w:t xml:space="preserve">(Part B is done — see below), so both values are known.</w:t>
-      </w:r>
-      <w:r>
-        <w:t xml:space="preserve"> </w:t>
-      </w:r>
-      <w:r>
-        <w:rPr>
-          <w:b/>
-          <w:bCs/>
-        </w:rPr>
-        <w:t xml:space="preserve">You need TWO records:</w:t>
-      </w:r>
-      <w:r>
-        <w:t xml:space="preserve"> </w:t>
-      </w:r>
-      <w:r>
-        <w:t xml:space="preserve">the</w:t>
-      </w:r>
-      <w:r>
-        <w:t xml:space="preserve"> </w:t>
-      </w:r>
-      <w:r>
-        <w:rPr>
-          <w:rStyle w:val="VerbatimChar"/>
-        </w:rPr>
-        <w:t xml:space="preserve">CNAME</w:t>
-      </w:r>
-      <w:r>
-        <w:t xml:space="preserve"> </w:t>
-      </w:r>
-      <w:r>
-        <w:t xml:space="preserve">(routes traffic)</w:t>
-      </w:r>
-      <w:r>
-        <w:t xml:space="preserve"> </w:t>
-      </w:r>
-      <w:r>
-        <w:rPr>
-          <w:b/>
-          <w:bCs/>
-        </w:rPr>
-        <w:t xml:space="preserve">and</w:t>
-      </w:r>
-      <w:r>
-        <w:t xml:space="preserve"> </w:t>
-      </w:r>
-      <w:r>
-        <w:t xml:space="preserve">the</w:t>
-      </w:r>
-      <w:r>
-        <w:t xml:space="preserve"> </w:t>
-      </w:r>
-      <w:r>
-        <w:rPr>
-          <w:rStyle w:val="VerbatimChar"/>
-        </w:rPr>
-        <w:t xml:space="preserve">_railway-verify</w:t>
-      </w:r>
-      <w:r>
-        <w:t xml:space="preserve"> </w:t>
-      </w:r>
-      <w:r>
-        <w:rPr>
-          <w:rStyle w:val="VerbatimChar"/>
-        </w:rPr>
-        <w:t xml:space="preserve">TXT</w:t>
-      </w:r>
-      <w:r>
-        <w:t xml:space="preserve"> </w:t>
-      </w:r>
-      <w:r>
-        <w:t xml:space="preserve">(proves you own the domain so Railway will issue the certificate). The live tenants</w:t>
-      </w:r>
-      <w:r>
-        <w:t xml:space="preserve"> </w:t>
-      </w:r>
-      <w:r>
-        <w:rPr>
-          <w:rStyle w:val="VerbatimChar"/>
-        </w:rPr>
-        <w:t xml:space="preserve">proximate</w:t>
-      </w:r>
-      <w:r>
-        <w:t xml:space="preserve"> </w:t>
-      </w:r>
-      <w:r>
-        <w:t xml:space="preserve">and</w:t>
-      </w:r>
-      <w:r>
-        <w:t xml:space="preserve"> </w:t>
-      </w:r>
-      <w:r>
-        <w:rPr>
-          <w:rStyle w:val="VerbatimChar"/>
-        </w:rPr>
-        <w:t xml:space="preserve">saxansaxo</w:t>
-      </w:r>
-      <w:r>
-        <w:t xml:space="preserve"> </w:t>
-      </w:r>
-      <w:r>
-        <w:t xml:space="preserve">each have both — that is why they work.</w:t>
-      </w:r>
-      <w:r>
-        <w:t xml:space="preserve"> </w:t>
-      </w:r>
-      <w:r>
-        <w:rPr>
-          <w:rStyle w:val="VerbatimChar"/>
-        </w:rPr>
-        <w:t xml:space="preserve">fund</w:t>
-      </w:r>
-      <w:r>
-        <w:t xml:space="preserve"> </w:t>
-      </w:r>
-      <w:r>
-        <w:t xml:space="preserve">currently has only the CNAME, which is why it’s stuck.</w:t>
-      </w:r>
-    </w:p>
-    <w:p>
-      <w:pPr>
-        <w:pStyle w:val="FirstParagraph"/>
-      </w:pPr>
-      <w:r>
-        <w:rPr>
-          <w:b/>
-          <w:bCs/>
-        </w:rPr>
-        <w:t xml:space="preserve">Record #1 — CNAME</w:t>
-      </w:r>
-      <w:r>
-        <w:t xml:space="preserve"> </w:t>
-      </w:r>
-      <w:r>
-        <w:t xml:space="preserve">(already in place; shown for completeness):</w:t>
+        <w:t xml:space="preserve">) the same way:</w:t>
+      </w:r>
+      <w:r>
+        <w:t xml:space="preserve"> </w:t>
+      </w:r>
+      <w:r>
+        <w:rPr>
+          <w:b/>
+          <w:bCs/>
+        </w:rPr>
+        <w:t xml:space="preserve">one CNAME each, no TXT.</w:t>
+      </w:r>
+    </w:p>
+    <w:p>
+      <w:pPr>
+        <w:pStyle w:val="BodyText"/>
+      </w:pPr>
+      <w:r>
+        <w:rPr>
+          <w:b/>
+          <w:bCs/>
+        </w:rPr>
+        <w:t xml:space="preserve">The only record — CNAME</w:t>
+      </w:r>
+      <w:r>
+        <w:t xml:space="preserve"> </w:t>
+      </w:r>
+      <w:r>
+        <w:t xml:space="preserve">(already in place; shown for completeness / re-creation):</w:t>
       </w:r>
     </w:p>
     <w:tbl>
@@ -1199,7 +1079,7 @@
               <w:t xml:space="preserve"> </w:t>
             </w:r>
             <w:r>
-              <w:t xml:space="preserve">if this zone is on Cloudflare (grey cloud), at least until the cert is issued — see gotcha #3</w:t>
+              <w:t xml:space="preserve">if this zone is on Cloudflare (grey cloud), at least until the cert is issued — see gotcha #2</w:t>
             </w:r>
           </w:p>
         </w:tc>
@@ -1210,395 +1090,7 @@
         <w:pStyle w:val="BodyText"/>
       </w:pPr>
       <w:r>
-        <w:rPr>
-          <w:b/>
-          <w:bCs/>
-        </w:rPr>
-        <w:t xml:space="preserve">Record #2 — TXT (the missing one — add this to finish):</w:t>
-      </w:r>
-    </w:p>
-    <w:tbl>
-      <w:tblPr>
-        <w:tblStyle w:val="Table"/>
-        <w:tblW w:type="pct" w:w="5000"/>
-        <w:tblLayout w:type="fixed"/>
-        <w:tblLook w:firstRow="1" w:lastRow="0" w:firstColumn="0" w:lastColumn="0" w:noHBand="0" w:noVBand="0" w:val="0020"/>
-      </w:tblPr>
-      <w:tblGrid>
-        <w:gridCol w:w="3960"/>
-        <w:gridCol w:w="3960"/>
-      </w:tblGrid>
-      <w:tr>
-        <w:trPr>
-          <w:tblHeader w:val="on"/>
-        </w:trPr>
-        <w:tc>
-          <w:tcPr/>
-          <w:p>
-            <w:pPr>
-              <w:pStyle w:val="Compact"/>
-            </w:pPr>
-            <w:r>
-              <w:t xml:space="preserve">Field</w:t>
-            </w:r>
-          </w:p>
-        </w:tc>
-        <w:tc>
-          <w:tcPr/>
-          <w:p>
-            <w:pPr>
-              <w:pStyle w:val="Compact"/>
-            </w:pPr>
-            <w:r>
-              <w:t xml:space="preserve">Value</w:t>
-            </w:r>
-          </w:p>
-        </w:tc>
-      </w:tr>
-      <w:tr>
-        <w:tc>
-          <w:tcPr/>
-          <w:p>
-            <w:pPr>
-              <w:pStyle w:val="Compact"/>
-            </w:pPr>
-            <w:r>
-              <w:rPr>
-                <w:b/>
-                <w:bCs/>
-              </w:rPr>
-              <w:t xml:space="preserve">Type</w:t>
-            </w:r>
-          </w:p>
-        </w:tc>
-        <w:tc>
-          <w:tcPr/>
-          <w:p>
-            <w:pPr>
-              <w:pStyle w:val="Compact"/>
-            </w:pPr>
-            <w:r>
-              <w:rPr>
-                <w:rStyle w:val="VerbatimChar"/>
-              </w:rPr>
-              <w:t xml:space="preserve">TXT</w:t>
-            </w:r>
-          </w:p>
-        </w:tc>
-      </w:tr>
-      <w:tr>
-        <w:tc>
-          <w:tcPr/>
-          <w:p>
-            <w:pPr>
-              <w:pStyle w:val="Compact"/>
-            </w:pPr>
-            <w:r>
-              <w:rPr>
-                <w:b/>
-                <w:bCs/>
-              </w:rPr>
-              <w:t xml:space="preserve">Host / Name</w:t>
-            </w:r>
-          </w:p>
-        </w:tc>
-        <w:tc>
-          <w:tcPr/>
-          <w:p>
-            <w:pPr>
-              <w:pStyle w:val="Compact"/>
-            </w:pPr>
-            <w:r>
-              <w:rPr>
-                <w:rStyle w:val="VerbatimChar"/>
-              </w:rPr>
-              <w:t xml:space="preserve">_railway-verify.fund</w:t>
-            </w:r>
-            <w:r>
-              <w:t xml:space="preserve"> </w:t>
-            </w:r>
-            <w:r>
-              <w:rPr>
-                <w:i/>
-                <w:iCs/>
-              </w:rPr>
-              <w:t xml:space="preserve">(just this — the zone appends</w:t>
-            </w:r>
-            <w:r>
-              <w:rPr>
-                <w:i/>
-                <w:iCs/>
-              </w:rPr>
-              <w:t xml:space="preserve"> </w:t>
-            </w:r>
-            <w:r>
-              <w:rPr>
-                <w:rStyle w:val="VerbatimChar"/>
-                <w:i/>
-                <w:iCs/>
-              </w:rPr>
-              <w:t xml:space="preserve">.kuja.org</w:t>
-            </w:r>
-            <w:r>
-              <w:rPr>
-                <w:i/>
-                <w:iCs/>
-              </w:rPr>
-              <w:t xml:space="preserve">; see gotcha #1)</w:t>
-            </w:r>
-          </w:p>
-        </w:tc>
-      </w:tr>
-      <w:tr>
-        <w:tc>
-          <w:tcPr/>
-          <w:p>
-            <w:pPr>
-              <w:pStyle w:val="Compact"/>
-            </w:pPr>
-            <w:r>
-              <w:rPr>
-                <w:b/>
-                <w:bCs/>
-              </w:rPr>
-              <w:t xml:space="preserve">Value / Content</w:t>
-            </w:r>
-          </w:p>
-        </w:tc>
-        <w:tc>
-          <w:tcPr/>
-          <w:p>
-            <w:pPr>
-              <w:pStyle w:val="Compact"/>
-            </w:pPr>
-            <w:r>
-              <w:rPr>
-                <w:rStyle w:val="VerbatimChar"/>
-              </w:rPr>
-              <w:t xml:space="preserve">railway-verify=…</w:t>
-            </w:r>
-            <w:r>
-              <w:t xml:space="preserve"> </w:t>
-            </w:r>
-            <w:r>
-              <w:t xml:space="preserve">—</w:t>
-            </w:r>
-            <w:r>
-              <w:t xml:space="preserve"> </w:t>
-            </w:r>
-            <w:r>
-              <w:rPr>
-                <w:b/>
-                <w:bCs/>
-              </w:rPr>
-              <w:t xml:space="preserve">copy the exact string from Railway →</w:t>
-            </w:r>
-            <w:r>
-              <w:rPr>
-                <w:b/>
-                <w:bCs/>
-              </w:rPr>
-              <w:t xml:space="preserve"> </w:t>
-            </w:r>
-            <w:r>
-              <w:rPr>
-                <w:rStyle w:val="VerbatimChar"/>
-                <w:b/>
-                <w:bCs/>
-              </w:rPr>
-              <w:t xml:space="preserve">web</w:t>
-            </w:r>
-            <w:r>
-              <w:rPr>
-                <w:b/>
-                <w:bCs/>
-              </w:rPr>
-              <w:t xml:space="preserve"> </w:t>
-            </w:r>
-            <w:r>
-              <w:rPr>
-                <w:b/>
-                <w:bCs/>
-              </w:rPr>
-              <w:t xml:space="preserve">→ Settings → Networking → the</w:t>
-            </w:r>
-            <w:r>
-              <w:rPr>
-                <w:b/>
-                <w:bCs/>
-              </w:rPr>
-              <w:t xml:space="preserve"> </w:t>
-            </w:r>
-            <w:r>
-              <w:rPr>
-                <w:rStyle w:val="VerbatimChar"/>
-                <w:b/>
-                <w:bCs/>
-              </w:rPr>
-              <w:t xml:space="preserve">fund.kuja.org</w:t>
-            </w:r>
-            <w:r>
-              <w:rPr>
-                <w:b/>
-                <w:bCs/>
-              </w:rPr>
-              <w:t xml:space="preserve"> </w:t>
-            </w:r>
-            <w:r>
-              <w:rPr>
-                <w:b/>
-                <w:bCs/>
-              </w:rPr>
-              <w:t xml:space="preserve">entry</w:t>
-            </w:r>
-            <w:r>
-              <w:t xml:space="preserve"> </w:t>
-            </w:r>
-            <w:r>
-              <w:t xml:space="preserve">(it lists the CNAME as done and the TXT as pending). Do</w:t>
-            </w:r>
-            <w:r>
-              <w:t xml:space="preserve"> </w:t>
-            </w:r>
-            <w:r>
-              <w:rPr>
-                <w:b/>
-                <w:bCs/>
-              </w:rPr>
-              <w:t xml:space="preserve">not</w:t>
-            </w:r>
-            <w:r>
-              <w:t xml:space="preserve"> </w:t>
-            </w:r>
-            <w:r>
-              <w:t xml:space="preserve">reuse another tenant’s value; each domain has its own.</w:t>
-            </w:r>
-            <w:r>
-              <w:t xml:space="preserve"> </w:t>
-            </w:r>
-            <w:r>
-              <w:rPr>
-                <w:b/>
-                <w:bCs/>
-              </w:rPr>
-              <w:t xml:space="preserve">Gotcha #2b: the value must contain exactly ONE</w:t>
-            </w:r>
-            <w:r>
-              <w:rPr>
-                <w:b/>
-                <w:bCs/>
-              </w:rPr>
-              <w:t xml:space="preserve"> </w:t>
-            </w:r>
-            <w:r>
-              <w:rPr>
-                <w:rStyle w:val="VerbatimChar"/>
-                <w:b/>
-                <w:bCs/>
-              </w:rPr>
-              <w:t xml:space="preserve">railway-verify=</w:t>
-            </w:r>
-            <w:r>
-              <w:rPr>
-                <w:b/>
-                <w:bCs/>
-              </w:rPr>
-              <w:t xml:space="preserve"> </w:t>
-            </w:r>
-            <w:r>
-              <w:rPr>
-                <w:b/>
-                <w:bCs/>
-              </w:rPr>
-              <w:t xml:space="preserve">prefix.</w:t>
-            </w:r>
-            <w:r>
-              <w:t xml:space="preserve"> </w:t>
-            </w:r>
-            <w:r>
-              <w:t xml:space="preserve">Railway’s field already includes it, so paste it as-is — if your DNS UI shows</w:t>
-            </w:r>
-            <w:r>
-              <w:t xml:space="preserve"> </w:t>
-            </w:r>
-            <w:r>
-              <w:rPr>
-                <w:rStyle w:val="VerbatimChar"/>
-              </w:rPr>
-              <w:t xml:space="preserve">railway-verify=railway-verify=…</w:t>
-            </w:r>
-            <w:r>
-              <w:t xml:space="preserve">, delete the duplicate.</w:t>
-            </w:r>
-          </w:p>
-        </w:tc>
-      </w:tr>
-      <w:tr>
-        <w:tc>
-          <w:tcPr/>
-          <w:p>
-            <w:pPr>
-              <w:pStyle w:val="Compact"/>
-            </w:pPr>
-            <w:r>
-              <w:rPr>
-                <w:b/>
-                <w:bCs/>
-              </w:rPr>
-              <w:t xml:space="preserve">TTL</w:t>
-            </w:r>
-          </w:p>
-        </w:tc>
-        <w:tc>
-          <w:tcPr/>
-          <w:p>
-            <w:pPr>
-              <w:pStyle w:val="Compact"/>
-            </w:pPr>
-            <w:r>
-              <w:rPr>
-                <w:rStyle w:val="VerbatimChar"/>
-              </w:rPr>
-              <w:t xml:space="preserve">300</w:t>
-            </w:r>
-          </w:p>
-        </w:tc>
-      </w:tr>
-      <w:tr>
-        <w:tc>
-          <w:tcPr/>
-          <w:p>
-            <w:pPr>
-              <w:pStyle w:val="Compact"/>
-            </w:pPr>
-            <w:r>
-              <w:rPr>
-                <w:b/>
-                <w:bCs/>
-              </w:rPr>
-              <w:t xml:space="preserve">Proxy</w:t>
-            </w:r>
-          </w:p>
-        </w:tc>
-        <w:tc>
-          <w:tcPr/>
-          <w:p>
-            <w:pPr>
-              <w:pStyle w:val="Compact"/>
-            </w:pPr>
-            <w:r>
-              <w:t xml:space="preserve">N/A (TXT records are never proxied)</w:t>
-            </w:r>
-          </w:p>
-        </w:tc>
-      </w:tr>
-    </w:tbl>
-    <w:p>
-      <w:pPr>
-        <w:pStyle w:val="BodyText"/>
-      </w:pPr>
-      <w:r>
-        <w:t xml:space="preserve">Once both records are live, Railway auto-verifies within a few minutes, issues the TLS certificate, and</w:t>
+        <w:t xml:space="preserve">That’s the whole DNS task. Once the CNAME resolves, Railway auto-validates ownership and issues the TLS certificate, and</w:t>
       </w:r>
       <w:r>
         <w:t xml:space="preserve"> </w:t>
@@ -1626,22 +1118,7 @@
         <w:t xml:space="preserve">Active</w:t>
       </w:r>
       <w:r>
-        <w:t xml:space="preserve"> </w:t>
-      </w:r>
-      <w:r>
-        <w:t xml:space="preserve">— the</w:t>
-      </w:r>
-      <w:r>
-        <w:t xml:space="preserve"> </w:t>
-      </w:r>
-      <w:r>
-        <w:t xml:space="preserve">“Not Found”</w:t>
-      </w:r>
-      <w:r>
-        <w:t xml:space="preserve"> </w:t>
-      </w:r>
-      <w:r>
-        <w:t xml:space="preserve">page disappears.</w:t>
+        <w:t xml:space="preserve">.</w:t>
       </w:r>
     </w:p>
     <w:bookmarkStart w:id="10" w:name="X58dd89c8a3cebfd12abf3a6367acdb15887bf83"/>
@@ -1666,13 +1143,15 @@
           <w:b/>
           <w:bCs/>
         </w:rPr>
-        <w:t xml:space="preserve">Don’t double the prefix — this is the trap that stuck</w:t>
-      </w:r>
-      <w:r>
-        <w:rPr>
-          <w:b/>
-          <w:bCs/>
-        </w:rPr>
+        <w:t xml:space="preserve">Don’t double the prefix.</w:t>
+      </w:r>
+      <w:r>
+        <w:t xml:space="preserve"> </w:t>
+      </w:r>
+      <w:r>
+        <w:t xml:space="preserve">Many DNS UIs auto-append the zone. Enter the host as</w:t>
+      </w:r>
+      <w:r>
         <w:t xml:space="preserve"> </w:t>
       </w:r>
       <w:r>
@@ -1684,51 +1163,10 @@
         <w:t xml:space="preserve">fund</w:t>
       </w:r>
       <w:r>
-        <w:rPr>
-          <w:b/>
-          <w:bCs/>
-        </w:rPr>
-        <w:t xml:space="preserve">.</w:t>
-      </w:r>
-      <w:r>
-        <w:t xml:space="preserve"> </w:t>
-      </w:r>
-      <w:r>
-        <w:t xml:space="preserve">Many DNS UIs auto-append the zone. Enter the host as</w:t>
-      </w:r>
-      <w:r>
-        <w:t xml:space="preserve"> </w:t>
-      </w:r>
-      <w:r>
-        <w:rPr>
-          <w:rStyle w:val="VerbatimChar"/>
-          <w:b/>
-          <w:bCs/>
-        </w:rPr>
-        <w:t xml:space="preserve">fund</w:t>
-      </w:r>
-      <w:r>
-        <w:t xml:space="preserve"> </w:t>
-      </w:r>
-      <w:r>
-        <w:t xml:space="preserve">for the CNAME and</w:t>
-      </w:r>
-      <w:r>
-        <w:t xml:space="preserve"> </w:t>
-      </w:r>
-      <w:r>
-        <w:rPr>
-          <w:rStyle w:val="VerbatimChar"/>
-          <w:b/>
-          <w:bCs/>
-        </w:rPr>
-        <w:t xml:space="preserve">_railway-verify.fund</w:t>
-      </w:r>
-      <w:r>
-        <w:t xml:space="preserve"> </w:t>
-      </w:r>
-      <w:r>
-        <w:t xml:space="preserve">for the TXT —</w:t>
+        <w:t xml:space="preserve"> </w:t>
+      </w:r>
+      <w:r>
+        <w:t xml:space="preserve">—</w:t>
       </w:r>
       <w:r>
         <w:t xml:space="preserve"> </w:t>
@@ -1750,21 +1188,6 @@
         <w:t xml:space="preserve">fund.kuja.org</w:t>
       </w:r>
       <w:r>
-        <w:t xml:space="preserve"> </w:t>
-      </w:r>
-      <w:r>
-        <w:t xml:space="preserve">/</w:t>
-      </w:r>
-      <w:r>
-        <w:t xml:space="preserve"> </w:t>
-      </w:r>
-      <w:r>
-        <w:rPr>
-          <w:rStyle w:val="VerbatimChar"/>
-        </w:rPr>
-        <w:t xml:space="preserve">_railway-verify.fund.kuja.org</w:t>
-      </w:r>
-      <w:r>
         <w:t xml:space="preserve">, or you create</w:t>
       </w:r>
       <w:r>
@@ -1777,22 +1200,7 @@
         <w:t xml:space="preserve">fund.kuja.org.kuja.org</w:t>
       </w:r>
       <w:r>
-        <w:t xml:space="preserve"> </w:t>
-      </w:r>
-      <w:r>
-        <w:t xml:space="preserve">/</w:t>
-      </w:r>
-      <w:r>
-        <w:t xml:space="preserve"> </w:t>
-      </w:r>
-      <w:r>
-        <w:rPr>
-          <w:rStyle w:val="VerbatimChar"/>
-        </w:rPr>
-        <w:t xml:space="preserve">_railway-verify.fund.kuja.org.kuja.org</w:t>
-      </w:r>
-      <w:r>
-        <w:t xml:space="preserve">, which won’t verify. (If your UI</w:t>
+        <w:t xml:space="preserve">, which won’t resolve. (If your UI</w:t>
       </w:r>
       <w:r>
         <w:t xml:space="preserve"> </w:t>
@@ -1823,52 +1231,37 @@
         <w:t xml:space="preserve"> </w:t>
       </w:r>
       <w:r>
-        <w:t xml:space="preserve">/</w:t>
-      </w:r>
-      <w:r>
-        <w:t xml:space="preserve"> </w:t>
-      </w:r>
-      <w:r>
-        <w:rPr>
-          <w:rStyle w:val="VerbatimChar"/>
-        </w:rPr>
-        <w:t xml:space="preserve">_railway-verify.fund.kuja.org</w:t>
-      </w:r>
-      <w:r>
-        <w:t xml:space="preserve"> </w:t>
-      </w:r>
-      <w:r>
-        <w:t xml:space="preserve">— but never both forms.) After saving, confirm with</w:t>
-      </w:r>
-      <w:r>
-        <w:t xml:space="preserve"> </w:t>
-      </w:r>
-      <w:r>
-        <w:rPr>
-          <w:rStyle w:val="VerbatimChar"/>
-        </w:rPr>
-        <w:t xml:space="preserve">nslookup -type=TXT _railway-verify.fund.kuja.org</w:t>
-      </w:r>
-      <w:r>
-        <w:t xml:space="preserve"> </w:t>
-      </w:r>
-      <w:r>
-        <w:t xml:space="preserve">— it must return the</w:t>
-      </w:r>
-      <w:r>
-        <w:t xml:space="preserve"> </w:t>
-      </w:r>
-      <w:r>
-        <w:rPr>
-          <w:rStyle w:val="VerbatimChar"/>
-        </w:rPr>
-        <w:t xml:space="preserve">railway-verify=…</w:t>
-      </w:r>
-      <w:r>
-        <w:t xml:space="preserve"> </w:t>
-      </w:r>
-      <w:r>
-        <w:t xml:space="preserve">value, at that exact name.</w:t>
+        <w:t xml:space="preserve">— but never both forms.) Confirm with</w:t>
+      </w:r>
+      <w:r>
+        <w:t xml:space="preserve"> </w:t>
+      </w:r>
+      <w:r>
+        <w:rPr>
+          <w:rStyle w:val="VerbatimChar"/>
+        </w:rPr>
+        <w:t xml:space="preserve">nslookup fund.kuja.org</w:t>
+      </w:r>
+      <w:r>
+        <w:t xml:space="preserve"> </w:t>
+      </w:r>
+      <w:r>
+        <w:t xml:space="preserve">— it must return a</w:t>
+      </w:r>
+      <w:r>
+        <w:t xml:space="preserve"> </w:t>
+      </w:r>
+      <w:r>
+        <w:rPr>
+          <w:rStyle w:val="VerbatimChar"/>
+        </w:rPr>
+        <w:t xml:space="preserve">*.up.railway.app</w:t>
+      </w:r>
+      <w:r>
+        <w:t xml:space="preserve"> </w:t>
+      </w:r>
+      <w:r>
+        <w:t xml:space="preserve">target.</w:t>
       </w:r>
     </w:p>
     <w:p>
@@ -1884,13 +1277,57 @@
           <w:b/>
           <w:bCs/>
         </w:rPr>
-        <w:t xml:space="preserve">Copy the target from Railway verbatim.</w:t>
-      </w:r>
-      <w:r>
-        <w:t xml:space="preserve"> </w:t>
-      </w:r>
-      <w:r>
-        <w:t xml:space="preserve">Don’t guess it or reuse another subdomain’s target — each custom domain gets its own value.</w:t>
+        <w:t xml:space="preserve">Cloudflare:</w:t>
+      </w:r>
+      <w:r>
+        <w:t xml:space="preserve"> </w:t>
+      </w:r>
+      <w:r>
+        <w:t xml:space="preserve">if</w:t>
+      </w:r>
+      <w:r>
+        <w:t xml:space="preserve"> </w:t>
+      </w:r>
+      <w:r>
+        <w:rPr>
+          <w:rStyle w:val="VerbatimChar"/>
+        </w:rPr>
+        <w:t xml:space="preserve">kuja.org</w:t>
+      </w:r>
+      <w:r>
+        <w:t xml:space="preserve"> </w:t>
+      </w:r>
+      <w:r>
+        <w:t xml:space="preserve">is proxied by Cloudflare, set this record to</w:t>
+      </w:r>
+      <w:r>
+        <w:t xml:space="preserve"> </w:t>
+      </w:r>
+      <w:r>
+        <w:rPr>
+          <w:b/>
+          <w:bCs/>
+        </w:rPr>
+        <w:t xml:space="preserve">DNS only</w:t>
+      </w:r>
+      <w:r>
+        <w:t xml:space="preserve"> </w:t>
+      </w:r>
+      <w:r>
+        <w:t xml:space="preserve">(grey cloud) so Railway/Let’s Encrypt can validate and issue the certificate. (If you later turn the orange-cloud proxy on, use SSL mode</w:t>
+      </w:r>
+      <w:r>
+        <w:t xml:space="preserve"> </w:t>
+      </w:r>
+      <w:r>
+        <w:rPr>
+          <w:b/>
+          <w:bCs/>
+        </w:rPr>
+        <w:t xml:space="preserve">Full (strict)</w:t>
+      </w:r>
+      <w:r>
+        <w:t xml:space="preserve">.)</w:t>
       </w:r>
     </w:p>
     <w:p>
@@ -1906,13 +1343,13 @@
           <w:b/>
           <w:bCs/>
         </w:rPr>
-        <w:t xml:space="preserve">Cloudflare:</w:t>
-      </w:r>
-      <w:r>
-        <w:t xml:space="preserve"> </w:t>
-      </w:r>
-      <w:r>
-        <w:t xml:space="preserve">if</w:t>
+        <w:t xml:space="preserve">CAA records:</w:t>
+      </w:r>
+      <w:r>
+        <w:t xml:space="preserve"> </w:t>
+      </w:r>
+      <w:r>
+        <w:t xml:space="preserve">if the</w:t>
       </w:r>
       <w:r>
         <w:t xml:space="preserve"> </w:t>
@@ -1927,36 +1364,40 @@
         <w:t xml:space="preserve"> </w:t>
       </w:r>
       <w:r>
-        <w:t xml:space="preserve">is proxied by Cloudflare, set this record to</w:t>
-      </w:r>
-      <w:r>
-        <w:t xml:space="preserve"> </w:t>
-      </w:r>
-      <w:r>
-        <w:rPr>
-          <w:b/>
-          <w:bCs/>
-        </w:rPr>
-        <w:t xml:space="preserve">DNS only</w:t>
-      </w:r>
-      <w:r>
-        <w:t xml:space="preserve"> </w:t>
-      </w:r>
-      <w:r>
-        <w:t xml:space="preserve">so Railway/Let’s Encrypt can validate and issue the certificate. (If you later turn the orange-cloud proxy on, use SSL mode</w:t>
-      </w:r>
-      <w:r>
-        <w:t xml:space="preserve"> </w:t>
-      </w:r>
-      <w:r>
-        <w:rPr>
-          <w:b/>
-          <w:bCs/>
-        </w:rPr>
-        <w:t xml:space="preserve">Full (strict)</w:t>
-      </w:r>
-      <w:r>
-        <w:t xml:space="preserve">.)</w:t>
+        <w:t xml:space="preserve">zone has any</w:t>
+      </w:r>
+      <w:r>
+        <w:t xml:space="preserve"> </w:t>
+      </w:r>
+      <w:r>
+        <w:rPr>
+          <w:b/>
+          <w:bCs/>
+        </w:rPr>
+        <w:t xml:space="preserve">CAA</w:t>
+      </w:r>
+      <w:r>
+        <w:t xml:space="preserve"> </w:t>
+      </w:r>
+      <w:r>
+        <w:t xml:space="preserve">records, make sure they allow</w:t>
+      </w:r>
+      <w:r>
+        <w:t xml:space="preserve"> </w:t>
+      </w:r>
+      <w:r>
+        <w:rPr>
+          <w:rStyle w:val="VerbatimChar"/>
+          <w:b/>
+          <w:bCs/>
+        </w:rPr>
+        <w:t xml:space="preserve">letsencrypt.org</w:t>
+      </w:r>
+      <w:r>
+        <w:t xml:space="preserve"> </w:t>
+      </w:r>
+      <w:r>
+        <w:t xml:space="preserve">to issue certs. (The working tenants already got Let’s Encrypt certs on this zone, so this is only a concern if CAA was changed recently.)</w:t>
       </w:r>
     </w:p>
     <w:p>
@@ -1968,77 +1409,7 @@
         </w:numPr>
       </w:pPr>
       <w:r>
-        <w:rPr>
-          <w:b/>
-          <w:bCs/>
-        </w:rPr>
-        <w:t xml:space="preserve">CAA records:</w:t>
-      </w:r>
-      <w:r>
-        <w:t xml:space="preserve"> </w:t>
-      </w:r>
-      <w:r>
-        <w:t xml:space="preserve">if the</w:t>
-      </w:r>
-      <w:r>
-        <w:t xml:space="preserve"> </w:t>
-      </w:r>
-      <w:r>
-        <w:rPr>
-          <w:rStyle w:val="VerbatimChar"/>
-        </w:rPr>
-        <w:t xml:space="preserve">kuja.org</w:t>
-      </w:r>
-      <w:r>
-        <w:t xml:space="preserve"> </w:t>
-      </w:r>
-      <w:r>
-        <w:t xml:space="preserve">zone has any</w:t>
-      </w:r>
-      <w:r>
-        <w:t xml:space="preserve"> </w:t>
-      </w:r>
-      <w:r>
-        <w:rPr>
-          <w:b/>
-          <w:bCs/>
-        </w:rPr>
-        <w:t xml:space="preserve">CAA</w:t>
-      </w:r>
-      <w:r>
-        <w:t xml:space="preserve"> </w:t>
-      </w:r>
-      <w:r>
-        <w:t xml:space="preserve">records, make sure they allow</w:t>
-      </w:r>
-      <w:r>
-        <w:t xml:space="preserve"> </w:t>
-      </w:r>
-      <w:r>
-        <w:rPr>
-          <w:rStyle w:val="VerbatimChar"/>
-          <w:b/>
-          <w:bCs/>
-        </w:rPr>
-        <w:t xml:space="preserve">letsencrypt.org</w:t>
-      </w:r>
-      <w:r>
-        <w:t xml:space="preserve"> </w:t>
-      </w:r>
-      <w:r>
-        <w:t xml:space="preserve">to issue certs, or Railway’s TLS issuance will fail.</w:t>
-      </w:r>
-    </w:p>
-    <w:p>
-      <w:pPr>
-        <w:pStyle w:val="Compact"/>
-        <w:numPr>
-          <w:ilvl w:val="0"/>
-          <w:numId w:val="1001"/>
-        </w:numPr>
-      </w:pPr>
-      <w:r>
-        <w:t xml:space="preserve">Propagation is usually a few minutes; allow up to a couple of hours.</w:t>
+        <w:t xml:space="preserve">Propagation is usually a few minutes; certificate issuance after that is usually &lt; 30 min, occasionally a couple of hours.</w:t>
       </w:r>
     </w:p>
     <w:p>
@@ -2050,13 +1421,13 @@
     </w:p>
     <w:bookmarkEnd w:id="10"/>
     <w:bookmarkEnd w:id="11"/>
-    <w:bookmarkStart w:id="12" w:name="X9df2db467071ee2b267efde4cb423ed61d8f88a"/>
+    <w:bookmarkStart w:id="13" w:name="X38e75407b8e09893d188986c0fc262163f701ef"/>
     <w:p>
       <w:pPr>
         <w:pStyle w:val="Heading2"/>
       </w:pPr>
       <w:r>
-        <w:t xml:space="preserve">Part B — Add the custom domain in Railway (dev/ops)</w:t>
+        <w:t xml:space="preserve">Part B — The custom domain in Railway (dev/ops)</w:t>
       </w:r>
     </w:p>
     <w:p>
@@ -2074,7 +1445,7 @@
           <w:b/>
           <w:bCs/>
         </w:rPr>
-        <w:t xml:space="preserve">Already done (2026-08-17).</w:t>
+        <w:t xml:space="preserve">Already done.</w:t>
       </w:r>
       <w:r>
         <w:t xml:space="preserve"> </w:t>
@@ -2104,7 +1475,7 @@
         <w:t xml:space="preserve"> </w:t>
       </w:r>
       <w:r>
-        <w:t xml:space="preserve">service; Railway’s required CNAME target is</w:t>
+        <w:t xml:space="preserve">service with the CNAME target</w:t>
       </w:r>
       <w:r>
         <w:t xml:space="preserve"> </w:t>
@@ -2118,26 +1489,23 @@
         <w:t xml:space="preserve">u7b375h8.up.railway.app</w:t>
       </w:r>
       <w:r>
-        <w:t xml:space="preserve"> </w:t>
-      </w:r>
-      <w:r>
-        <w:t xml:space="preserve">(already filled into Part A). It shows</w:t>
-      </w:r>
-      <w:r>
-        <w:t xml:space="preserve"> </w:t>
-      </w:r>
-      <w:r>
-        <w:rPr>
-          <w:b/>
-          <w:bCs/>
-        </w:rPr>
-        <w:t xml:space="preserve">“Waiting for DNS update”</w:t>
-      </w:r>
-      <w:r>
-        <w:t xml:space="preserve"> </w:t>
-      </w:r>
-      <w:r>
-        <w:t xml:space="preserve">until Part A propagates — that is expected. You only need Part B if you ever have to re-create it.</w:t>
+        <w:t xml:space="preserve">. As of 2026-08-19 Railway reports its certificate status as</w:t>
+      </w:r>
+      <w:r>
+        <w:t xml:space="preserve"> </w:t>
+      </w:r>
+      <w:r>
+        <w:rPr>
+          <w:b/>
+          <w:bCs/>
+        </w:rPr>
+        <w:t xml:space="preserve">“validating ownership”</w:t>
+      </w:r>
+      <w:r>
+        <w:t xml:space="preserve"> </w:t>
+      </w:r>
+      <w:r>
+        <w:t xml:space="preserve">— i.e. it is mid-issuance, which is expected right after the CNAME propagates. You only need the steps below if you ever have to re-create it, or if issuance stays stuck (next section).</w:t>
       </w:r>
     </w:p>
     <w:p>
@@ -2251,10 +1619,25 @@
           <w:b/>
           <w:bCs/>
         </w:rPr>
-        <w:t xml:space="preserve">Settings → Networking → Custom Domain → + Custom Domain</w:t>
+        <w:t xml:space="preserve">Settings → Networking → Custom Domain</w:t>
       </w:r>
       <w:r>
         <w:t xml:space="preserve">.</w:t>
+      </w:r>
+      <w:r>
+        <w:t xml:space="preserve"> </w:t>
+      </w:r>
+      <w:r>
+        <w:rPr>
+          <w:rStyle w:val="VerbatimChar"/>
+        </w:rPr>
+        <w:t xml:space="preserve">fund.kuja.org</w:t>
+      </w:r>
+      <w:r>
+        <w:t xml:space="preserve"> </w:t>
+      </w:r>
+      <w:r>
+        <w:t xml:space="preserve">should already be listed.</w:t>
       </w:r>
     </w:p>
     <w:p>
@@ -2266,16 +1649,170 @@
         </w:numPr>
       </w:pPr>
       <w:r>
-        <w:t xml:space="preserve">Enter</w:t>
-      </w:r>
-      <w:r>
-        <w:t xml:space="preserve"> </w:t>
-      </w:r>
-      <w:r>
-        <w:rPr>
-          <w:rStyle w:val="VerbatimChar"/>
-          <w:b/>
-          <w:bCs/>
+        <w:t xml:space="preserve">The panel shows the certificate state.</w:t>
+      </w:r>
+      <w:r>
+        <w:t xml:space="preserve"> </w:t>
+      </w:r>
+      <w:r>
+        <w:rPr>
+          <w:b/>
+          <w:bCs/>
+        </w:rPr>
+        <w:t xml:space="preserve">Active/green</w:t>
+      </w:r>
+      <w:r>
+        <w:t xml:space="preserve"> </w:t>
+      </w:r>
+      <w:r>
+        <w:t xml:space="preserve">= done.</w:t>
+      </w:r>
+      <w:r>
+        <w:t xml:space="preserve"> </w:t>
+      </w:r>
+      <w:r>
+        <w:rPr>
+          <w:b/>
+          <w:bCs/>
+        </w:rPr>
+        <w:t xml:space="preserve">“Issuing”</w:t>
+      </w:r>
+      <w:r>
+        <w:rPr>
+          <w:b/>
+          <w:bCs/>
+        </w:rPr>
+        <w:t xml:space="preserve"> </w:t>
+      </w:r>
+      <w:r>
+        <w:rPr>
+          <w:b/>
+          <w:bCs/>
+        </w:rPr>
+        <w:t xml:space="preserve">/</w:t>
+      </w:r>
+      <w:r>
+        <w:rPr>
+          <w:b/>
+          <w:bCs/>
+        </w:rPr>
+        <w:t xml:space="preserve"> </w:t>
+      </w:r>
+      <w:r>
+        <w:rPr>
+          <w:b/>
+          <w:bCs/>
+        </w:rPr>
+        <w:t xml:space="preserve">“validating”</w:t>
+      </w:r>
+      <w:r>
+        <w:t xml:space="preserve"> </w:t>
+      </w:r>
+      <w:r>
+        <w:t xml:space="preserve">= in progress, just wait.</w:t>
+      </w:r>
+    </w:p>
+    <w:bookmarkStart w:id="12" w:name="X18a6953cad5a38c7927ecbee0de5502d58a37d2"/>
+    <w:p>
+      <w:pPr>
+        <w:pStyle w:val="Heading3"/>
+      </w:pPr>
+      <w:r>
+        <w:t xml:space="preserve">If it stays stuck (still</w:t>
+      </w:r>
+      <w:r>
+        <w:t xml:space="preserve"> </w:t>
+      </w:r>
+      <w:r>
+        <w:t xml:space="preserve">“Not Found”</w:t>
+      </w:r>
+      <w:r>
+        <w:t xml:space="preserve"> </w:t>
+      </w:r>
+      <w:r>
+        <w:t xml:space="preserve">after a few hours)</w:t>
+      </w:r>
+    </w:p>
+    <w:p>
+      <w:pPr>
+        <w:pStyle w:val="FirstParagraph"/>
+      </w:pPr>
+      <w:r>
+        <w:t xml:space="preserve">This is a Railway-side certificate step,</w:t>
+      </w:r>
+      <w:r>
+        <w:t xml:space="preserve"> </w:t>
+      </w:r>
+      <w:r>
+        <w:rPr>
+          <w:b/>
+          <w:bCs/>
+        </w:rPr>
+        <w:t xml:space="preserve">not</w:t>
+      </w:r>
+      <w:r>
+        <w:t xml:space="preserve"> </w:t>
+      </w:r>
+      <w:r>
+        <w:t xml:space="preserve">a missing DNS record — do</w:t>
+      </w:r>
+      <w:r>
+        <w:t xml:space="preserve"> </w:t>
+      </w:r>
+      <w:r>
+        <w:rPr>
+          <w:b/>
+          <w:bCs/>
+        </w:rPr>
+        <w:t xml:space="preserve">not</w:t>
+      </w:r>
+      <w:r>
+        <w:t xml:space="preserve"> </w:t>
+      </w:r>
+      <w:r>
+        <w:t xml:space="preserve">add a TXT. To re-trigger issuance:</w:t>
+      </w:r>
+      <w:r>
+        <w:t xml:space="preserve"> </w:t>
+      </w:r>
+      <w:r>
+        <w:t xml:space="preserve">1. In</w:t>
+      </w:r>
+      <w:r>
+        <w:t xml:space="preserve"> </w:t>
+      </w:r>
+      <w:r>
+        <w:rPr>
+          <w:b/>
+          <w:bCs/>
+        </w:rPr>
+        <w:t xml:space="preserve">Railway → web → Settings → Networking</w:t>
+      </w:r>
+      <w:r>
+        <w:t xml:space="preserve">,</w:t>
+      </w:r>
+      <w:r>
+        <w:t xml:space="preserve"> </w:t>
+      </w:r>
+      <w:r>
+        <w:rPr>
+          <w:b/>
+          <w:bCs/>
+        </w:rPr>
+        <w:t xml:space="preserve">remove</w:t>
+      </w:r>
+      <w:r>
+        <w:t xml:space="preserve"> </w:t>
+      </w:r>
+      <w:r>
+        <w:t xml:space="preserve">the</w:t>
+      </w:r>
+      <w:r>
+        <w:t xml:space="preserve"> </w:t>
+      </w:r>
+      <w:r>
+        <w:rPr>
+          <w:rStyle w:val="VerbatimChar"/>
         </w:rPr>
         <w:t xml:space="preserve">fund.kuja.org</w:t>
       </w:r>
@@ -2283,104 +1820,68 @@
         <w:t xml:space="preserve"> </w:t>
       </w:r>
       <w:r>
-        <w:t xml:space="preserve">and confirm.</w:t>
-      </w:r>
-    </w:p>
-    <w:p>
-      <w:pPr>
-        <w:pStyle w:val="Compact"/>
-        <w:numPr>
-          <w:ilvl w:val="0"/>
-          <w:numId w:val="1002"/>
-        </w:numPr>
-      </w:pPr>
-      <w:r>
-        <w:t xml:space="preserve">Railway shows the</w:t>
-      </w:r>
-      <w:r>
-        <w:t xml:space="preserve"> </w:t>
-      </w:r>
-      <w:r>
-        <w:rPr>
-          <w:b/>
-          <w:bCs/>
-        </w:rPr>
-        <w:t xml:space="preserve">CNAME target</w:t>
-      </w:r>
-      <w:r>
-        <w:t xml:space="preserve"> </w:t>
-      </w:r>
-      <w:r>
-        <w:t xml:space="preserve">to point at — give this to the DNS team for Part A.</w:t>
-      </w:r>
-      <w:r>
-        <w:t xml:space="preserve"> </w:t>
-      </w:r>
-      <w:r>
-        <w:rPr>
-          <w:i/>
-          <w:iCs/>
-        </w:rPr>
-        <w:t xml:space="preserve">(For this domain it is</w:t>
-      </w:r>
-      <w:r>
-        <w:rPr>
-          <w:i/>
-          <w:iCs/>
-        </w:rPr>
-        <w:t xml:space="preserve"> </w:t>
-      </w:r>
-      <w:r>
-        <w:rPr>
-          <w:rStyle w:val="VerbatimChar"/>
-          <w:i/>
-          <w:iCs/>
+        <w:t xml:space="preserve">custom domain and</w:t>
+      </w:r>
+      <w:r>
+        <w:t xml:space="preserve"> </w:t>
+      </w:r>
+      <w:r>
+        <w:rPr>
+          <w:b/>
+          <w:bCs/>
+        </w:rPr>
+        <w:t xml:space="preserve">re-add</w:t>
+      </w:r>
+      <w:r>
+        <w:t xml:space="preserve"> </w:t>
+      </w:r>
+      <w:r>
+        <w:t xml:space="preserve">it (</w:t>
+      </w:r>
+      <w:r>
+        <w:rPr>
+          <w:rStyle w:val="VerbatimChar"/>
+        </w:rPr>
+        <w:t xml:space="preserve">+ Custom Domain</w:t>
+      </w:r>
+      <w:r>
+        <w:t xml:space="preserve"> </w:t>
+      </w:r>
+      <w:r>
+        <w:t xml:space="preserve">→</w:t>
+      </w:r>
+      <w:r>
+        <w:t xml:space="preserve"> </w:t>
+      </w:r>
+      <w:r>
+        <w:rPr>
+          <w:rStyle w:val="VerbatimChar"/>
+        </w:rPr>
+        <w:t xml:space="preserve">fund.kuja.org</w:t>
+      </w:r>
+      <w:r>
+        <w:t xml:space="preserve">). The CNAME target stays the same (</w:t>
+      </w:r>
+      <w:r>
+        <w:rPr>
+          <w:rStyle w:val="VerbatimChar"/>
         </w:rPr>
         <w:t xml:space="preserve">u7b375h8.up.railway.app</w:t>
       </w:r>
       <w:r>
-        <w:rPr>
-          <w:i/>
-          <w:iCs/>
-        </w:rPr>
-        <w:t xml:space="preserve">.)</w:t>
-      </w:r>
-    </w:p>
-    <w:p>
-      <w:pPr>
-        <w:pStyle w:val="Compact"/>
-        <w:numPr>
-          <w:ilvl w:val="0"/>
-          <w:numId w:val="1002"/>
-        </w:numPr>
-      </w:pPr>
-      <w:r>
-        <w:t xml:space="preserve">Once the DNS record is live, Railway auto-verifies and issues the TLS certificate. The domain flips to</w:t>
-      </w:r>
-      <w:r>
-        <w:t xml:space="preserve"> </w:t>
-      </w:r>
-      <w:r>
-        <w:rPr>
-          <w:b/>
-          <w:bCs/>
-        </w:rPr>
-        <w:t xml:space="preserve">Active</w:t>
-      </w:r>
-      <w:r>
-        <w:t xml:space="preserve"> </w:t>
-      </w:r>
-      <w:r>
-        <w:t xml:space="preserve">(green). If it’s stuck</w:t>
-      </w:r>
-      <w:r>
-        <w:t xml:space="preserve"> </w:t>
-      </w:r>
-      <w:r>
-        <w:t xml:space="preserve">“waiting”</w:t>
-      </w:r>
-      <w:r>
-        <w:t xml:space="preserve">, re-check the CNAME target and the Cloudflare/CAA gotchas above.</w:t>
+        <w:t xml:space="preserve">), so no DNS change is needed.</w:t>
+      </w:r>
+      <w:r>
+        <w:t xml:space="preserve"> </w:t>
+      </w:r>
+      <w:r>
+        <w:t xml:space="preserve">2. Wait ~15–30 min for Railway to re-validate and issue the cert.</w:t>
+      </w:r>
+      <w:r>
+        <w:t xml:space="preserve"> </w:t>
+      </w:r>
+      <w:r>
+        <w:t xml:space="preserve">3. Re-check with the verify steps in Part D. If it still fails, check the Cloudflare/CAA gotchas above, then contact Railway support with the domain name.</w:t>
       </w:r>
     </w:p>
     <w:p>
@@ -2391,7 +1892,8 @@
       </w:r>
     </w:p>
     <w:bookmarkEnd w:id="12"/>
-    <w:bookmarkStart w:id="13" w:name="X3bc2051933933825c0e9ed266abf1dbeb8687f5"/>
+    <w:bookmarkEnd w:id="13"/>
+    <w:bookmarkStart w:id="14" w:name="X3bc2051933933825c0e9ed266abf1dbeb8687f5"/>
     <w:p>
       <w:pPr>
         <w:pStyle w:val="Heading2"/>
@@ -2453,13 +1955,13 @@
           <w:b/>
           <w:bCs/>
         </w:rPr>
-        <w:t xml:space="preserve">is Active in Railway (Part B).</w:t>
-      </w:r>
-      <w:r>
-        <w:t xml:space="preserve"> </w:t>
-      </w:r>
-      <w:r>
-        <w:t xml:space="preserve">Several settings currently default to the old Railway URL; they must point at the new domain or a few features break. In</w:t>
+        <w:t xml:space="preserve">is Active in Railway.</w:t>
+      </w:r>
+      <w:r>
+        <w:t xml:space="preserve"> </w:t>
+      </w:r>
+      <w:r>
+        <w:t xml:space="preserve">Several settings currently default to the old Railway URL; point them at the new domain or a few features break. In</w:t>
       </w:r>
       <w:r>
         <w:t xml:space="preserve"> </w:t>
@@ -2802,7 +2304,7 @@
               <w:t xml:space="preserve"> </w:t>
             </w:r>
             <w:r>
-              <w:t xml:space="preserve">(not the Railway URL) after their assessment.</w:t>
+              <w:t xml:space="preserve">after their assessment.</w:t>
             </w:r>
           </w:p>
         </w:tc>
@@ -2967,7 +2469,7 @@
         <w:t xml:space="preserve">Settings → Security</w:t>
       </w:r>
       <w:r>
-        <w:t xml:space="preserve">. (Password + authenticator-app/TOTP sign-in are unaffected.) For a pilot with few/no passkeys this is a non-event — do it now rather than after go-live.</w:t>
+        <w:t xml:space="preserve">. (Password + authenticator-app/TOTP sign-in are unaffected.)</w:t>
       </w:r>
       <w:r>
         <w:t xml:space="preserve"> </w:t>
@@ -2989,16 +2491,7 @@
         <w:t xml:space="preserve"> </w:t>
       </w:r>
       <w:r>
-        <w:t xml:space="preserve">It stays on its own domain (</w:t>
-      </w:r>
-      <w:r>
-        <w:rPr>
-          <w:rStyle w:val="VerbatimChar"/>
-        </w:rPr>
-        <w:t xml:space="preserve">kuja-app-production.up.railway.app</w:t>
-      </w:r>
-      <w:r>
-        <w:t xml:space="preserve">); the only cross-app dependency for this domain change is</w:t>
+        <w:t xml:space="preserve">It stays on its own domain; the only cross-app dependency for this domain change is</w:t>
       </w:r>
       <w:r>
         <w:t xml:space="preserve"> </w:t>
@@ -3013,83 +2506,7 @@
         <w:t xml:space="preserve"> </w:t>
       </w:r>
       <w:r>
-        <w:t xml:space="preserve">above. If you later want a branded Trust domain (e.g. </w:t>
-      </w:r>
-      <w:r>
-        <w:rPr>
-          <w:rStyle w:val="VerbatimChar"/>
-        </w:rPr>
-        <w:t xml:space="preserve">trust.kuja.org</w:t>
-      </w:r>
-      <w:r>
-        <w:t xml:space="preserve">), that’s a separate, similar setup on the Trust service — ask us and we’ll extend this runbook.</w:t>
-      </w:r>
-      <w:r>
-        <w:t xml:space="preserve"> </w:t>
-      </w:r>
-      <w:r>
-        <w:t xml:space="preserve">-</w:t>
-      </w:r>
-      <w:r>
-        <w:t xml:space="preserve"> </w:t>
-      </w:r>
-      <w:r>
-        <w:rPr>
-          <w:i/>
-          <w:iCs/>
-        </w:rPr>
-        <w:t xml:space="preserve">(Optional hardening, dev team):</w:t>
-      </w:r>
-      <w:r>
-        <w:t xml:space="preserve"> </w:t>
-      </w:r>
-      <w:r>
-        <w:t xml:space="preserve">the app already routes</w:t>
-      </w:r>
-      <w:r>
-        <w:t xml:space="preserve"> </w:t>
-      </w:r>
-      <w:r>
-        <w:rPr>
-          <w:rStyle w:val="VerbatimChar"/>
-        </w:rPr>
-        <w:t xml:space="preserve">fund.kuja.org</w:t>
-      </w:r>
-      <w:r>
-        <w:t xml:space="preserve"> </w:t>
-      </w:r>
-      <w:r>
-        <w:t xml:space="preserve">to the Kuja tenant via the default-tenant fallback. For determinism you can also add</w:t>
-      </w:r>
-      <w:r>
-        <w:t xml:space="preserve"> </w:t>
-      </w:r>
-      <w:r>
-        <w:rPr>
-          <w:rStyle w:val="VerbatimChar"/>
-        </w:rPr>
-        <w:t xml:space="preserve">fund.kuja.org</w:t>
-      </w:r>
-      <w:r>
-        <w:t xml:space="preserve"> </w:t>
-      </w:r>
-      <w:r>
-        <w:t xml:space="preserve">to the Kuja network’s</w:t>
-      </w:r>
-      <w:r>
-        <w:t xml:space="preserve"> </w:t>
-      </w:r>
-      <w:r>
-        <w:rPr>
-          <w:rStyle w:val="VerbatimChar"/>
-        </w:rPr>
-        <w:t xml:space="preserve">host_aliases</w:t>
-      </w:r>
-      <w:r>
-        <w:t xml:space="preserve"> </w:t>
-      </w:r>
-      <w:r>
-        <w:t xml:space="preserve">— not required for launch.</w:t>
+        <w:t xml:space="preserve">above.</w:t>
       </w:r>
     </w:p>
     <w:p>
@@ -3099,14 +2516,14 @@
         </w:pict>
       </w:r>
     </w:p>
-    <w:bookmarkEnd w:id="13"/>
-    <w:bookmarkStart w:id="14" w:name="Xc853488c11ba39214de4534d5e125c0dabeae0e"/>
+    <w:bookmarkEnd w:id="14"/>
+    <w:bookmarkStart w:id="15" w:name="X51b9109d040a88cc7ee255c204aca52ed4867aa"/>
     <w:p>
       <w:pPr>
         <w:pStyle w:val="Heading2"/>
       </w:pPr>
       <w:r>
-        <w:t xml:space="preserve">Part D — Verify (after DNS is live + variables saved)</w:t>
+        <w:t xml:space="preserve">Part D — Verify (after the certificate is issued)</w:t>
       </w:r>
     </w:p>
     <w:p>
@@ -3122,7 +2539,7 @@
           <w:b/>
           <w:bCs/>
         </w:rPr>
-        <w:t xml:space="preserve">Both DNS records resolve:</w:t>
+        <w:t xml:space="preserve">CNAME resolves:</w:t>
       </w:r>
       <w:r>
         <w:t xml:space="preserve"> </w:t>
@@ -3149,56 +2566,17 @@
         <w:t xml:space="preserve">*.up.railway.app</w:t>
       </w:r>
       <w:r>
-        <w:t xml:space="preserve">),</w:t>
-      </w:r>
-      <w:r>
-        <w:t xml:space="preserve"> </w:t>
-      </w:r>
-      <w:r>
-        <w:rPr>
-          <w:b/>
-          <w:bCs/>
-        </w:rPr>
-        <w:t xml:space="preserve">and</w:t>
-      </w:r>
-      <w:r>
-        <w:t xml:space="preserve"> </w:t>
-      </w:r>
-      <w:r>
-        <w:rPr>
-          <w:rStyle w:val="VerbatimChar"/>
-        </w:rPr>
-        <w:t xml:space="preserve">nslookup -type=TXT _railway-verify.fund.kuja.org</w:t>
-      </w:r>
-      <w:r>
-        <w:t xml:space="preserve"> </w:t>
-      </w:r>
-      <w:r>
-        <w:t xml:space="preserve">returns a</w:t>
-      </w:r>
-      <w:r>
-        <w:t xml:space="preserve"> </w:t>
-      </w:r>
-      <w:r>
-        <w:rPr>
-          <w:rStyle w:val="VerbatimChar"/>
-        </w:rPr>
-        <w:t xml:space="preserve">railway-verify=…</w:t>
-      </w:r>
-      <w:r>
-        <w:t xml:space="preserve"> </w:t>
-      </w:r>
-      <w:r>
-        <w:t xml:space="preserve">value. (If that TXT lookup says</w:t>
-      </w:r>
-      <w:r>
-        <w:t xml:space="preserve"> </w:t>
-      </w:r>
-      <w:r>
-        <w:t xml:space="preserve">“does not exist”</w:t>
-      </w:r>
-      <w:r>
-        <w:t xml:space="preserve">, you’re still in the stuck state — go back to Part A record #2.)</w:t>
+        <w:t xml:space="preserve">).</w:t>
+      </w:r>
+      <w:r>
+        <w:t xml:space="preserve"> </w:t>
+      </w:r>
+      <w:r>
+        <w:rPr>
+          <w:i/>
+          <w:iCs/>
+        </w:rPr>
+        <w:t xml:space="preserve">(No TXT lookup is needed — Railway doesn’t require one.)</w:t>
       </w:r>
     </w:p>
     <w:p>
@@ -3257,13 +2635,40 @@
         <w:rPr>
           <w:rStyle w:val="VerbatimChar"/>
         </w:rPr>
-        <w:t xml:space="preserve">HTTP/…​ 200</w:t>
-      </w:r>
-      <w:r>
-        <w:t xml:space="preserve"> </w:t>
-      </w:r>
-      <w:r>
-        <w:t xml:space="preserve">with a valid (non-warning) certificate. In a browser the padlock is clean.</w:t>
+        <w:t xml:space="preserve">HTTP/… 200</w:t>
+      </w:r>
+      <w:r>
+        <w:t xml:space="preserve"> </w:t>
+      </w:r>
+      <w:r>
+        <w:t xml:space="preserve">with a valid certificate whose name is</w:t>
+      </w:r>
+      <w:r>
+        <w:t xml:space="preserve"> </w:t>
+      </w:r>
+      <w:r>
+        <w:rPr>
+          <w:rStyle w:val="VerbatimChar"/>
+        </w:rPr>
+        <w:t xml:space="preserve">fund.kuja.org</w:t>
+      </w:r>
+      <w:r>
+        <w:t xml:space="preserve"> </w:t>
+      </w:r>
+      <w:r>
+        <w:t xml:space="preserve">(not</w:t>
+      </w:r>
+      <w:r>
+        <w:t xml:space="preserve"> </w:t>
+      </w:r>
+      <w:r>
+        <w:rPr>
+          <w:rStyle w:val="VerbatimChar"/>
+        </w:rPr>
+        <w:t xml:space="preserve">*.up.railway.app</w:t>
+      </w:r>
+      <w:r>
+        <w:t xml:space="preserve">). In a browser the padlock is clean.</w:t>
       </w:r>
       <w:r>
         <w:t xml:space="preserve"> </w:t>
@@ -3302,7 +2707,29 @@
           <w:i/>
           <w:iCs/>
         </w:rPr>
-        <w:t xml:space="preserve">/ cert-name error here means the certificate hasn’t issued yet — almost always the missing TXT.)</w:t>
+        <w:t xml:space="preserve">/ cert-name error, or the certificate showing</w:t>
+      </w:r>
+      <w:r>
+        <w:rPr>
+          <w:i/>
+          <w:iCs/>
+        </w:rPr>
+        <w:t xml:space="preserve"> </w:t>
+      </w:r>
+      <w:r>
+        <w:rPr>
+          <w:rStyle w:val="VerbatimChar"/>
+          <w:i/>
+          <w:iCs/>
+        </w:rPr>
+        <w:t xml:space="preserve">CN=*.up.railway.app</w:t>
+      </w:r>
+      <w:r>
+        <w:rPr>
+          <w:i/>
+          <w:iCs/>
+        </w:rPr>
+        <w:t xml:space="preserve">, means the certificate hasn’t issued yet — wait, or re-trigger per Part B.)</w:t>
       </w:r>
     </w:p>
     <w:p>
@@ -3355,19 +2782,7 @@
         <w:t xml:space="preserve"> </w:t>
       </w:r>
       <w:r>
-        <w:t xml:space="preserve">sign-in page with Kuja branding. (On a real branded domain the one-click</w:t>
-      </w:r>
-      <w:r>
-        <w:t xml:space="preserve"> </w:t>
-      </w:r>
-      <w:r>
-        <w:t xml:space="preserve">“demo account”</w:t>
-      </w:r>
-      <w:r>
-        <w:t xml:space="preserve"> </w:t>
-      </w:r>
-      <w:r>
-        <w:t xml:space="preserve">buttons are intentionally hidden — that’s correct.)</w:t>
+        <w:t xml:space="preserve">sign-in page with Kuja branding.</w:t>
       </w:r>
     </w:p>
     <w:p>
@@ -3477,7 +2892,7 @@
         <w:t xml:space="preserve"> </w:t>
       </w:r>
       <w:r>
-        <w:t xml:space="preserve">→ you’re taken to Kuja Trust → click</w:t>
+        <w:t xml:space="preserve">→ you’re taken to Kuja Trust →</w:t>
       </w:r>
       <w:r>
         <w:t xml:space="preserve"> </w:t>
@@ -3535,8 +2950,8 @@
         </w:pict>
       </w:r>
     </w:p>
-    <w:bookmarkEnd w:id="14"/>
-    <w:bookmarkStart w:id="16" w:name="part-e-rollback"/>
+    <w:bookmarkEnd w:id="15"/>
+    <w:bookmarkStart w:id="17" w:name="part-e-rollback"/>
     <w:p>
       <w:pPr>
         <w:pStyle w:val="Heading2"/>
@@ -3609,42 +3024,13 @@
           <w:b/>
           <w:bCs/>
         </w:rPr>
-        <w:t xml:space="preserve">CNAME and</w:t>
-      </w:r>
-      <w:r>
-        <w:rPr>
-          <w:b/>
-          <w:bCs/>
-        </w:rPr>
-        <w:t xml:space="preserve"> </w:t>
-      </w:r>
-      <w:r>
-        <w:rPr>
-          <w:rStyle w:val="VerbatimChar"/>
-          <w:b/>
-          <w:bCs/>
-        </w:rPr>
-        <w:t xml:space="preserve">_railway-verify</w:t>
-      </w:r>
-      <w:r>
-        <w:rPr>
-          <w:b/>
-          <w:bCs/>
-        </w:rPr>
-        <w:t xml:space="preserve"> </w:t>
-      </w:r>
-      <w:r>
-        <w:rPr>
-          <w:b/>
-          <w:bCs/>
-        </w:rPr>
-        <w:t xml:space="preserve">TXT</w:t>
-      </w:r>
-      <w:r>
-        <w:t xml:space="preserve"> </w:t>
-      </w:r>
-      <w:r>
-        <w:t xml:space="preserve">records.</w:t>
+        <w:t xml:space="preserve">CNAME</w:t>
+      </w:r>
+      <w:r>
+        <w:t xml:space="preserve"> </w:t>
+      </w:r>
+      <w:r>
+        <w:t xml:space="preserve">record.</w:t>
       </w:r>
       <w:r>
         <w:t xml:space="preserve"> </w:t>
@@ -3675,7 +3061,7 @@
         </w:pict>
       </w:r>
     </w:p>
-    <w:bookmarkStart w:id="15" w:name="quick-reference"/>
+    <w:bookmarkStart w:id="16" w:name="quick-reference"/>
     <w:p>
       <w:pPr>
         <w:pStyle w:val="Heading3"/>
@@ -3805,13 +3191,7 @@
           <w:b/>
           <w:bCs/>
         </w:rPr>
-        <w:t xml:space="preserve">DNS records (BOTH required):</w:t>
-      </w:r>
-      <w:r>
-        <w:t xml:space="preserve"> </w:t>
-      </w:r>
-      <w:r>
-        <w:t xml:space="preserve">(1)</w:t>
+        <w:t xml:space="preserve">DNS record (the only one):</w:t>
       </w:r>
       <w:r>
         <w:t xml:space="preserve"> </w:t>
@@ -3826,32 +3206,17 @@
         <w:t xml:space="preserve"> </w:t>
       </w:r>
       <w:r>
-        <w:t xml:space="preserve">— already live; (2)</w:t>
-      </w:r>
-      <w:r>
-        <w:t xml:space="preserve"> </w:t>
-      </w:r>
-      <w:r>
-        <w:rPr>
-          <w:rStyle w:val="VerbatimChar"/>
-        </w:rPr>
-        <w:t xml:space="preserve">TXT  _railway-verify.fund  →  railway-verify=…</w:t>
-      </w:r>
-      <w:r>
-        <w:t xml:space="preserve"> </w:t>
-      </w:r>
-      <w:r>
-        <w:t xml:space="preserve">(value from Railway → web → Settings → Networking) —</w:t>
-      </w:r>
-      <w:r>
-        <w:t xml:space="preserve"> </w:t>
-      </w:r>
-      <w:r>
-        <w:rPr>
-          <w:b/>
-          <w:bCs/>
-        </w:rPr>
-        <w:t xml:space="preserve">the missing one that’s blocking it.</w:t>
+        <w:t xml:space="preserve">— already live &amp; propagated.</w:t>
+      </w:r>
+      <w:r>
+        <w:t xml:space="preserve"> </w:t>
+      </w:r>
+      <w:r>
+        <w:rPr>
+          <w:b/>
+          <w:bCs/>
+        </w:rPr>
+        <w:t xml:space="preserve">No TXT record is required.</w:t>
       </w:r>
       <w:r>
         <w:t xml:space="preserve"> </w:t>
@@ -3873,6 +3238,49 @@
           <w:b/>
           <w:bCs/>
         </w:rPr>
+        <w:t xml:space="preserve">Why it’s not up yet (2026-08-19):</w:t>
+      </w:r>
+      <w:r>
+        <w:t xml:space="preserve"> </w:t>
+      </w:r>
+      <w:r>
+        <w:t xml:space="preserve">Railway’s TLS cert for</w:t>
+      </w:r>
+      <w:r>
+        <w:t xml:space="preserve"> </w:t>
+      </w:r>
+      <w:r>
+        <w:rPr>
+          <w:rStyle w:val="VerbatimChar"/>
+        </w:rPr>
+        <w:t xml:space="preserve">fund.kuja.org</w:t>
+      </w:r>
+      <w:r>
+        <w:t xml:space="preserve"> </w:t>
+      </w:r>
+      <w:r>
+        <w:t xml:space="preserve">is still issuing (</w:t>
+      </w:r>
+      <w:r>
+        <w:t xml:space="preserve">“validating ownership”</w:t>
+      </w:r>
+      <w:r>
+        <w:t xml:space="preserve">). It completes automatically; if stuck for hours, remove + re-add the domain in Railway (Part B) — this is a Railway step, not a DNS one.</w:t>
+      </w:r>
+    </w:p>
+    <w:p>
+      <w:pPr>
+        <w:pStyle w:val="Compact"/>
+        <w:numPr>
+          <w:ilvl w:val="0"/>
+          <w:numId w:val="1004"/>
+        </w:numPr>
+      </w:pPr>
+      <w:r>
+        <w:rPr>
+          <w:b/>
+          <w:bCs/>
+        </w:rPr>
         <w:t xml:space="preserve">Env to update on</w:t>
       </w:r>
       <w:r>
@@ -3895,7 +3303,14 @@
           <w:b/>
           <w:bCs/>
         </w:rPr>
-        <w:t xml:space="preserve">:</w:t>
+        <w:t xml:space="preserve"> </w:t>
+      </w:r>
+      <w:r>
+        <w:rPr>
+          <w:b/>
+          <w:bCs/>
+        </w:rPr>
+        <w:t xml:space="preserve">once Active:</w:t>
       </w:r>
       <w:r>
         <w:t xml:space="preserve"> </w:t>
@@ -3976,9 +3391,9 @@
         <w:t xml:space="preserve">if present)</w:t>
       </w:r>
     </w:p>
-    <w:bookmarkEnd w:id="15"/>
     <w:bookmarkEnd w:id="16"/>
     <w:bookmarkEnd w:id="17"/>
+    <w:bookmarkEnd w:id="18"/>
     <w:sectPr>
       <w:footnotePr>
         <w:numRestart w:val="eachSect"/>

</xml_diff>

<commit_message>
Re-correct fund.kuja.org runbook: the _railway-verify TXT IS required
Ground truth (Railway verificationToken API field + live DNS + Railway
support all agree): custom domains need BOTH a CNAME and a _railway-verify
TXT. fund.kuja.org is stuck at "validating ownership" because its TXT is
missing (NXDOMAIN) while the working proximate/saxansaxo domains each have
theirs. My prior "no TXT" claim came from the dnsRecords API field, which
omits the ownership TXT — the correct field is status.verificationToken.
Doc now lists both records with exact values incl. the verify token.

Co-Authored-By: Claude Opus 4.8 <noreply@anthropic.com>
</commit_message>
<xml_diff>
--- a/docs/Kuja_Fund_Domain_Setup_fund.kuja.org.docx
+++ b/docs/Kuja_Fund_Domain_Setup_fund.kuja.org.docx
@@ -2,7 +2,7 @@
 <file path=word/document.xml><?xml version="1.0" encoding="utf-8"?>
 <w:document xmlns:w="http://schemas.openxmlformats.org/wordprocessingml/2006/main" xmlns:m="http://schemas.openxmlformats.org/officeDocument/2006/math" xmlns:r="http://schemas.openxmlformats.org/officeDocument/2006/relationships" xmlns:o="urn:schemas-microsoft-com:office:office" xmlns:v="urn:schemas-microsoft-com:vml" xmlns:w10="urn:schemas-microsoft-com:office:word" xmlns:a="http://schemas.openxmlformats.org/drawingml/2006/main" xmlns:pic="http://schemas.openxmlformats.org/drawingml/2006/picture" xmlns:wp="http://schemas.openxmlformats.org/drawingml/2006/wordprocessingDrawing">
   <w:body>
-    <w:bookmarkStart w:id="18" w:name="X6c7546df9cadd2a584e4e31fbfad7bf4eb518c2"/>
+    <w:bookmarkStart w:id="17" w:name="X6c7546df9cadd2a584e4e31fbfad7bf4eb518c2"/>
     <w:p>
       <w:pPr>
         <w:pStyle w:val="Heading1"/>
@@ -68,16 +68,47 @@
           <w:b/>
           <w:bCs/>
         </w:rPr>
-        <w:t xml:space="preserve">re-verified against Railway’s API 2026-08-19.</w:t>
+        <w:t xml:space="preserve">corrected against Railway’s API + DNS ground truth 2026-08-19.</w:t>
       </w:r>
     </w:p>
     <w:p>
       <w:pPr>
         <w:pStyle w:val="Heading2"/>
       </w:pPr>
-      <w:bookmarkStart w:id="9" w:name="X9e4b6b7a0795f18dbe1b99793a783a249de37d5"/>
-      <w:r>
-        <w:t xml:space="preserve">✅ Current status (checked 2026-08-19) — you’ve done the DNS part; it’s now Railway’s turn</w:t>
+      <w:bookmarkStart w:id="9" w:name="Xb1dd4a0cc4372b19145f22ff11adfd9455c5056"/>
+      <w:r>
+        <w:t xml:space="preserve">⚠️ To make it work you must add TWO DNS records: a CNAME</w:t>
+      </w:r>
+      <w:r>
+        <w:t xml:space="preserve"> </w:t>
+      </w:r>
+      <w:r>
+        <w:rPr>
+          <w:b/>
+          <w:bCs/>
+        </w:rPr>
+        <w:t xml:space="preserve">and</w:t>
+      </w:r>
+      <w:r>
+        <w:t xml:space="preserve"> </w:t>
+      </w:r>
+      <w:r>
+        <w:t xml:space="preserve">a</w:t>
+      </w:r>
+      <w:r>
+        <w:t xml:space="preserve"> </w:t>
+      </w:r>
+      <w:r>
+        <w:rPr>
+          <w:rStyle w:val="VerbatimChar"/>
+        </w:rPr>
+        <w:t xml:space="preserve">_railway-verify</w:t>
+      </w:r>
+      <w:r>
+        <w:t xml:space="preserve"> </w:t>
+      </w:r>
+      <w:r>
+        <w:t xml:space="preserve">TXT</w:t>
       </w:r>
       <w:bookmarkEnd w:id="9"/>
     </w:p>
@@ -86,32 +117,113 @@
         <w:pStyle w:val="BlockText"/>
       </w:pPr>
       <w:r>
-        <w:t xml:space="preserve">We queried Railway’s API directly. Here is the real state of</w:t>
-      </w:r>
-      <w:r>
-        <w:t xml:space="preserve"> </w:t>
-      </w:r>
-      <w:r>
-        <w:rPr>
-          <w:rStyle w:val="VerbatimChar"/>
-        </w:rPr>
-        <w:t xml:space="preserve">fund.kuja.org</w:t>
-      </w:r>
-      <w:r>
-        <w:t xml:space="preserve">:</w:t>
-      </w:r>
-      <w:r>
-        <w:t xml:space="preserve"> </w:t>
-      </w:r>
-      <w:r>
-        <w:t xml:space="preserve">- ✅ The</w:t>
-      </w:r>
-      <w:r>
-        <w:t xml:space="preserve"> </w:t>
-      </w:r>
-      <w:r>
-        <w:rPr>
-          <w:rStyle w:val="VerbatimChar"/>
+        <w:t xml:space="preserve">The certificate is stuck because the</w:t>
+      </w:r>
+      <w:r>
+        <w:t xml:space="preserve"> </w:t>
+      </w:r>
+      <w:r>
+        <w:rPr>
+          <w:b/>
+          <w:bCs/>
+        </w:rPr>
+        <w:t xml:space="preserve">ownership-verification TXT record is missing</w:t>
+      </w:r>
+      <w:r>
+        <w:t xml:space="preserve">. Confirmed three ways: Railway’s</w:t>
+      </w:r>
+      <w:r>
+        <w:t xml:space="preserve"> </w:t>
+      </w:r>
+      <w:r>
+        <w:rPr>
+          <w:rStyle w:val="VerbatimChar"/>
+        </w:rPr>
+        <w:t xml:space="preserve">verificationToken</w:t>
+      </w:r>
+      <w:r>
+        <w:t xml:space="preserve"> </w:t>
+      </w:r>
+      <w:r>
+        <w:t xml:space="preserve">API field, a live DNS check (the working</w:t>
+      </w:r>
+      <w:r>
+        <w:t xml:space="preserve"> </w:t>
+      </w:r>
+      <w:r>
+        <w:rPr>
+          <w:rStyle w:val="VerbatimChar"/>
+        </w:rPr>
+        <w:t xml:space="preserve">proximate</w:t>
+      </w:r>
+      <w:r>
+        <w:t xml:space="preserve">/</w:t>
+      </w:r>
+      <w:r>
+        <w:rPr>
+          <w:rStyle w:val="VerbatimChar"/>
+        </w:rPr>
+        <w:t xml:space="preserve">saxansaxo</w:t>
+      </w:r>
+      <w:r>
+        <w:t xml:space="preserve"> </w:t>
+      </w:r>
+      <w:r>
+        <w:t xml:space="preserve">domains each have a</w:t>
+      </w:r>
+      <w:r>
+        <w:t xml:space="preserve"> </w:t>
+      </w:r>
+      <w:r>
+        <w:rPr>
+          <w:rStyle w:val="VerbatimChar"/>
+        </w:rPr>
+        <w:t xml:space="preserve">_railway-verify</w:t>
+      </w:r>
+      <w:r>
+        <w:t xml:space="preserve"> </w:t>
+      </w:r>
+      <w:r>
+        <w:t xml:space="preserve">TXT;</w:t>
+      </w:r>
+      <w:r>
+        <w:t xml:space="preserve"> </w:t>
+      </w:r>
+      <w:r>
+        <w:rPr>
+          <w:rStyle w:val="VerbatimChar"/>
+        </w:rPr>
+        <w:t xml:space="preserve">fund</w:t>
+      </w:r>
+      <w:r>
+        <w:t xml:space="preserve"> </w:t>
+      </w:r>
+      <w:r>
+        <w:t xml:space="preserve">does not), and Railway support.</w:t>
+      </w:r>
+    </w:p>
+    <w:p>
+      <w:pPr>
+        <w:pStyle w:val="BlockText"/>
+      </w:pPr>
+      <w:r>
+        <w:rPr>
+          <w:b/>
+          <w:bCs/>
+        </w:rPr>
+        <w:t xml:space="preserve">A custom domain needs BOTH:</w:t>
+      </w:r>
+      <w:r>
+        <w:t xml:space="preserve"> </w:t>
+      </w:r>
+      <w:r>
+        <w:t xml:space="preserve">1. a</w:t>
+      </w:r>
+      <w:r>
+        <w:t xml:space="preserve"> </w:t>
+      </w:r>
+      <w:r>
+        <w:rPr>
           <w:b/>
           <w:bCs/>
         </w:rPr>
@@ -121,295 +233,162 @@
         <w:t xml:space="preserve"> </w:t>
       </w:r>
       <w:r>
-        <w:t xml:space="preserve">(</w:t>
-      </w:r>
-      <w:r>
-        <w:rPr>
-          <w:rStyle w:val="VerbatimChar"/>
-        </w:rPr>
-        <w:t xml:space="preserve">fund</w:t>
-      </w:r>
-      <w:r>
-        <w:t xml:space="preserve"> </w:t>
-      </w:r>
-      <w:r>
-        <w:t xml:space="preserve">→</w:t>
-      </w:r>
-      <w:r>
-        <w:t xml:space="preserve"> </w:t>
-      </w:r>
-      <w:r>
-        <w:rPr>
-          <w:rStyle w:val="VerbatimChar"/>
-        </w:rPr>
-        <w:t xml:space="preserve">u7b375h8.up.railway.app</w:t>
-      </w:r>
-      <w:r>
-        <w:t xml:space="preserve">)</w:t>
-      </w:r>
-      <w:r>
-        <w:t xml:space="preserve"> </w:t>
-      </w:r>
-      <w:r>
-        <w:rPr>
-          <w:b/>
-          <w:bCs/>
-        </w:rPr>
-        <w:t xml:space="preserve">is in place, correct, and fully propagated.</w:t>
-      </w:r>
-      <w:r>
-        <w:t xml:space="preserve"> </w:t>
-      </w:r>
-      <w:r>
-        <w:t xml:space="preserve">This is the</w:t>
-      </w:r>
-      <w:r>
-        <w:t xml:space="preserve"> </w:t>
-      </w:r>
-      <w:r>
-        <w:rPr>
-          <w:b/>
-          <w:bCs/>
-        </w:rPr>
-        <w:t xml:space="preserve">only</w:t>
-      </w:r>
-      <w:r>
-        <w:t xml:space="preserve"> </w:t>
-      </w:r>
-      <w:r>
-        <w:t xml:space="preserve">DNS record Railway requires.</w:t>
-      </w:r>
-      <w:r>
-        <w:t xml:space="preserve"> </w:t>
-      </w:r>
-      <w:r>
-        <w:t xml:space="preserve">- ⏳ Railway’s</w:t>
-      </w:r>
-      <w:r>
-        <w:t xml:space="preserve"> </w:t>
-      </w:r>
-      <w:r>
-        <w:rPr>
-          <w:b/>
-          <w:bCs/>
-        </w:rPr>
-        <w:t xml:space="preserve">TLS certificate is still being issued</w:t>
-      </w:r>
-      <w:r>
-        <w:t xml:space="preserve"> </w:t>
-      </w:r>
-      <w:r>
-        <w:t xml:space="preserve">— its status is</w:t>
-      </w:r>
-      <w:r>
-        <w:t xml:space="preserve"> </w:t>
-      </w:r>
+        <w:t xml:space="preserve">(routes traffic), and</w:t>
+      </w:r>
+      <w:r>
+        <w:t xml:space="preserve"> </w:t>
+      </w:r>
+      <w:r>
+        <w:t xml:space="preserve">2. a</w:t>
+      </w:r>
+      <w:r>
+        <w:t xml:space="preserve"> </w:t>
+      </w:r>
+      <w:r>
+        <w:rPr>
+          <w:rStyle w:val="VerbatimChar"/>
+          <w:b/>
+          <w:bCs/>
+        </w:rPr>
+        <w:t xml:space="preserve">_railway-verify</w:t>
+      </w:r>
+      <w:r>
+        <w:rPr>
+          <w:b/>
+          <w:bCs/>
+        </w:rPr>
+        <w:t xml:space="preserve"> </w:t>
+      </w:r>
+      <w:r>
+        <w:rPr>
+          <w:b/>
+          <w:bCs/>
+        </w:rPr>
+        <w:t xml:space="preserve">TXT</w:t>
+      </w:r>
+      <w:r>
+        <w:t xml:space="preserve"> </w:t>
+      </w:r>
+      <w:r>
+        <w:t xml:space="preserve">(proves you own the domain so Railway/Let’s Encrypt will issue the certificate).</w:t>
+      </w:r>
+    </w:p>
+    <w:p>
+      <w:pPr>
+        <w:pStyle w:val="BlockText"/>
+      </w:pPr>
+      <w:r>
+        <w:t xml:space="preserve">Until the TXT exists, Railway sits at</w:t>
+      </w:r>
+      <w:r>
+        <w:t xml:space="preserve"> </w:t>
+      </w:r>
+      <w:r>
+        <w:rPr>
+          <w:b/>
+          <w:bCs/>
+        </w:rPr>
+        <w:t xml:space="preserve">“validating ownership”</w:t>
+      </w:r>
+      <w:r>
+        <w:t xml:space="preserve"> </w:t>
+      </w:r>
+      <w:r>
+        <w:t xml:space="preserve">forever and serves its default</w:t>
+      </w:r>
+      <w:r>
+        <w:t xml:space="preserve"> </w:t>
+      </w:r>
+      <w:r>
+        <w:rPr>
+          <w:rStyle w:val="VerbatimChar"/>
+        </w:rPr>
+        <w:t xml:space="preserve">*.up.railway.app</w:t>
+      </w:r>
+      <w:r>
+        <w:t xml:space="preserve"> </w:t>
+      </w:r>
+      <w:r>
+        <w:t xml:space="preserve">certificate, so browsers get a cert-name mismatch /</w:t>
+      </w:r>
+      <w:r>
+        <w:t xml:space="preserve"> </w:t>
+      </w:r>
+      <w:r>
+        <w:t xml:space="preserve">“Not Found.”</w:t>
+      </w:r>
+    </w:p>
+    <w:p>
+      <w:pPr>
+        <w:pStyle w:val="BlockText"/>
+      </w:pPr>
       <w:r>
         <w:rPr>
           <w:i/>
           <w:iCs/>
         </w:rPr>
-        <w:t xml:space="preserve">“validating ownership.”</w:t>
-      </w:r>
-      <w:r>
-        <w:t xml:space="preserve"> </w:t>
-      </w:r>
-      <w:r>
-        <w:t xml:space="preserve">Until the certificate finishes, the edge serves its default</w:t>
-      </w:r>
-      <w:r>
-        <w:t xml:space="preserve"> </w:t>
-      </w:r>
-      <w:r>
-        <w:rPr>
-          <w:rStyle w:val="VerbatimChar"/>
-        </w:rPr>
-        <w:t xml:space="preserve">*.up.railway.app</w:t>
-      </w:r>
-      <w:r>
-        <w:t xml:space="preserve"> </w:t>
-      </w:r>
-      <w:r>
-        <w:t xml:space="preserve">certificate, which doesn’t match</w:t>
-      </w:r>
-      <w:r>
-        <w:t xml:space="preserve"> </w:t>
-      </w:r>
-      <w:r>
-        <w:rPr>
-          <w:rStyle w:val="VerbatimChar"/>
-        </w:rPr>
-        <w:t xml:space="preserve">fund.kuja.org</w:t>
-      </w:r>
-      <w:r>
-        <w:t xml:space="preserve">, so browsers show a certificate/</w:t>
-      </w:r>
-      <w:r>
-        <w:t xml:space="preserve">“Not Found”</w:t>
-      </w:r>
-      <w:r>
-        <w:t xml:space="preserve"> </w:t>
-      </w:r>
-      <w:r>
-        <w:t xml:space="preserve">error.</w:t>
+        <w:t xml:space="preserve">(Note: an earlier version of this runbook briefly said</w:t>
+      </w:r>
+      <w:r>
+        <w:rPr>
+          <w:i/>
+          <w:iCs/>
+        </w:rPr>
+        <w:t xml:space="preserve"> </w:t>
+      </w:r>
+      <w:r>
+        <w:rPr>
+          <w:i/>
+          <w:iCs/>
+        </w:rPr>
+        <w:t xml:space="preserve">“no TXT is needed.”</w:t>
+      </w:r>
+      <w:r>
+        <w:rPr>
+          <w:i/>
+          <w:iCs/>
+        </w:rPr>
+        <w:t xml:space="preserve"> </w:t>
+      </w:r>
+      <w:r>
+        <w:rPr>
+          <w:i/>
+          <w:iCs/>
+        </w:rPr>
+        <w:t xml:space="preserve">That was wrong — it came from reading Railway’s</w:t>
+      </w:r>
+      <w:r>
+        <w:rPr>
+          <w:i/>
+          <w:iCs/>
+        </w:rPr>
+        <w:t xml:space="preserve"> </w:t>
+      </w:r>
+      <w:r>
+        <w:rPr>
+          <w:rStyle w:val="VerbatimChar"/>
+          <w:i/>
+          <w:iCs/>
+        </w:rPr>
+        <w:t xml:space="preserve">dnsRecords</w:t>
+      </w:r>
+      <w:r>
+        <w:rPr>
+          <w:i/>
+          <w:iCs/>
+        </w:rPr>
+        <w:t xml:space="preserve"> </w:t>
+      </w:r>
+      <w:r>
+        <w:rPr>
+          <w:i/>
+          <w:iCs/>
+        </w:rPr>
+        <w:t xml:space="preserve">API field, which lists only the CNAME and omits the verification TXT. The TXT is required. Add both records in Part A.)</w:t>
       </w:r>
     </w:p>
     <w:p>
       <w:pPr>
-        <w:pStyle w:val="BlockText"/>
-      </w:pPr>
-      <w:r>
-        <w:rPr>
-          <w:b/>
-          <w:bCs/>
-        </w:rPr>
-        <w:t xml:space="preserve">There is nothing more to add in DNS.</w:t>
-      </w:r>
-      <w:r>
-        <w:t xml:space="preserve"> </w:t>
-      </w:r>
-      <w:r>
-        <w:t xml:space="preserve">In particular</w:t>
-      </w:r>
-      <w:r>
-        <w:t xml:space="preserve"> </w:t>
-      </w:r>
-      <w:r>
-        <w:rPr>
-          <w:b/>
-          <w:bCs/>
-        </w:rPr>
-        <w:t xml:space="preserve">no</w:t>
-      </w:r>
-      <w:r>
-        <w:rPr>
-          <w:b/>
-          <w:bCs/>
-        </w:rPr>
-        <w:t xml:space="preserve"> </w:t>
-      </w:r>
-      <w:r>
-        <w:rPr>
-          <w:rStyle w:val="VerbatimChar"/>
-          <w:b/>
-          <w:bCs/>
-        </w:rPr>
-        <w:t xml:space="preserve">_railway-verify</w:t>
-      </w:r>
-      <w:r>
-        <w:rPr>
-          <w:b/>
-          <w:bCs/>
-        </w:rPr>
-        <w:t xml:space="preserve"> </w:t>
-      </w:r>
-      <w:r>
-        <w:rPr>
-          <w:b/>
-          <w:bCs/>
-        </w:rPr>
-        <w:t xml:space="preserve">TXT record is needed</w:t>
-      </w:r>
-      <w:r>
-        <w:t xml:space="preserve"> </w:t>
-      </w:r>
-      <w:r>
-        <w:t xml:space="preserve">— Railway validates ownership automatically over the CNAME (an earlier version of this runbook wrongly told you to add a TXT; please ignore that — Railway’s own required-records list contains only the CNAME, exactly like the working</w:t>
-      </w:r>
-      <w:r>
-        <w:t xml:space="preserve"> </w:t>
-      </w:r>
-      <w:r>
-        <w:rPr>
-          <w:rStyle w:val="VerbatimChar"/>
-        </w:rPr>
-        <w:t xml:space="preserve">proximate</w:t>
-      </w:r>
-      <w:r>
-        <w:t xml:space="preserve"> </w:t>
-      </w:r>
-      <w:r>
-        <w:t xml:space="preserve">and</w:t>
-      </w:r>
-      <w:r>
-        <w:t xml:space="preserve"> </w:t>
-      </w:r>
-      <w:r>
-        <w:rPr>
-          <w:rStyle w:val="VerbatimChar"/>
-        </w:rPr>
-        <w:t xml:space="preserve">saxansaxo</w:t>
-      </w:r>
-      <w:r>
-        <w:t xml:space="preserve"> </w:t>
-      </w:r>
-      <w:r>
-        <w:t xml:space="preserve">domains).</w:t>
-      </w:r>
-    </w:p>
-    <w:p>
-      <w:pPr>
-        <w:pStyle w:val="BlockText"/>
-      </w:pPr>
-      <w:r>
-        <w:rPr>
-          <w:b/>
-          <w:bCs/>
-        </w:rPr>
-        <w:t xml:space="preserve">What happens next:</w:t>
-      </w:r>
-      <w:r>
-        <w:t xml:space="preserve"> </w:t>
-      </w:r>
-      <w:r>
-        <w:t xml:space="preserve">Railway issues the certificate automatically once it finishes validating — usually within ~30 minutes of the CNAME propagating, occasionally a few hours. When it’s done,</w:t>
-      </w:r>
-      <w:r>
-        <w:t xml:space="preserve"> </w:t>
-      </w:r>
-      <w:r>
-        <w:rPr>
-          <w:rStyle w:val="VerbatimChar"/>
-        </w:rPr>
-        <w:t xml:space="preserve">fund.kuja.org</w:t>
-      </w:r>
-      <w:r>
-        <w:t xml:space="preserve"> </w:t>
-      </w:r>
-      <w:r>
-        <w:t xml:space="preserve">starts serving with no further action.</w:t>
-      </w:r>
-      <w:r>
-        <w:t xml:space="preserve"> </w:t>
-      </w:r>
-      <w:r>
-        <w:rPr>
-          <w:b/>
-          <w:bCs/>
-        </w:rPr>
-        <w:t xml:space="preserve">If it’s still stuck after a few hours,</w:t>
-      </w:r>
-      <w:r>
-        <w:t xml:space="preserve"> </w:t>
-      </w:r>
-      <w:r>
-        <w:t xml:space="preserve">the fix is on the Railway side (dev/ops), not DNS — see</w:t>
-      </w:r>
-      <w:r>
-        <w:t xml:space="preserve"> </w:t>
-      </w:r>
-      <w:r>
-        <w:t xml:space="preserve">“If it stays stuck”</w:t>
-      </w:r>
-      <w:r>
-        <w:t xml:space="preserve"> </w:t>
-      </w:r>
-      <w:r>
-        <w:t xml:space="preserve">below.</w:t>
-      </w:r>
-    </w:p>
-    <w:p>
-      <w:pPr>
         <w:pStyle w:val="FirstParagraph"/>
       </w:pPr>
       <w:r>
@@ -423,7 +402,7 @@
         <w:t xml:space="preserve"> </w:t>
       </w:r>
       <w:r>
-        <w:t xml:space="preserve">- The app is hosted on</w:t>
+        <w:t xml:space="preserve">- Hosted on</w:t>
       </w:r>
       <w:r>
         <w:t xml:space="preserve"> </w:t>
@@ -480,7 +459,7 @@
         <w:t xml:space="preserve">web</w:t>
       </w:r>
       <w:r>
-        <w:t xml:space="preserve">). It is currently reachable at</w:t>
+        <w:t xml:space="preserve">). Currently reachable at</w:t>
       </w:r>
       <w:r>
         <w:t xml:space="preserve"> </w:t>
@@ -508,26 +487,13 @@
           <w:b/>
           <w:bCs/>
         </w:rPr>
-        <w:t xml:space="preserve">Zero downtime / no cutover risk:</w:t>
-      </w:r>
-      <w:r>
-        <w:t xml:space="preserve"> </w:t>
-      </w:r>
-      <w:r>
-        <w:t xml:space="preserve">adding a custom domain is</w:t>
-      </w:r>
-      <w:r>
-        <w:t xml:space="preserve"> </w:t>
-      </w:r>
-      <w:r>
-        <w:rPr>
-          <w:i/>
-          <w:iCs/>
-        </w:rPr>
-        <w:t xml:space="preserve">additive</w:t>
-      </w:r>
-      <w:r>
-        <w:t xml:space="preserve">. The existing Railway URL keeps working throughout.</w:t>
+        <w:t xml:space="preserve">Zero downtime / additive:</w:t>
+      </w:r>
+      <w:r>
+        <w:t xml:space="preserve"> </w:t>
+      </w:r>
+      <w:r>
+        <w:t xml:space="preserve">the existing Railway URL keeps working throughout.</w:t>
       </w:r>
       <w:r>
         <w:t xml:space="preserve"> </w:t>
@@ -580,163 +546,29 @@
         <w:t xml:space="preserve"> </w:t>
       </w:r>
       <w:r>
-        <w:t xml:space="preserve">tenant automatically, so</w:t>
-      </w:r>
-      <w:r>
-        <w:t xml:space="preserve"> </w:t>
-      </w:r>
-      <w:r>
-        <w:rPr>
-          <w:rStyle w:val="VerbatimChar"/>
-        </w:rPr>
-        <w:t xml:space="preserve">fund.kuja.org</w:t>
-      </w:r>
-      <w:r>
-        <w:t xml:space="preserve"> </w:t>
-      </w:r>
-      <w:r>
-        <w:t xml:space="preserve">lands on the right tenant with no code/DB change.</w:t>
-      </w:r>
-      <w:r>
-        <w:t xml:space="preserve"> </w:t>
-      </w:r>
-      <w:r>
-        <w:t xml:space="preserve">- TLS (HTTPS) is issued automatically by Railway (Let’s Encrypt) once the CNAME resolves — you do</w:t>
-      </w:r>
-      <w:r>
-        <w:t xml:space="preserve"> </w:t>
-      </w:r>
-      <w:r>
-        <w:rPr>
-          <w:b/>
-          <w:bCs/>
-        </w:rPr>
-        <w:t xml:space="preserve">not</w:t>
-      </w:r>
-      <w:r>
-        <w:t xml:space="preserve"> </w:t>
-      </w:r>
-      <w:r>
-        <w:t xml:space="preserve">upload a certificate, and you do</w:t>
-      </w:r>
-      <w:r>
-        <w:t xml:space="preserve"> </w:t>
-      </w:r>
-      <w:r>
-        <w:rPr>
-          <w:b/>
-          <w:bCs/>
-        </w:rPr>
-        <w:t xml:space="preserve">not</w:t>
-      </w:r>
-      <w:r>
-        <w:t xml:space="preserve"> </w:t>
-      </w:r>
-      <w:r>
-        <w:t xml:space="preserve">add any verification record.</w:t>
-      </w:r>
-    </w:p>
-    <w:p>
-      <w:pPr>
-        <w:pStyle w:val="BodyText"/>
-      </w:pPr>
-      <w:r>
-        <w:rPr>
-          <w:b/>
-          <w:bCs/>
-        </w:rPr>
-        <w:t xml:space="preserve">Who does what</w:t>
-      </w:r>
-      <w:r>
-        <w:t xml:space="preserve"> </w:t>
-      </w:r>
-      <w:r>
-        <w:t xml:space="preserve">-</w:t>
-      </w:r>
-      <w:r>
-        <w:t xml:space="preserve"> </w:t>
-      </w:r>
-      <w:r>
-        <w:rPr>
-          <w:b/>
-          <w:bCs/>
-        </w:rPr>
-        <w:t xml:space="preserve">Part A (DNS):</w:t>
-      </w:r>
-      <w:r>
-        <w:t xml:space="preserve"> </w:t>
-      </w:r>
-      <w:r>
-        <w:t xml:space="preserve">your DNS/IT team, in the</w:t>
-      </w:r>
-      <w:r>
-        <w:t xml:space="preserve"> </w:t>
-      </w:r>
-      <w:r>
-        <w:rPr>
-          <w:rStyle w:val="VerbatimChar"/>
-        </w:rPr>
-        <w:t xml:space="preserve">kuja.org</w:t>
-      </w:r>
-      <w:r>
-        <w:t xml:space="preserve"> </w:t>
-      </w:r>
-      <w:r>
-        <w:t xml:space="preserve">DNS zone.</w:t>
-      </w:r>
-      <w:r>
-        <w:t xml:space="preserve"> </w:t>
-      </w:r>
-      <w:r>
-        <w:rPr>
-          <w:b/>
-          <w:bCs/>
-        </w:rPr>
-        <w:t xml:space="preserve">This is a single CNAME — and per the status box above, it’s already done.</w:t>
-      </w:r>
-      <w:r>
-        <w:t xml:space="preserve"> </w:t>
-      </w:r>
-      <w:r>
-        <w:t xml:space="preserve">-</w:t>
-      </w:r>
-      <w:r>
-        <w:t xml:space="preserve"> </w:t>
-      </w:r>
-      <w:r>
-        <w:rPr>
-          <w:b/>
-          <w:bCs/>
-        </w:rPr>
-        <w:t xml:space="preserve">Parts B–C (Railway domain + app config):</w:t>
-      </w:r>
-      <w:r>
-        <w:t xml:space="preserve"> </w:t>
-      </w:r>
-      <w:r>
-        <w:t xml:space="preserve">whoever administers the Railway account (dev/ops).</w:t>
-      </w:r>
-      <w:r>
-        <w:t xml:space="preserve"> </w:t>
-      </w:r>
-      <w:r>
-        <w:t xml:space="preserve">-</w:t>
-      </w:r>
-      <w:r>
-        <w:t xml:space="preserve"> </w:t>
-      </w:r>
-      <w:r>
-        <w:rPr>
-          <w:b/>
-          <w:bCs/>
-        </w:rPr>
-        <w:t xml:space="preserve">Part D:</w:t>
-      </w:r>
-      <w:r>
-        <w:t xml:space="preserve"> </w:t>
-      </w:r>
-      <w:r>
-        <w:t xml:space="preserve">anyone, to verify.</w:t>
+        <w:t xml:space="preserve">tenant automatically.</w:t>
+      </w:r>
+      <w:r>
+        <w:t xml:space="preserve"> </w:t>
+      </w:r>
+      <w:r>
+        <w:t xml:space="preserve">- TLS (HTTPS) is issued automatically by Railway (Let’s Encrypt) once</w:t>
+      </w:r>
+      <w:r>
+        <w:t xml:space="preserve"> </w:t>
+      </w:r>
+      <w:r>
+        <w:rPr>
+          <w:b/>
+          <w:bCs/>
+        </w:rPr>
+        <w:t xml:space="preserve">both</w:t>
+      </w:r>
+      <w:r>
+        <w:t xml:space="preserve"> </w:t>
+      </w:r>
+      <w:r>
+        <w:t xml:space="preserve">DNS records are in place and verified — you don’t upload a certificate.</w:t>
       </w:r>
     </w:p>
     <w:p>
@@ -746,13 +578,13 @@
         </w:pict>
       </w:r>
     </w:p>
-    <w:bookmarkStart w:id="11" w:name="part-a-dns-record-in-the-kuja.org-zone"/>
+    <w:bookmarkStart w:id="11" w:name="Xa65f4ccf6ab31988771f80cb346fcc14f46ef1a"/>
     <w:p>
       <w:pPr>
         <w:pStyle w:val="Heading2"/>
       </w:pPr>
       <w:r>
-        <w:t xml:space="preserve">Part A — DNS record (in the</w:t>
+        <w:t xml:space="preserve">Part A — DNS records (in the</w:t>
       </w:r>
       <w:r>
         <w:t xml:space="preserve"> </w:t>
@@ -767,7 +599,7 @@
         <w:t xml:space="preserve"> </w:t>
       </w:r>
       <w:r>
-        <w:t xml:space="preserve">zone)</w:t>
+        <w:t xml:space="preserve">zone / Route 53)</w:t>
       </w:r>
     </w:p>
     <w:p>
@@ -775,38 +607,88 @@
         <w:pStyle w:val="FirstParagraph"/>
       </w:pPr>
       <w:r>
-        <w:t xml:space="preserve">You already run other subdomains here (</w:t>
-      </w:r>
-      <w:r>
-        <w:rPr>
-          <w:rStyle w:val="VerbatimChar"/>
-        </w:rPr>
-        <w:t xml:space="preserve">proximate.kuja.org</w:t>
-      </w:r>
-      <w:r>
-        <w:t xml:space="preserve">,</w:t>
-      </w:r>
-      <w:r>
-        <w:t xml:space="preserve"> </w:t>
-      </w:r>
-      <w:r>
-        <w:rPr>
-          <w:rStyle w:val="VerbatimChar"/>
-        </w:rPr>
-        <w:t xml:space="preserve">saxansaxo.kuja.org</w:t>
-      </w:r>
-      <w:r>
-        <w:t xml:space="preserve">) the same way:</w:t>
-      </w:r>
-      <w:r>
-        <w:t xml:space="preserve"> </w:t>
-      </w:r>
-      <w:r>
-        <w:rPr>
-          <w:b/>
-          <w:bCs/>
-        </w:rPr>
-        <w:t xml:space="preserve">one CNAME each, no TXT.</w:t>
+        <w:rPr>
+          <w:b/>
+          <w:bCs/>
+        </w:rPr>
+        <w:t xml:space="preserve">Both records are required.</w:t>
+      </w:r>
+      <w:r>
+        <w:t xml:space="preserve"> </w:t>
+      </w:r>
+      <w:r>
+        <w:t xml:space="preserve">Values below are current as of 2026-08-19; the</w:t>
+      </w:r>
+      <w:r>
+        <w:t xml:space="preserve"> </w:t>
+      </w:r>
+      <w:r>
+        <w:rPr>
+          <w:b/>
+          <w:bCs/>
+        </w:rPr>
+        <w:t xml:space="preserve">authoritative source is Railway →</w:t>
+      </w:r>
+      <w:r>
+        <w:rPr>
+          <w:b/>
+          <w:bCs/>
+        </w:rPr>
+        <w:t xml:space="preserve"> </w:t>
+      </w:r>
+      <w:r>
+        <w:rPr>
+          <w:rStyle w:val="VerbatimChar"/>
+          <w:b/>
+          <w:bCs/>
+        </w:rPr>
+        <w:t xml:space="preserve">web</w:t>
+      </w:r>
+      <w:r>
+        <w:rPr>
+          <w:b/>
+          <w:bCs/>
+        </w:rPr>
+        <w:t xml:space="preserve"> </w:t>
+      </w:r>
+      <w:r>
+        <w:rPr>
+          <w:b/>
+          <w:bCs/>
+        </w:rPr>
+        <w:t xml:space="preserve">→ Settings → Networking → the</w:t>
+      </w:r>
+      <w:r>
+        <w:rPr>
+          <w:b/>
+          <w:bCs/>
+        </w:rPr>
+        <w:t xml:space="preserve"> </w:t>
+      </w:r>
+      <w:r>
+        <w:rPr>
+          <w:rStyle w:val="VerbatimChar"/>
+          <w:b/>
+          <w:bCs/>
+        </w:rPr>
+        <w:t xml:space="preserve">fund.kuja.org</w:t>
+      </w:r>
+      <w:r>
+        <w:rPr>
+          <w:b/>
+          <w:bCs/>
+        </w:rPr>
+        <w:t xml:space="preserve"> </w:t>
+      </w:r>
+      <w:r>
+        <w:rPr>
+          <w:b/>
+          <w:bCs/>
+        </w:rPr>
+        <w:t xml:space="preserve">entry</w:t>
+      </w:r>
+      <w:r>
+        <w:t xml:space="preserve">, which shows the CNAME target and the verification token. (If the domain is ever removed and re-added in Railway, the token and CNAME target change — re-read them from that panel.)</w:t>
       </w:r>
     </w:p>
     <w:p>
@@ -818,13 +700,7 @@
           <w:b/>
           <w:bCs/>
         </w:rPr>
-        <w:t xml:space="preserve">The only record — CNAME</w:t>
-      </w:r>
-      <w:r>
-        <w:t xml:space="preserve"> </w:t>
-      </w:r>
-      <w:r>
-        <w:t xml:space="preserve">(already in place; shown for completeness / re-creation):</w:t>
+        <w:t xml:space="preserve">Record #1 — CNAME (routes traffic):</w:t>
       </w:r>
     </w:p>
     <w:tbl>
@@ -994,7 +870,7 @@
                 <w:b/>
                 <w:bCs/>
               </w:rPr>
-              <w:t xml:space="preserve">u7b375h8.up.railway.app</w:t>
+              <w:t xml:space="preserve">0tvwlstv.up.railway.app</w:t>
             </w:r>
             <w:r>
               <w:t xml:space="preserve"> </w:t>
@@ -1004,7 +880,36 @@
                 <w:i/>
                 <w:iCs/>
               </w:rPr>
-              <w:t xml:space="preserve">(copy exactly)</w:t>
+              <w:t xml:space="preserve">(current target in the dashboard; an older</w:t>
+            </w:r>
+            <w:r>
+              <w:rPr>
+                <w:i/>
+                <w:iCs/>
+              </w:rPr>
+              <w:t xml:space="preserve"> </w:t>
+            </w:r>
+            <w:r>
+              <w:rPr>
+                <w:rStyle w:val="VerbatimChar"/>
+                <w:i/>
+                <w:iCs/>
+              </w:rPr>
+              <w:t xml:space="preserve">u7b375h8.up.railway.app</w:t>
+            </w:r>
+            <w:r>
+              <w:rPr>
+                <w:i/>
+                <w:iCs/>
+              </w:rPr>
+              <w:t xml:space="preserve"> </w:t>
+            </w:r>
+            <w:r>
+              <w:rPr>
+                <w:i/>
+                <w:iCs/>
+              </w:rPr>
+              <w:t xml:space="preserve">may still be in place and also resolves, but set it to this to match Railway exactly)</w:t>
             </w:r>
           </w:p>
         </w:tc>
@@ -1037,12 +942,6 @@
               </w:rPr>
               <w:t xml:space="preserve">300</w:t>
             </w:r>
-            <w:r>
-              <w:t xml:space="preserve"> </w:t>
-            </w:r>
-            <w:r>
-              <w:t xml:space="preserve">(5 min) is fine</w:t>
-            </w:r>
           </w:p>
         </w:tc>
       </w:tr>
@@ -1079,7 +978,7 @@
               <w:t xml:space="preserve"> </w:t>
             </w:r>
             <w:r>
-              <w:t xml:space="preserve">if this zone is on Cloudflare (grey cloud), at least until the cert is issued — see gotcha #2</w:t>
+              <w:t xml:space="preserve">if on Cloudflare — see gotcha #3</w:t>
             </w:r>
           </w:p>
         </w:tc>
@@ -1090,7 +989,258 @@
         <w:pStyle w:val="BodyText"/>
       </w:pPr>
       <w:r>
-        <w:t xml:space="preserve">That’s the whole DNS task. Once the CNAME resolves, Railway auto-validates ownership and issues the TLS certificate, and</w:t>
+        <w:rPr>
+          <w:b/>
+          <w:bCs/>
+        </w:rPr>
+        <w:t xml:space="preserve">Record #2 — TXT (proves ownership — THIS is the missing one blocking the cert):</w:t>
+      </w:r>
+    </w:p>
+    <w:tbl>
+      <w:tblPr>
+        <w:tblStyle w:val="Table"/>
+        <w:tblW w:type="pct" w:w="5000"/>
+        <w:tblLayout w:type="fixed"/>
+        <w:tblLook w:firstRow="1" w:lastRow="0" w:firstColumn="0" w:lastColumn="0" w:noHBand="0" w:noVBand="0" w:val="0020"/>
+      </w:tblPr>
+      <w:tblGrid>
+        <w:gridCol w:w="3960"/>
+        <w:gridCol w:w="3960"/>
+      </w:tblGrid>
+      <w:tr>
+        <w:trPr>
+          <w:tblHeader w:val="on"/>
+        </w:trPr>
+        <w:tc>
+          <w:tcPr/>
+          <w:p>
+            <w:pPr>
+              <w:pStyle w:val="Compact"/>
+            </w:pPr>
+            <w:r>
+              <w:t xml:space="preserve">Field</w:t>
+            </w:r>
+          </w:p>
+        </w:tc>
+        <w:tc>
+          <w:tcPr/>
+          <w:p>
+            <w:pPr>
+              <w:pStyle w:val="Compact"/>
+            </w:pPr>
+            <w:r>
+              <w:t xml:space="preserve">Value</w:t>
+            </w:r>
+          </w:p>
+        </w:tc>
+      </w:tr>
+      <w:tr>
+        <w:tc>
+          <w:tcPr/>
+          <w:p>
+            <w:pPr>
+              <w:pStyle w:val="Compact"/>
+            </w:pPr>
+            <w:r>
+              <w:rPr>
+                <w:b/>
+                <w:bCs/>
+              </w:rPr>
+              <w:t xml:space="preserve">Type</w:t>
+            </w:r>
+          </w:p>
+        </w:tc>
+        <w:tc>
+          <w:tcPr/>
+          <w:p>
+            <w:pPr>
+              <w:pStyle w:val="Compact"/>
+            </w:pPr>
+            <w:r>
+              <w:rPr>
+                <w:rStyle w:val="VerbatimChar"/>
+              </w:rPr>
+              <w:t xml:space="preserve">TXT</w:t>
+            </w:r>
+          </w:p>
+        </w:tc>
+      </w:tr>
+      <w:tr>
+        <w:tc>
+          <w:tcPr/>
+          <w:p>
+            <w:pPr>
+              <w:pStyle w:val="Compact"/>
+            </w:pPr>
+            <w:r>
+              <w:rPr>
+                <w:b/>
+                <w:bCs/>
+              </w:rPr>
+              <w:t xml:space="preserve">Host / Name</w:t>
+            </w:r>
+          </w:p>
+        </w:tc>
+        <w:tc>
+          <w:tcPr/>
+          <w:p>
+            <w:pPr>
+              <w:pStyle w:val="Compact"/>
+            </w:pPr>
+            <w:r>
+              <w:rPr>
+                <w:rStyle w:val="VerbatimChar"/>
+              </w:rPr>
+              <w:t xml:space="preserve">_railway-verify.fund</w:t>
+            </w:r>
+            <w:r>
+              <w:t xml:space="preserve"> </w:t>
+            </w:r>
+            <w:r>
+              <w:rPr>
+                <w:i/>
+                <w:iCs/>
+              </w:rPr>
+              <w:t xml:space="preserve">(the zone appends</w:t>
+            </w:r>
+            <w:r>
+              <w:rPr>
+                <w:i/>
+                <w:iCs/>
+              </w:rPr>
+              <w:t xml:space="preserve"> </w:t>
+            </w:r>
+            <w:r>
+              <w:rPr>
+                <w:rStyle w:val="VerbatimChar"/>
+                <w:i/>
+                <w:iCs/>
+              </w:rPr>
+              <w:t xml:space="preserve">.kuja.org</w:t>
+            </w:r>
+            <w:r>
+              <w:rPr>
+                <w:i/>
+                <w:iCs/>
+              </w:rPr>
+              <w:t xml:space="preserve">; see gotcha #1)</w:t>
+            </w:r>
+          </w:p>
+        </w:tc>
+      </w:tr>
+      <w:tr>
+        <w:tc>
+          <w:tcPr/>
+          <w:p>
+            <w:pPr>
+              <w:pStyle w:val="Compact"/>
+            </w:pPr>
+            <w:r>
+              <w:rPr>
+                <w:b/>
+                <w:bCs/>
+              </w:rPr>
+              <w:t xml:space="preserve">Value / Content</w:t>
+            </w:r>
+          </w:p>
+        </w:tc>
+        <w:tc>
+          <w:tcPr/>
+          <w:p>
+            <w:pPr>
+              <w:pStyle w:val="Compact"/>
+            </w:pPr>
+            <w:r>
+              <w:rPr>
+                <w:rStyle w:val="VerbatimChar"/>
+              </w:rPr>
+              <w:t xml:space="preserve">railway-verify=7c60d4d4b9bd5dbac68b50dc126395139dd63a229da0ba3fbb49531cff107881</w:t>
+            </w:r>
+          </w:p>
+        </w:tc>
+      </w:tr>
+      <w:tr>
+        <w:tc>
+          <w:tcPr/>
+          <w:p>
+            <w:pPr>
+              <w:pStyle w:val="Compact"/>
+            </w:pPr>
+            <w:r>
+              <w:rPr>
+                <w:b/>
+                <w:bCs/>
+              </w:rPr>
+              <w:t xml:space="preserve">TTL</w:t>
+            </w:r>
+          </w:p>
+        </w:tc>
+        <w:tc>
+          <w:tcPr/>
+          <w:p>
+            <w:pPr>
+              <w:pStyle w:val="Compact"/>
+            </w:pPr>
+            <w:r>
+              <w:rPr>
+                <w:rStyle w:val="VerbatimChar"/>
+              </w:rPr>
+              <w:t xml:space="preserve">300</w:t>
+            </w:r>
+          </w:p>
+        </w:tc>
+      </w:tr>
+      <w:tr>
+        <w:tc>
+          <w:tcPr/>
+          <w:p>
+            <w:pPr>
+              <w:pStyle w:val="Compact"/>
+            </w:pPr>
+            <w:r>
+              <w:rPr>
+                <w:b/>
+                <w:bCs/>
+              </w:rPr>
+              <w:t xml:space="preserve">Proxy</w:t>
+            </w:r>
+          </w:p>
+        </w:tc>
+        <w:tc>
+          <w:tcPr/>
+          <w:p>
+            <w:pPr>
+              <w:pStyle w:val="Compact"/>
+            </w:pPr>
+            <w:r>
+              <w:t xml:space="preserve">N/A (TXT is never proxied)</w:t>
+            </w:r>
+          </w:p>
+        </w:tc>
+      </w:tr>
+    </w:tbl>
+    <w:p>
+      <w:pPr>
+        <w:pStyle w:val="BodyText"/>
+      </w:pPr>
+      <w:r>
+        <w:t xml:space="preserve">Once</w:t>
+      </w:r>
+      <w:r>
+        <w:t xml:space="preserve"> </w:t>
+      </w:r>
+      <w:r>
+        <w:rPr>
+          <w:b/>
+          <w:bCs/>
+        </w:rPr>
+        <w:t xml:space="preserve">both</w:t>
+      </w:r>
+      <w:r>
+        <w:t xml:space="preserve"> </w:t>
+      </w:r>
+      <w:r>
+        <w:t xml:space="preserve">are live, Railway auto-verifies within a few minutes, issues the TLS certificate, and</w:t>
       </w:r>
       <w:r>
         <w:t xml:space="preserve"> </w:t>
@@ -1118,7 +1268,22 @@
         <w:t xml:space="preserve">Active</w:t>
       </w:r>
       <w:r>
-        <w:t xml:space="preserve">.</w:t>
+        <w:t xml:space="preserve"> </w:t>
+      </w:r>
+      <w:r>
+        <w:t xml:space="preserve">— the</w:t>
+      </w:r>
+      <w:r>
+        <w:t xml:space="preserve"> </w:t>
+      </w:r>
+      <w:r>
+        <w:t xml:space="preserve">“Not Found”</w:t>
+      </w:r>
+      <w:r>
+        <w:t xml:space="preserve"> </w:t>
+      </w:r>
+      <w:r>
+        <w:t xml:space="preserve">page disappears.</w:t>
       </w:r>
     </w:p>
     <w:bookmarkStart w:id="10" w:name="X58dd89c8a3cebfd12abf3a6367acdb15887bf83"/>
@@ -1149,7 +1314,7 @@
         <w:t xml:space="preserve"> </w:t>
       </w:r>
       <w:r>
-        <w:t xml:space="preserve">Many DNS UIs auto-append the zone. Enter the host as</w:t>
+        <w:t xml:space="preserve">Enter the host as</w:t>
       </w:r>
       <w:r>
         <w:t xml:space="preserve"> </w:t>
@@ -1161,6 +1326,23 @@
           <w:bCs/>
         </w:rPr>
         <w:t xml:space="preserve">fund</w:t>
+      </w:r>
+      <w:r>
+        <w:t xml:space="preserve"> </w:t>
+      </w:r>
+      <w:r>
+        <w:t xml:space="preserve">and</w:t>
+      </w:r>
+      <w:r>
+        <w:t xml:space="preserve"> </w:t>
+      </w:r>
+      <w:r>
+        <w:rPr>
+          <w:rStyle w:val="VerbatimChar"/>
+          <w:b/>
+          <w:bCs/>
+        </w:rPr>
+        <w:t xml:space="preserve">_railway-verify.fund</w:t>
       </w:r>
       <w:r>
         <w:t xml:space="preserve"> </w:t>
@@ -1188,6 +1370,21 @@
         <w:t xml:space="preserve">fund.kuja.org</w:t>
       </w:r>
       <w:r>
+        <w:t xml:space="preserve"> </w:t>
+      </w:r>
+      <w:r>
+        <w:t xml:space="preserve">/</w:t>
+      </w:r>
+      <w:r>
+        <w:t xml:space="preserve"> </w:t>
+      </w:r>
+      <w:r>
+        <w:rPr>
+          <w:rStyle w:val="VerbatimChar"/>
+        </w:rPr>
+        <w:t xml:space="preserve">_railway-verify.fund.kuja.org</w:t>
+      </w:r>
+      <w:r>
         <w:t xml:space="preserve">, or you create</w:t>
       </w:r>
       <w:r>
@@ -1200,7 +1397,7 @@
         <w:t xml:space="preserve">fund.kuja.org.kuja.org</w:t>
       </w:r>
       <w:r>
-        <w:t xml:space="preserve">, which won’t resolve. (If your UI</w:t>
+        <w:t xml:space="preserve">. (If your UI</w:t>
       </w:r>
       <w:r>
         <w:t xml:space="preserve"> </w:t>
@@ -1216,52 +1413,34 @@
         <w:t xml:space="preserve"> </w:t>
       </w:r>
       <w:r>
-        <w:t xml:space="preserve">an FQDN, use the full</w:t>
-      </w:r>
-      <w:r>
-        <w:t xml:space="preserve"> </w:t>
-      </w:r>
-      <w:r>
-        <w:rPr>
-          <w:rStyle w:val="VerbatimChar"/>
-        </w:rPr>
-        <w:t xml:space="preserve">fund.kuja.org</w:t>
-      </w:r>
-      <w:r>
-        <w:t xml:space="preserve"> </w:t>
-      </w:r>
-      <w:r>
-        <w:t xml:space="preserve">— but never both forms.) Confirm with</w:t>
-      </w:r>
-      <w:r>
-        <w:t xml:space="preserve"> </w:t>
-      </w:r>
-      <w:r>
-        <w:rPr>
-          <w:rStyle w:val="VerbatimChar"/>
-        </w:rPr>
-        <w:t xml:space="preserve">nslookup fund.kuja.org</w:t>
-      </w:r>
-      <w:r>
-        <w:t xml:space="preserve"> </w:t>
-      </w:r>
-      <w:r>
-        <w:t xml:space="preserve">— it must return a</w:t>
-      </w:r>
-      <w:r>
-        <w:t xml:space="preserve"> </w:t>
-      </w:r>
-      <w:r>
-        <w:rPr>
-          <w:rStyle w:val="VerbatimChar"/>
-        </w:rPr>
-        <w:t xml:space="preserve">*.up.railway.app</w:t>
-      </w:r>
-      <w:r>
-        <w:t xml:space="preserve"> </w:t>
-      </w:r>
-      <w:r>
-        <w:t xml:space="preserve">target.</w:t>
+        <w:t xml:space="preserve">an FQDN, use the full form — but never both.) Verify with</w:t>
+      </w:r>
+      <w:r>
+        <w:t xml:space="preserve"> </w:t>
+      </w:r>
+      <w:r>
+        <w:rPr>
+          <w:rStyle w:val="VerbatimChar"/>
+        </w:rPr>
+        <w:t xml:space="preserve">nslookup -type=TXT _railway-verify.fund.kuja.org</w:t>
+      </w:r>
+      <w:r>
+        <w:t xml:space="preserve">; it must return the</w:t>
+      </w:r>
+      <w:r>
+        <w:t xml:space="preserve"> </w:t>
+      </w:r>
+      <w:r>
+        <w:rPr>
+          <w:rStyle w:val="VerbatimChar"/>
+        </w:rPr>
+        <w:t xml:space="preserve">railway-verify=…</w:t>
+      </w:r>
+      <w:r>
+        <w:t xml:space="preserve"> </w:t>
+      </w:r>
+      <w:r>
+        <w:t xml:space="preserve">value.</w:t>
       </w:r>
     </w:p>
     <w:p>
@@ -1277,57 +1456,68 @@
           <w:b/>
           <w:bCs/>
         </w:rPr>
-        <w:t xml:space="preserve">Cloudflare:</w:t>
-      </w:r>
-      <w:r>
-        <w:t xml:space="preserve"> </w:t>
-      </w:r>
-      <w:r>
-        <w:t xml:space="preserve">if</w:t>
-      </w:r>
-      <w:r>
-        <w:t xml:space="preserve"> </w:t>
-      </w:r>
-      <w:r>
-        <w:rPr>
-          <w:rStyle w:val="VerbatimChar"/>
-        </w:rPr>
-        <w:t xml:space="preserve">kuja.org</w:t>
-      </w:r>
-      <w:r>
-        <w:t xml:space="preserve"> </w:t>
-      </w:r>
-      <w:r>
-        <w:t xml:space="preserve">is proxied by Cloudflare, set this record to</w:t>
-      </w:r>
-      <w:r>
-        <w:t xml:space="preserve"> </w:t>
-      </w:r>
-      <w:r>
-        <w:rPr>
-          <w:b/>
-          <w:bCs/>
-        </w:rPr>
-        <w:t xml:space="preserve">DNS only</w:t>
-      </w:r>
-      <w:r>
-        <w:t xml:space="preserve"> </w:t>
-      </w:r>
-      <w:r>
-        <w:t xml:space="preserve">(grey cloud) so Railway/Let’s Encrypt can validate and issue the certificate. (If you later turn the orange-cloud proxy on, use SSL mode</w:t>
-      </w:r>
-      <w:r>
-        <w:t xml:space="preserve"> </w:t>
-      </w:r>
-      <w:r>
-        <w:rPr>
-          <w:b/>
-          <w:bCs/>
-        </w:rPr>
-        <w:t xml:space="preserve">Full (strict)</w:t>
-      </w:r>
-      <w:r>
-        <w:t xml:space="preserve">.)</w:t>
+        <w:t xml:space="preserve">Route 53 TXT quoting.</w:t>
+      </w:r>
+      <w:r>
+        <w:t xml:space="preserve"> </w:t>
+      </w:r>
+      <w:r>
+        <w:t xml:space="preserve">In AWS Route 53, wrap the TXT value in double quotes:</w:t>
+      </w:r>
+      <w:r>
+        <w:t xml:space="preserve"> </w:t>
+      </w:r>
+      <w:r>
+        <w:rPr>
+          <w:rStyle w:val="VerbatimChar"/>
+        </w:rPr>
+        <w:t xml:space="preserve">"railway-verify=7c60d4d4b9bd5dbac68b50dc126395139dd63a229da0ba3fbb49531cff107881"</w:t>
+      </w:r>
+      <w:r>
+        <w:t xml:space="preserve">. Paste the value</w:t>
+      </w:r>
+      <w:r>
+        <w:t xml:space="preserve"> </w:t>
+      </w:r>
+      <w:r>
+        <w:rPr>
+          <w:b/>
+          <w:bCs/>
+        </w:rPr>
+        <w:t xml:space="preserve">exactly</w:t>
+      </w:r>
+      <w:r>
+        <w:t xml:space="preserve"> </w:t>
+      </w:r>
+      <w:r>
+        <w:t xml:space="preserve">— exactly one</w:t>
+      </w:r>
+      <w:r>
+        <w:t xml:space="preserve"> </w:t>
+      </w:r>
+      <w:r>
+        <w:rPr>
+          <w:rStyle w:val="VerbatimChar"/>
+        </w:rPr>
+        <w:t xml:space="preserve">railway-verify=</w:t>
+      </w:r>
+      <w:r>
+        <w:t xml:space="preserve"> </w:t>
+      </w:r>
+      <w:r>
+        <w:t xml:space="preserve">prefix (if your UI shows</w:t>
+      </w:r>
+      <w:r>
+        <w:t xml:space="preserve"> </w:t>
+      </w:r>
+      <w:r>
+        <w:rPr>
+          <w:rStyle w:val="VerbatimChar"/>
+        </w:rPr>
+        <w:t xml:space="preserve">railway-verify=railway-verify=…</w:t>
+      </w:r>
+      <w:r>
+        <w:t xml:space="preserve">, delete the duplicate).</w:t>
       </w:r>
     </w:p>
     <w:p>
@@ -1343,13 +1533,13 @@
           <w:b/>
           <w:bCs/>
         </w:rPr>
-        <w:t xml:space="preserve">CAA records:</w:t>
-      </w:r>
-      <w:r>
-        <w:t xml:space="preserve"> </w:t>
-      </w:r>
-      <w:r>
-        <w:t xml:space="preserve">if the</w:t>
+        <w:t xml:space="preserve">Cloudflare:</w:t>
+      </w:r>
+      <w:r>
+        <w:t xml:space="preserve"> </w:t>
+      </w:r>
+      <w:r>
+        <w:t xml:space="preserve">if</w:t>
       </w:r>
       <w:r>
         <w:t xml:space="preserve"> </w:t>
@@ -1364,40 +1554,23 @@
         <w:t xml:space="preserve"> </w:t>
       </w:r>
       <w:r>
-        <w:t xml:space="preserve">zone has any</w:t>
-      </w:r>
-      <w:r>
-        <w:t xml:space="preserve"> </w:t>
-      </w:r>
-      <w:r>
-        <w:rPr>
-          <w:b/>
-          <w:bCs/>
-        </w:rPr>
-        <w:t xml:space="preserve">CAA</w:t>
-      </w:r>
-      <w:r>
-        <w:t xml:space="preserve"> </w:t>
-      </w:r>
-      <w:r>
-        <w:t xml:space="preserve">records, make sure they allow</w:t>
-      </w:r>
-      <w:r>
-        <w:t xml:space="preserve"> </w:t>
-      </w:r>
-      <w:r>
-        <w:rPr>
-          <w:rStyle w:val="VerbatimChar"/>
-          <w:b/>
-          <w:bCs/>
-        </w:rPr>
-        <w:t xml:space="preserve">letsencrypt.org</w:t>
-      </w:r>
-      <w:r>
-        <w:t xml:space="preserve"> </w:t>
-      </w:r>
-      <w:r>
-        <w:t xml:space="preserve">to issue certs. (The working tenants already got Let’s Encrypt certs on this zone, so this is only a concern if CAA was changed recently.)</w:t>
+        <w:t xml:space="preserve">is proxied, set the CNAME to</w:t>
+      </w:r>
+      <w:r>
+        <w:t xml:space="preserve"> </w:t>
+      </w:r>
+      <w:r>
+        <w:rPr>
+          <w:b/>
+          <w:bCs/>
+        </w:rPr>
+        <w:t xml:space="preserve">DNS only</w:t>
+      </w:r>
+      <w:r>
+        <w:t xml:space="preserve"> </w:t>
+      </w:r>
+      <w:r>
+        <w:t xml:space="preserve">so Let’s Encrypt can validate. (This zone is on Route 53, so this usually doesn’t apply.)</w:t>
       </w:r>
     </w:p>
     <w:p>
@@ -1409,7 +1582,53 @@
         </w:numPr>
       </w:pPr>
       <w:r>
-        <w:t xml:space="preserve">Propagation is usually a few minutes; certificate issuance after that is usually &lt; 30 min, occasionally a couple of hours.</w:t>
+        <w:rPr>
+          <w:b/>
+          <w:bCs/>
+        </w:rPr>
+        <w:t xml:space="preserve">CAA:</w:t>
+      </w:r>
+      <w:r>
+        <w:t xml:space="preserve"> </w:t>
+      </w:r>
+      <w:r>
+        <w:t xml:space="preserve">if the zone has CAA records, they must allow</w:t>
+      </w:r>
+      <w:r>
+        <w:t xml:space="preserve"> </w:t>
+      </w:r>
+      <w:r>
+        <w:rPr>
+          <w:rStyle w:val="VerbatimChar"/>
+        </w:rPr>
+        <w:t xml:space="preserve">letsencrypt.org</w:t>
+      </w:r>
+      <w:r>
+        <w:t xml:space="preserve">. (There are currently no CAA records on</w:t>
+      </w:r>
+      <w:r>
+        <w:t xml:space="preserve"> </w:t>
+      </w:r>
+      <w:r>
+        <w:rPr>
+          <w:rStyle w:val="VerbatimChar"/>
+        </w:rPr>
+        <w:t xml:space="preserve">kuja.org</w:t>
+      </w:r>
+      <w:r>
+        <w:t xml:space="preserve">, so this is fine.)</w:t>
+      </w:r>
+    </w:p>
+    <w:p>
+      <w:pPr>
+        <w:pStyle w:val="Compact"/>
+        <w:numPr>
+          <w:ilvl w:val="0"/>
+          <w:numId w:val="1001"/>
+        </w:numPr>
+      </w:pPr>
+      <w:r>
+        <w:t xml:space="preserve">Propagation is usually a few minutes; certificate issuance after verification is usually &lt; 30 min.</w:t>
       </w:r>
     </w:p>
     <w:p>
@@ -1421,7 +1640,7 @@
     </w:p>
     <w:bookmarkEnd w:id="10"/>
     <w:bookmarkEnd w:id="11"/>
-    <w:bookmarkStart w:id="13" w:name="X38e75407b8e09893d188986c0fc262163f701ef"/>
+    <w:bookmarkStart w:id="12" w:name="X38e75407b8e09893d188986c0fc262163f701ef"/>
     <w:p>
       <w:pPr>
         <w:pStyle w:val="Heading2"/>
@@ -1435,32 +1654,7 @@
         <w:pStyle w:val="BlockText"/>
       </w:pPr>
       <w:r>
-        <w:t xml:space="preserve">✅</w:t>
-      </w:r>
-      <w:r>
-        <w:t xml:space="preserve"> </w:t>
-      </w:r>
-      <w:r>
-        <w:rPr>
-          <w:b/>
-          <w:bCs/>
-        </w:rPr>
-        <w:t xml:space="preserve">Already done.</w:t>
-      </w:r>
-      <w:r>
-        <w:t xml:space="preserve"> </w:t>
-      </w:r>
-      <w:r>
-        <w:rPr>
-          <w:rStyle w:val="VerbatimChar"/>
-        </w:rPr>
-        <w:t xml:space="preserve">fund.kuja.org</w:t>
-      </w:r>
-      <w:r>
-        <w:t xml:space="preserve"> </w:t>
-      </w:r>
-      <w:r>
-        <w:t xml:space="preserve">is registered on the</w:t>
+        <w:t xml:space="preserve">✅ Already registered on the</w:t>
       </w:r>
       <w:r>
         <w:t xml:space="preserve"> </w:t>
@@ -1475,21 +1669,7 @@
         <w:t xml:space="preserve"> </w:t>
       </w:r>
       <w:r>
-        <w:t xml:space="preserve">service with the CNAME target</w:t>
-      </w:r>
-      <w:r>
-        <w:t xml:space="preserve"> </w:t>
-      </w:r>
-      <w:r>
-        <w:rPr>
-          <w:rStyle w:val="VerbatimChar"/>
-          <w:b/>
-          <w:bCs/>
-        </w:rPr>
-        <w:t xml:space="preserve">u7b375h8.up.railway.app</w:t>
-      </w:r>
-      <w:r>
-        <w:t xml:space="preserve">. As of 2026-08-19 Railway reports its certificate status as</w:t>
+        <w:t xml:space="preserve">service. Its cert is stuck at</w:t>
       </w:r>
       <w:r>
         <w:t xml:space="preserve"> </w:t>
@@ -1505,7 +1685,23 @@
         <w:t xml:space="preserve"> </w:t>
       </w:r>
       <w:r>
-        <w:t xml:space="preserve">— i.e. it is mid-issuance, which is expected right after the CNAME propagates. You only need the steps below if you ever have to re-create it, or if issuance stays stuck (next section).</w:t>
+        <w:t xml:space="preserve">purely because the Part-A</w:t>
+      </w:r>
+      <w:r>
+        <w:t xml:space="preserve"> </w:t>
+      </w:r>
+      <w:r>
+        <w:rPr>
+          <w:b/>
+          <w:bCs/>
+        </w:rPr>
+        <w:t xml:space="preserve">TXT</w:t>
+      </w:r>
+      <w:r>
+        <w:t xml:space="preserve"> </w:t>
+      </w:r>
+      <w:r>
+        <w:t xml:space="preserve">record is missing. Add the TXT and it proceeds automatically. You only need the steps below to re-create it or read the current token/target.</w:t>
       </w:r>
     </w:p>
     <w:p>
@@ -1619,25 +1815,86 @@
           <w:b/>
           <w:bCs/>
         </w:rPr>
-        <w:t xml:space="preserve">Settings → Networking → Custom Domain</w:t>
-      </w:r>
-      <w:r>
-        <w:t xml:space="preserve">.</w:t>
-      </w:r>
-      <w:r>
-        <w:t xml:space="preserve"> </w:t>
-      </w:r>
-      <w:r>
-        <w:rPr>
-          <w:rStyle w:val="VerbatimChar"/>
+        <w:t xml:space="preserve">Settings → Networking → Custom Domain → the</w:t>
+      </w:r>
+      <w:r>
+        <w:rPr>
+          <w:b/>
+          <w:bCs/>
+        </w:rPr>
+        <w:t xml:space="preserve"> </w:t>
+      </w:r>
+      <w:r>
+        <w:rPr>
+          <w:rStyle w:val="VerbatimChar"/>
+          <w:b/>
+          <w:bCs/>
         </w:rPr>
         <w:t xml:space="preserve">fund.kuja.org</w:t>
       </w:r>
       <w:r>
-        <w:t xml:space="preserve"> </w:t>
-      </w:r>
-      <w:r>
-        <w:t xml:space="preserve">should already be listed.</w:t>
+        <w:rPr>
+          <w:b/>
+          <w:bCs/>
+        </w:rPr>
+        <w:t xml:space="preserve"> </w:t>
+      </w:r>
+      <w:r>
+        <w:rPr>
+          <w:b/>
+          <w:bCs/>
+        </w:rPr>
+        <w:t xml:space="preserve">entry</w:t>
+      </w:r>
+      <w:r>
+        <w:t xml:space="preserve">. It shows the required</w:t>
+      </w:r>
+      <w:r>
+        <w:t xml:space="preserve"> </w:t>
+      </w:r>
+      <w:r>
+        <w:rPr>
+          <w:b/>
+          <w:bCs/>
+        </w:rPr>
+        <w:t xml:space="preserve">CNAME target</w:t>
+      </w:r>
+      <w:r>
+        <w:t xml:space="preserve"> </w:t>
+      </w:r>
+      <w:r>
+        <w:t xml:space="preserve">and the</w:t>
+      </w:r>
+      <w:r>
+        <w:t xml:space="preserve"> </w:t>
+      </w:r>
+      <w:r>
+        <w:rPr>
+          <w:rStyle w:val="VerbatimChar"/>
+          <w:b/>
+          <w:bCs/>
+        </w:rPr>
+        <w:t xml:space="preserve">_railway-verify</w:t>
+      </w:r>
+      <w:r>
+        <w:rPr>
+          <w:b/>
+          <w:bCs/>
+        </w:rPr>
+        <w:t xml:space="preserve"> </w:t>
+      </w:r>
+      <w:r>
+        <w:rPr>
+          <w:b/>
+          <w:bCs/>
+        </w:rPr>
+        <w:t xml:space="preserve">TXT host + token</w:t>
+      </w:r>
+      <w:r>
+        <w:t xml:space="preserve"> </w:t>
+      </w:r>
+      <w:r>
+        <w:t xml:space="preserve">— these are the source of truth for Part A.</w:t>
       </w:r>
     </w:p>
     <w:p>
@@ -1649,239 +1906,23 @@
         </w:numPr>
       </w:pPr>
       <w:r>
-        <w:t xml:space="preserve">The panel shows the certificate state.</w:t>
-      </w:r>
-      <w:r>
-        <w:t xml:space="preserve"> </w:t>
-      </w:r>
-      <w:r>
-        <w:rPr>
-          <w:b/>
-          <w:bCs/>
-        </w:rPr>
-        <w:t xml:space="preserve">Active/green</w:t>
-      </w:r>
-      <w:r>
-        <w:t xml:space="preserve"> </w:t>
-      </w:r>
-      <w:r>
-        <w:t xml:space="preserve">= done.</w:t>
-      </w:r>
-      <w:r>
-        <w:t xml:space="preserve"> </w:t>
-      </w:r>
-      <w:r>
-        <w:rPr>
-          <w:b/>
-          <w:bCs/>
-        </w:rPr>
-        <w:t xml:space="preserve">“Issuing”</w:t>
-      </w:r>
-      <w:r>
-        <w:rPr>
-          <w:b/>
-          <w:bCs/>
-        </w:rPr>
-        <w:t xml:space="preserve"> </w:t>
-      </w:r>
-      <w:r>
-        <w:rPr>
-          <w:b/>
-          <w:bCs/>
-        </w:rPr>
-        <w:t xml:space="preserve">/</w:t>
-      </w:r>
-      <w:r>
-        <w:rPr>
-          <w:b/>
-          <w:bCs/>
-        </w:rPr>
-        <w:t xml:space="preserve"> </w:t>
-      </w:r>
-      <w:r>
-        <w:rPr>
-          <w:b/>
-          <w:bCs/>
-        </w:rPr>
-        <w:t xml:space="preserve">“validating”</w:t>
-      </w:r>
-      <w:r>
-        <w:t xml:space="preserve"> </w:t>
-      </w:r>
-      <w:r>
-        <w:t xml:space="preserve">= in progress, just wait.</w:t>
-      </w:r>
-    </w:p>
-    <w:bookmarkStart w:id="12" w:name="X18a6953cad5a38c7927ecbee0de5502d58a37d2"/>
-    <w:p>
-      <w:pPr>
-        <w:pStyle w:val="Heading3"/>
-      </w:pPr>
-      <w:r>
-        <w:t xml:space="preserve">If it stays stuck (still</w:t>
-      </w:r>
-      <w:r>
-        <w:t xml:space="preserve"> </w:t>
-      </w:r>
-      <w:r>
-        <w:t xml:space="preserve">“Not Found”</w:t>
-      </w:r>
-      <w:r>
-        <w:t xml:space="preserve"> </w:t>
-      </w:r>
-      <w:r>
-        <w:t xml:space="preserve">after a few hours)</w:t>
-      </w:r>
-    </w:p>
-    <w:p>
-      <w:pPr>
-        <w:pStyle w:val="FirstParagraph"/>
-      </w:pPr>
-      <w:r>
-        <w:t xml:space="preserve">This is a Railway-side certificate step,</w:t>
-      </w:r>
-      <w:r>
-        <w:t xml:space="preserve"> </w:t>
-      </w:r>
-      <w:r>
-        <w:rPr>
-          <w:b/>
-          <w:bCs/>
-        </w:rPr>
-        <w:t xml:space="preserve">not</w:t>
-      </w:r>
-      <w:r>
-        <w:t xml:space="preserve"> </w:t>
-      </w:r>
-      <w:r>
-        <w:t xml:space="preserve">a missing DNS record — do</w:t>
-      </w:r>
-      <w:r>
-        <w:t xml:space="preserve"> </w:t>
-      </w:r>
-      <w:r>
-        <w:rPr>
-          <w:b/>
-          <w:bCs/>
-        </w:rPr>
-        <w:t xml:space="preserve">not</w:t>
-      </w:r>
-      <w:r>
-        <w:t xml:space="preserve"> </w:t>
-      </w:r>
-      <w:r>
-        <w:t xml:space="preserve">add a TXT. To re-trigger issuance:</w:t>
-      </w:r>
-      <w:r>
-        <w:t xml:space="preserve"> </w:t>
-      </w:r>
-      <w:r>
-        <w:t xml:space="preserve">1. In</w:t>
-      </w:r>
-      <w:r>
-        <w:t xml:space="preserve"> </w:t>
-      </w:r>
-      <w:r>
-        <w:rPr>
-          <w:b/>
-          <w:bCs/>
-        </w:rPr>
-        <w:t xml:space="preserve">Railway → web → Settings → Networking</w:t>
-      </w:r>
-      <w:r>
-        <w:t xml:space="preserve">,</w:t>
-      </w:r>
-      <w:r>
-        <w:t xml:space="preserve"> </w:t>
-      </w:r>
-      <w:r>
-        <w:rPr>
-          <w:b/>
-          <w:bCs/>
-        </w:rPr>
-        <w:t xml:space="preserve">remove</w:t>
-      </w:r>
-      <w:r>
-        <w:t xml:space="preserve"> </w:t>
-      </w:r>
-      <w:r>
-        <w:t xml:space="preserve">the</w:t>
-      </w:r>
-      <w:r>
-        <w:t xml:space="preserve"> </w:t>
-      </w:r>
-      <w:r>
-        <w:rPr>
-          <w:rStyle w:val="VerbatimChar"/>
-        </w:rPr>
-        <w:t xml:space="preserve">fund.kuja.org</w:t>
-      </w:r>
-      <w:r>
-        <w:t xml:space="preserve"> </w:t>
-      </w:r>
-      <w:r>
-        <w:t xml:space="preserve">custom domain and</w:t>
-      </w:r>
-      <w:r>
-        <w:t xml:space="preserve"> </w:t>
-      </w:r>
-      <w:r>
-        <w:rPr>
-          <w:b/>
-          <w:bCs/>
-        </w:rPr>
-        <w:t xml:space="preserve">re-add</w:t>
-      </w:r>
-      <w:r>
-        <w:t xml:space="preserve"> </w:t>
-      </w:r>
-      <w:r>
-        <w:t xml:space="preserve">it (</w:t>
-      </w:r>
-      <w:r>
-        <w:rPr>
-          <w:rStyle w:val="VerbatimChar"/>
-        </w:rPr>
-        <w:t xml:space="preserve">+ Custom Domain</w:t>
-      </w:r>
-      <w:r>
-        <w:t xml:space="preserve"> </w:t>
-      </w:r>
-      <w:r>
-        <w:t xml:space="preserve">→</w:t>
-      </w:r>
-      <w:r>
-        <w:t xml:space="preserve"> </w:t>
-      </w:r>
-      <w:r>
-        <w:rPr>
-          <w:rStyle w:val="VerbatimChar"/>
-        </w:rPr>
-        <w:t xml:space="preserve">fund.kuja.org</w:t>
-      </w:r>
-      <w:r>
-        <w:t xml:space="preserve">). The CNAME target stays the same (</w:t>
-      </w:r>
-      <w:r>
-        <w:rPr>
-          <w:rStyle w:val="VerbatimChar"/>
-        </w:rPr>
-        <w:t xml:space="preserve">u7b375h8.up.railway.app</w:t>
-      </w:r>
-      <w:r>
-        <w:t xml:space="preserve">), so no DNS change is needed.</w:t>
-      </w:r>
-      <w:r>
-        <w:t xml:space="preserve"> </w:t>
-      </w:r>
-      <w:r>
-        <w:t xml:space="preserve">2. Wait ~15–30 min for Railway to re-validate and issue the cert.</w:t>
-      </w:r>
-      <w:r>
-        <w:t xml:space="preserve"> </w:t>
-      </w:r>
-      <w:r>
-        <w:t xml:space="preserve">3. Re-check with the verify steps in Part D. If it still fails, check the Cloudflare/CAA gotchas above, then contact Railway support with the domain name.</w:t>
+        <w:t xml:space="preserve">Once both DNS records propagate, the entry flips to</w:t>
+      </w:r>
+      <w:r>
+        <w:t xml:space="preserve"> </w:t>
+      </w:r>
+      <w:r>
+        <w:rPr>
+          <w:b/>
+          <w:bCs/>
+        </w:rPr>
+        <w:t xml:space="preserve">Active</w:t>
+      </w:r>
+      <w:r>
+        <w:t xml:space="preserve"> </w:t>
+      </w:r>
+      <w:r>
+        <w:t xml:space="preserve">(green) and the cert issues.</w:t>
       </w:r>
     </w:p>
     <w:p>
@@ -1892,8 +1933,7 @@
       </w:r>
     </w:p>
     <w:bookmarkEnd w:id="12"/>
-    <w:bookmarkEnd w:id="13"/>
-    <w:bookmarkStart w:id="14" w:name="X3bc2051933933825c0e9ed266abf1dbeb8687f5"/>
+    <w:bookmarkStart w:id="13" w:name="X3bc2051933933825c0e9ed266abf1dbeb8687f5"/>
     <w:p>
       <w:pPr>
         <w:pStyle w:val="Heading2"/>
@@ -1955,26 +1995,13 @@
           <w:b/>
           <w:bCs/>
         </w:rPr>
-        <w:t xml:space="preserve">is Active in Railway.</w:t>
-      </w:r>
-      <w:r>
-        <w:t xml:space="preserve"> </w:t>
-      </w:r>
-      <w:r>
-        <w:t xml:space="preserve">Several settings currently default to the old Railway URL; point them at the new domain or a few features break. In</w:t>
-      </w:r>
-      <w:r>
-        <w:t xml:space="preserve"> </w:t>
-      </w:r>
-      <w:r>
-        <w:rPr>
-          <w:b/>
-          <w:bCs/>
-        </w:rPr>
-        <w:t xml:space="preserve">Railway → web → Variables</w:t>
-      </w:r>
-      <w:r>
-        <w:t xml:space="preserve">, set/update:</w:t>
+        <w:t xml:space="preserve">is Active.</w:t>
+      </w:r>
+      <w:r>
+        <w:t xml:space="preserve"> </w:t>
+      </w:r>
+      <w:r>
+        <w:t xml:space="preserve">Several settings default to the old Railway URL; point them at the new domain or a few features break.</w:t>
       </w:r>
     </w:p>
     <w:tbl>
@@ -2062,22 +2089,7 @@
                 <w:i/>
                 <w:iCs/>
               </w:rPr>
-              <w:t xml:space="preserve">(comma-separate if keeping others, e.g. </w:t>
-            </w:r>
-            <w:r>
-              <w:rPr>
-                <w:rStyle w:val="VerbatimChar"/>
-                <w:i/>
-                <w:iCs/>
-              </w:rPr>
-              <w:t xml:space="preserve">https://fund.kuja.org,https://web-production-6f8a.up.railway.app</w:t>
-            </w:r>
-            <w:r>
-              <w:rPr>
-                <w:i/>
-                <w:iCs/>
-              </w:rPr>
-              <w:t xml:space="preserve">)</w:t>
+              <w:t xml:space="preserve">(comma-separate to keep others)</w:t>
             </w:r>
           </w:p>
         </w:tc>
@@ -2180,59 +2192,7 @@
               <w:pStyle w:val="Compact"/>
             </w:pPr>
             <w:r>
-              <w:t xml:space="preserve">The domain passkeys are bound to. Using the parent</w:t>
-            </w:r>
-            <w:r>
-              <w:t xml:space="preserve"> </w:t>
-            </w:r>
-            <w:r>
-              <w:rPr>
-                <w:rStyle w:val="VerbatimChar"/>
-              </w:rPr>
-              <w:t xml:space="preserve">kuja.org</w:t>
-            </w:r>
-            <w:r>
-              <w:t xml:space="preserve"> </w:t>
-            </w:r>
-            <w:r>
-              <w:t xml:space="preserve">lets passkeys work on</w:t>
-            </w:r>
-            <w:r>
-              <w:t xml:space="preserve"> </w:t>
-            </w:r>
-            <w:r>
-              <w:rPr>
-                <w:rStyle w:val="VerbatimChar"/>
-              </w:rPr>
-              <w:t xml:space="preserve">fund.kuja.org</w:t>
-            </w:r>
-            <w:r>
-              <w:t xml:space="preserve"> </w:t>
-            </w:r>
-            <w:r>
-              <w:rPr>
-                <w:b/>
-                <w:bCs/>
-              </w:rPr>
-              <w:t xml:space="preserve">and</w:t>
-            </w:r>
-            <w:r>
-              <w:t xml:space="preserve"> </w:t>
-            </w:r>
-            <w:r>
-              <w:t xml:space="preserve">survive future subdomain changes. (</w:t>
-            </w:r>
-            <w:r>
-              <w:rPr>
-                <w:rStyle w:val="VerbatimChar"/>
-              </w:rPr>
-              <w:t xml:space="preserve">fund.kuja.org</w:t>
-            </w:r>
-            <w:r>
-              <w:t xml:space="preserve"> </w:t>
-            </w:r>
-            <w:r>
-              <w:t xml:space="preserve">also works but is narrower.)</w:t>
+              <w:t xml:space="preserve">Domain passkeys are bound to; the parent zone lets them work across subdomains.</w:t>
             </w:r>
           </w:p>
         </w:tc>
@@ -2273,38 +2233,7 @@
               <w:pStyle w:val="Compact"/>
             </w:pPr>
             <w:r>
-              <w:t xml:space="preserve">The</w:t>
-            </w:r>
-            <w:r>
-              <w:t xml:space="preserve"> </w:t>
-            </w:r>
-            <w:r>
-              <w:rPr>
-                <w:b/>
-                <w:bCs/>
-              </w:rPr>
-              <w:t xml:space="preserve">return URL for the Kuja Trust capacity-assessment hand-off</w:t>
-            </w:r>
-            <w:r>
-              <w:t xml:space="preserve"> </w:t>
-            </w:r>
-            <w:r>
-              <w:t xml:space="preserve">— so NGOs come back to</w:t>
-            </w:r>
-            <w:r>
-              <w:t xml:space="preserve"> </w:t>
-            </w:r>
-            <w:r>
-              <w:rPr>
-                <w:rStyle w:val="VerbatimChar"/>
-              </w:rPr>
-              <w:t xml:space="preserve">fund.kuja.org</w:t>
-            </w:r>
-            <w:r>
-              <w:t xml:space="preserve"> </w:t>
-            </w:r>
-            <w:r>
-              <w:t xml:space="preserve">after their assessment.</w:t>
+              <w:t xml:space="preserve">Return URL for the Kuja Trust capacity-assessment hand-off.</w:t>
             </w:r>
           </w:p>
         </w:tc>
@@ -2407,106 +2336,7 @@
         <w:pStyle w:val="BodyText"/>
       </w:pPr>
       <w:r>
-        <w:t xml:space="preserve">Saving variables triggers a redeploy (about a minute).</w:t>
-      </w:r>
-    </w:p>
-    <w:p>
-      <w:pPr>
-        <w:pStyle w:val="BodyText"/>
-      </w:pPr>
-      <w:r>
-        <w:rPr>
-          <w:b/>
-          <w:bCs/>
-        </w:rPr>
-        <w:t xml:space="preserve">Two things to know:</w:t>
-      </w:r>
-      <w:r>
-        <w:t xml:space="preserve"> </w:t>
-      </w:r>
-      <w:r>
-        <w:t xml:space="preserve">-</w:t>
-      </w:r>
-      <w:r>
-        <w:t xml:space="preserve"> </w:t>
-      </w:r>
-      <w:r>
-        <w:rPr>
-          <w:b/>
-          <w:bCs/>
-        </w:rPr>
-        <w:t xml:space="preserve">Passkeys re-register once.</w:t>
-      </w:r>
-      <w:r>
-        <w:t xml:space="preserve"> </w:t>
-      </w:r>
-      <w:r>
-        <w:t xml:space="preserve">Any passkeys enrolled under the old Railway host stop working when</w:t>
-      </w:r>
-      <w:r>
-        <w:t xml:space="preserve"> </w:t>
-      </w:r>
-      <w:r>
-        <w:rPr>
-          <w:rStyle w:val="VerbatimChar"/>
-        </w:rPr>
-        <w:t xml:space="preserve">WEBAUTHN_RP_ID</w:t>
-      </w:r>
-      <w:r>
-        <w:t xml:space="preserve"> </w:t>
-      </w:r>
-      <w:r>
-        <w:t xml:space="preserve">changes; affected users simply re-add a passkey in</w:t>
-      </w:r>
-      <w:r>
-        <w:t xml:space="preserve"> </w:t>
-      </w:r>
-      <w:r>
-        <w:rPr>
-          <w:b/>
-          <w:bCs/>
-        </w:rPr>
-        <w:t xml:space="preserve">Settings → Security</w:t>
-      </w:r>
-      <w:r>
-        <w:t xml:space="preserve">. (Password + authenticator-app/TOTP sign-in are unaffected.)</w:t>
-      </w:r>
-      <w:r>
-        <w:t xml:space="preserve"> </w:t>
-      </w:r>
-      <w:r>
-        <w:t xml:space="preserve">-</w:t>
-      </w:r>
-      <w:r>
-        <w:t xml:space="preserve"> </w:t>
-      </w:r>
-      <w:r>
-        <w:rPr>
-          <w:b/>
-          <w:bCs/>
-        </w:rPr>
-        <w:t xml:space="preserve">Kuja Trust app is separate.</w:t>
-      </w:r>
-      <w:r>
-        <w:t xml:space="preserve"> </w:t>
-      </w:r>
-      <w:r>
-        <w:t xml:space="preserve">It stays on its own domain; the only cross-app dependency for this domain change is</w:t>
-      </w:r>
-      <w:r>
-        <w:t xml:space="preserve"> </w:t>
-      </w:r>
-      <w:r>
-        <w:rPr>
-          <w:rStyle w:val="VerbatimChar"/>
-        </w:rPr>
-        <w:t xml:space="preserve">KUJA_GRANT_BASE_URL</w:t>
-      </w:r>
-      <w:r>
-        <w:t xml:space="preserve"> </w:t>
-      </w:r>
-      <w:r>
-        <w:t xml:space="preserve">above.</w:t>
+        <w:t xml:space="preserve">Saving variables triggers a redeploy (~1 min). Passkeys enrolled under the old host re-register once (Settings → Security).</w:t>
       </w:r>
     </w:p>
     <w:p>
@@ -2516,14 +2346,14 @@
         </w:pict>
       </w:r>
     </w:p>
-    <w:bookmarkEnd w:id="14"/>
-    <w:bookmarkStart w:id="15" w:name="X51b9109d040a88cc7ee255c204aca52ed4867aa"/>
+    <w:bookmarkEnd w:id="13"/>
+    <w:bookmarkStart w:id="14" w:name="X4850bf5d44ee07f9b96414a9ab741fb8cd8d227"/>
     <w:p>
       <w:pPr>
         <w:pStyle w:val="Heading2"/>
       </w:pPr>
       <w:r>
-        <w:t xml:space="preserve">Part D — Verify (after the certificate is issued)</w:t>
+        <w:t xml:space="preserve">Part D — Verify (after both DNS records are live)</w:t>
       </w:r>
     </w:p>
     <w:p>
@@ -2539,7 +2369,7 @@
           <w:b/>
           <w:bCs/>
         </w:rPr>
-        <w:t xml:space="preserve">CNAME resolves:</w:t>
+        <w:t xml:space="preserve">Both records resolve:</w:t>
       </w:r>
       <w:r>
         <w:t xml:space="preserve"> </w:t>
@@ -2554,7 +2384,7 @@
         <w:t xml:space="preserve"> </w:t>
       </w:r>
       <w:r>
-        <w:t xml:space="preserve">returns a Railway address (CNAME →</w:t>
+        <w:t xml:space="preserve">→ a Railway</w:t>
       </w:r>
       <w:r>
         <w:t xml:space="preserve"> </w:t>
@@ -2566,17 +2396,59 @@
         <w:t xml:space="preserve">*.up.railway.app</w:t>
       </w:r>
       <w:r>
-        <w:t xml:space="preserve">).</w:t>
-      </w:r>
-      <w:r>
-        <w:t xml:space="preserve"> </w:t>
-      </w:r>
-      <w:r>
-        <w:rPr>
-          <w:i/>
-          <w:iCs/>
-        </w:rPr>
-        <w:t xml:space="preserve">(No TXT lookup is needed — Railway doesn’t require one.)</w:t>
+        <w:t xml:space="preserve"> </w:t>
+      </w:r>
+      <w:r>
+        <w:t xml:space="preserve">target,</w:t>
+      </w:r>
+      <w:r>
+        <w:t xml:space="preserve"> </w:t>
+      </w:r>
+      <w:r>
+        <w:rPr>
+          <w:b/>
+          <w:bCs/>
+        </w:rPr>
+        <w:t xml:space="preserve">and</w:t>
+      </w:r>
+      <w:r>
+        <w:t xml:space="preserve"> </w:t>
+      </w:r>
+      <w:r>
+        <w:rPr>
+          <w:rStyle w:val="VerbatimChar"/>
+        </w:rPr>
+        <w:t xml:space="preserve">nslookup -type=TXT _railway-verify.fund.kuja.org</w:t>
+      </w:r>
+      <w:r>
+        <w:t xml:space="preserve"> </w:t>
+      </w:r>
+      <w:r>
+        <w:t xml:space="preserve">→ the</w:t>
+      </w:r>
+      <w:r>
+        <w:t xml:space="preserve"> </w:t>
+      </w:r>
+      <w:r>
+        <w:rPr>
+          <w:rStyle w:val="VerbatimChar"/>
+        </w:rPr>
+        <w:t xml:space="preserve">railway-verify=…</w:t>
+      </w:r>
+      <w:r>
+        <w:t xml:space="preserve"> </w:t>
+      </w:r>
+      <w:r>
+        <w:t xml:space="preserve">value. (If that TXT lookup says</w:t>
+      </w:r>
+      <w:r>
+        <w:t xml:space="preserve"> </w:t>
+      </w:r>
+      <w:r>
+        <w:t xml:space="preserve">“does not exist”</w:t>
+      </w:r>
+      <w:r>
+        <w:t xml:space="preserve">, you’re still in the stuck state — go back to Part A record #2.)</w:t>
       </w:r>
     </w:p>
     <w:p>
@@ -2598,7 +2470,7 @@
         <w:t xml:space="preserve"> </w:t>
       </w:r>
       <w:r>
-        <w:t xml:space="preserve">the domain is green/</w:t>
+        <w:t xml:space="preserve">green/</w:t>
       </w:r>
       <w:r>
         <w:rPr>
@@ -2611,7 +2483,7 @@
         <w:t xml:space="preserve"> </w:t>
       </w:r>
       <w:r>
-        <w:t xml:space="preserve">in Railway → web → Settings → Networking, and</w:t>
+        <w:t xml:space="preserve">in the dashboard, and</w:t>
       </w:r>
       <w:r>
         <w:t xml:space="preserve"> </w:t>
@@ -2641,7 +2513,7 @@
         <w:t xml:space="preserve"> </w:t>
       </w:r>
       <w:r>
-        <w:t xml:space="preserve">with a valid certificate whose name is</w:t>
+        <w:t xml:space="preserve">with a certificate whose name is</w:t>
       </w:r>
       <w:r>
         <w:t xml:space="preserve"> </w:t>
@@ -2668,7 +2540,7 @@
         <w:t xml:space="preserve">*.up.railway.app</w:t>
       </w:r>
       <w:r>
-        <w:t xml:space="preserve">). In a browser the padlock is clean.</w:t>
+        <w:t xml:space="preserve">).</w:t>
       </w:r>
       <w:r>
         <w:t xml:space="preserve"> </w:t>
@@ -2707,7 +2579,7 @@
           <w:i/>
           <w:iCs/>
         </w:rPr>
-        <w:t xml:space="preserve">/ cert-name error, or the certificate showing</w:t>
+        <w:t xml:space="preserve">/ cert-name error, or a cert showing</w:t>
       </w:r>
       <w:r>
         <w:rPr>
@@ -2729,7 +2601,7 @@
           <w:i/>
           <w:iCs/>
         </w:rPr>
-        <w:t xml:space="preserve">, means the certificate hasn’t issued yet — wait, or re-trigger per Part B.)</w:t>
+        <w:t xml:space="preserve">, means it hasn’t verified/issued yet — recheck the TXT.)</w:t>
       </w:r>
     </w:p>
     <w:p>
@@ -2782,7 +2654,7 @@
         <w:t xml:space="preserve"> </w:t>
       </w:r>
       <w:r>
-        <w:t xml:space="preserve">sign-in page with Kuja branding.</w:t>
+        <w:t xml:space="preserve">sign-in page.</w:t>
       </w:r>
     </w:p>
     <w:p>
@@ -2801,10 +2673,7 @@
         <w:t xml:space="preserve">Sign in</w:t>
       </w:r>
       <w:r>
-        <w:t xml:space="preserve"> </w:t>
-      </w:r>
-      <w:r>
-        <w:t xml:space="preserve">with a real account; the dashboard loads with no console/CORS errors.</w:t>
+        <w:t xml:space="preserve">; dashboard loads with no console/CORS errors.</w:t>
       </w:r>
     </w:p>
     <w:p>
@@ -2820,127 +2689,49 @@
           <w:b/>
           <w:bCs/>
         </w:rPr>
-        <w:t xml:space="preserve">Passkey (if used):</w:t>
-      </w:r>
-      <w:r>
-        <w:t xml:space="preserve"> </w:t>
-      </w:r>
-      <w:r>
-        <w:t xml:space="preserve">re-register a passkey under</w:t>
-      </w:r>
-      <w:r>
-        <w:t xml:space="preserve"> </w:t>
-      </w:r>
-      <w:r>
-        <w:rPr>
-          <w:rStyle w:val="VerbatimChar"/>
-        </w:rPr>
-        <w:t xml:space="preserve">fund.kuja.org</w:t>
-      </w:r>
-      <w:r>
-        <w:t xml:space="preserve">, sign out, sign back in with it.</w:t>
-      </w:r>
-    </w:p>
-    <w:p>
-      <w:pPr>
-        <w:pStyle w:val="Compact"/>
-        <w:numPr>
-          <w:ilvl w:val="0"/>
-          <w:numId w:val="1003"/>
-        </w:numPr>
-      </w:pPr>
-      <w:r>
-        <w:rPr>
-          <w:b/>
-          <w:bCs/>
-        </w:rPr>
-        <w:t xml:space="preserve">Trust hand-off round-trip:</w:t>
-      </w:r>
-      <w:r>
-        <w:t xml:space="preserve"> </w:t>
-      </w:r>
-      <w:r>
-        <w:t xml:space="preserve">as an NGO, open</w:t>
-      </w:r>
-      <w:r>
-        <w:t xml:space="preserve"> </w:t>
-      </w:r>
-      <w:r>
-        <w:rPr>
-          <w:b/>
-          <w:bCs/>
-        </w:rPr>
-        <w:t xml:space="preserve">Trust Profile</w:t>
-      </w:r>
-      <w:r>
-        <w:t xml:space="preserve"> </w:t>
-      </w:r>
-      <w:r>
-        <w:t xml:space="preserve">→</w:t>
-      </w:r>
-      <w:r>
-        <w:t xml:space="preserve"> </w:t>
-      </w:r>
-      <w:r>
-        <w:rPr>
-          <w:b/>
-          <w:bCs/>
-        </w:rPr>
-        <w:t xml:space="preserve">“Complete your capacity assessment in Kuja Trust”</w:t>
-      </w:r>
-      <w:r>
-        <w:t xml:space="preserve"> </w:t>
-      </w:r>
-      <w:r>
-        <w:t xml:space="preserve">→ you’re taken to Kuja Trust →</w:t>
-      </w:r>
-      <w:r>
-        <w:t xml:space="preserve"> </w:t>
-      </w:r>
-      <w:r>
-        <w:rPr>
-          <w:b/>
-          <w:bCs/>
-        </w:rPr>
+        <w:t xml:space="preserve">Trust hand-off round-trip</w:t>
+      </w:r>
+      <w:r>
+        <w:t xml:space="preserve"> </w:t>
+      </w:r>
+      <w:r>
+        <w:t xml:space="preserve">(proves</w:t>
+      </w:r>
+      <w:r>
+        <w:t xml:space="preserve"> </w:t>
+      </w:r>
+      <w:r>
+        <w:rPr>
+          <w:rStyle w:val="VerbatimChar"/>
+        </w:rPr>
+        <w:t xml:space="preserve">KUJA_GRANT_BASE_URL</w:t>
+      </w:r>
+      <w:r>
+        <w:t xml:space="preserve">): NGO → Trust Profile → complete assessment in Kuja Trust →</w:t>
+      </w:r>
+      <w:r>
+        <w:t xml:space="preserve"> </w:t>
+      </w:r>
+      <w:r>
         <w:t xml:space="preserve">“Return to your application”</w:t>
       </w:r>
       <w:r>
         <w:t xml:space="preserve"> </w:t>
       </w:r>
       <w:r>
-        <w:t xml:space="preserve">→ you land back on</w:t>
-      </w:r>
-      <w:r>
-        <w:t xml:space="preserve"> </w:t>
-      </w:r>
-      <w:r>
-        <w:rPr>
-          <w:rStyle w:val="VerbatimChar"/>
-          <w:b/>
-          <w:bCs/>
+        <w:t xml:space="preserve">→ lands on</w:t>
+      </w:r>
+      <w:r>
+        <w:t xml:space="preserve"> </w:t>
+      </w:r>
+      <w:r>
+        <w:rPr>
+          <w:rStyle w:val="VerbatimChar"/>
         </w:rPr>
         <w:t xml:space="preserve">https://fund.kuja.org/trust?from=trust</w:t>
       </w:r>
       <w:r>
-        <w:t xml:space="preserve"> </w:t>
-      </w:r>
-      <w:r>
-        <w:t xml:space="preserve">(this proves</w:t>
-      </w:r>
-      <w:r>
-        <w:t xml:space="preserve"> </w:t>
-      </w:r>
-      <w:r>
-        <w:rPr>
-          <w:rStyle w:val="VerbatimChar"/>
-        </w:rPr>
-        <w:t xml:space="preserve">KUJA_GRANT_BASE_URL</w:t>
-      </w:r>
-      <w:r>
-        <w:t xml:space="preserve"> </w:t>
-      </w:r>
-      <w:r>
-        <w:t xml:space="preserve">is correct).</w:t>
+        <w:t xml:space="preserve">.</w:t>
       </w:r>
     </w:p>
     <w:p>
@@ -2950,8 +2741,8 @@
         </w:pict>
       </w:r>
     </w:p>
-    <w:bookmarkEnd w:id="15"/>
-    <w:bookmarkStart w:id="17" w:name="part-e-rollback"/>
+    <w:bookmarkEnd w:id="14"/>
+    <w:bookmarkStart w:id="16" w:name="part-e-rollback"/>
     <w:p>
       <w:pPr>
         <w:pStyle w:val="Heading2"/>
@@ -2965,35 +2756,19 @@
         <w:pStyle w:val="FirstParagraph"/>
       </w:pPr>
       <w:r>
-        <w:t xml:space="preserve">Because the change is additive, rollback is low-risk:</w:t>
-      </w:r>
-      <w:r>
-        <w:t xml:space="preserve"> </w:t>
-      </w:r>
-      <w:r>
-        <w:t xml:space="preserve">1. Revert the Variables in Part C to their previous values (or the old Railway URL).</w:t>
-      </w:r>
-      <w:r>
-        <w:t xml:space="preserve"> </w:t>
-      </w:r>
-      <w:r>
-        <w:t xml:space="preserve">2. In Railway → web → Settings → Networking,</w:t>
-      </w:r>
-      <w:r>
-        <w:t xml:space="preserve"> </w:t>
-      </w:r>
-      <w:r>
-        <w:rPr>
-          <w:b/>
-          <w:bCs/>
-        </w:rPr>
-        <w:t xml:space="preserve">remove</w:t>
-      </w:r>
-      <w:r>
-        <w:t xml:space="preserve"> </w:t>
-      </w:r>
-      <w:r>
-        <w:t xml:space="preserve">the</w:t>
+        <w:t xml:space="preserve">Additive, so low-risk:</w:t>
+      </w:r>
+      <w:r>
+        <w:t xml:space="preserve"> </w:t>
+      </w:r>
+      <w:r>
+        <w:t xml:space="preserve">1. Revert the Part-C Variables.</w:t>
+      </w:r>
+      <w:r>
+        <w:t xml:space="preserve"> </w:t>
+      </w:r>
+      <w:r>
+        <w:t xml:space="preserve">2. Remove the</w:t>
       </w:r>
       <w:r>
         <w:t xml:space="preserve"> </w:t>
@@ -3008,7 +2783,7 @@
         <w:t xml:space="preserve"> </w:t>
       </w:r>
       <w:r>
-        <w:t xml:space="preserve">custom domain.</w:t>
+        <w:t xml:space="preserve">custom domain in Railway.</w:t>
       </w:r>
       <w:r>
         <w:t xml:space="preserve"> </w:t>
@@ -3030,13 +2805,44 @@
         <w:t xml:space="preserve"> </w:t>
       </w:r>
       <w:r>
-        <w:t xml:space="preserve">record.</w:t>
-      </w:r>
-      <w:r>
-        <w:t xml:space="preserve"> </w:t>
-      </w:r>
-      <w:r>
-        <w:t xml:space="preserve">The app remains fully available at</w:t>
+        <w:t xml:space="preserve">and</w:t>
+      </w:r>
+      <w:r>
+        <w:t xml:space="preserve"> </w:t>
+      </w:r>
+      <w:r>
+        <w:rPr>
+          <w:rStyle w:val="VerbatimChar"/>
+          <w:b/>
+          <w:bCs/>
+        </w:rPr>
+        <w:t xml:space="preserve">_railway-verify.fund</w:t>
+      </w:r>
+      <w:r>
+        <w:rPr>
+          <w:b/>
+          <w:bCs/>
+        </w:rPr>
+        <w:t xml:space="preserve"> </w:t>
+      </w:r>
+      <w:r>
+        <w:rPr>
+          <w:b/>
+          <w:bCs/>
+        </w:rPr>
+        <w:t xml:space="preserve">TXT</w:t>
+      </w:r>
+      <w:r>
+        <w:t xml:space="preserve"> </w:t>
+      </w:r>
+      <w:r>
+        <w:t xml:space="preserve">records.</w:t>
+      </w:r>
+      <w:r>
+        <w:t xml:space="preserve"> </w:t>
+      </w:r>
+      <w:r>
+        <w:t xml:space="preserve">The app stays available at</w:t>
       </w:r>
       <w:r>
         <w:t xml:space="preserve"> </w:t>
@@ -3061,7 +2867,7 @@
         </w:pict>
       </w:r>
     </w:p>
-    <w:bookmarkStart w:id="16" w:name="quick-reference"/>
+    <w:bookmarkStart w:id="15" w:name="quick-reference"/>
     <w:p>
       <w:pPr>
         <w:pStyle w:val="Heading3"/>
@@ -3114,7 +2920,7 @@
         <w:t xml:space="preserve"> </w:t>
       </w:r>
       <w:r>
-        <w:t xml:space="preserve">tenant (integrates Kuja Trust)</w:t>
+        <w:t xml:space="preserve">tenant.</w:t>
       </w:r>
     </w:p>
     <w:p>
@@ -3177,6 +2983,9 @@
         </w:rPr>
         <w:t xml:space="preserve">web</w:t>
       </w:r>
+      <w:r>
+        <w:t xml:space="preserve">.</w:t>
+      </w:r>
     </w:p>
     <w:p>
       <w:pPr>
@@ -3191,38 +3000,67 @@
           <w:b/>
           <w:bCs/>
         </w:rPr>
-        <w:t xml:space="preserve">DNS record (the only one):</w:t>
-      </w:r>
-      <w:r>
-        <w:t xml:space="preserve"> </w:t>
-      </w:r>
-      <w:r>
-        <w:rPr>
-          <w:rStyle w:val="VerbatimChar"/>
-        </w:rPr>
-        <w:t xml:space="preserve">CNAME  fund  →  u7b375h8.up.railway.app</w:t>
-      </w:r>
-      <w:r>
-        <w:t xml:space="preserve"> </w:t>
-      </w:r>
-      <w:r>
-        <w:t xml:space="preserve">— already live &amp; propagated.</w:t>
-      </w:r>
-      <w:r>
-        <w:t xml:space="preserve"> </w:t>
-      </w:r>
-      <w:r>
-        <w:rPr>
-          <w:b/>
-          <w:bCs/>
-        </w:rPr>
-        <w:t xml:space="preserve">No TXT record is required.</w:t>
-      </w:r>
-      <w:r>
-        <w:t xml:space="preserve"> </w:t>
-      </w:r>
-      <w:r>
-        <w:t xml:space="preserve">TTL 300; DNS-only if Cloudflare.</w:t>
+        <w:t xml:space="preserve">DNS records (BOTH required):</w:t>
+      </w:r>
+      <w:r>
+        <w:t xml:space="preserve"> </w:t>
+      </w:r>
+      <w:r>
+        <w:t xml:space="preserve">(1)</w:t>
+      </w:r>
+      <w:r>
+        <w:t xml:space="preserve"> </w:t>
+      </w:r>
+      <w:r>
+        <w:rPr>
+          <w:rStyle w:val="VerbatimChar"/>
+        </w:rPr>
+        <w:t xml:space="preserve">CNAME  fund → 0tvwlstv.up.railway.app</w:t>
+      </w:r>
+      <w:r>
+        <w:t xml:space="preserve">; (2)</w:t>
+      </w:r>
+      <w:r>
+        <w:t xml:space="preserve"> </w:t>
+      </w:r>
+      <w:r>
+        <w:rPr>
+          <w:rStyle w:val="VerbatimChar"/>
+        </w:rPr>
+        <w:t xml:space="preserve">TXT  _railway-verify.fund → railway-verify=7c60d4d4b9bd5dbac68b50dc126395139dd63a229da0ba3fbb49531cff107881</w:t>
+      </w:r>
+      <w:r>
+        <w:t xml:space="preserve">. TTL 300. The TXT is the ownership-verification record —</w:t>
+      </w:r>
+      <w:r>
+        <w:t xml:space="preserve"> </w:t>
+      </w:r>
+      <w:r>
+        <w:rPr>
+          <w:b/>
+          <w:bCs/>
+        </w:rPr>
+        <w:t xml:space="preserve">without it the cert stays stuck at</w:t>
+      </w:r>
+      <w:r>
+        <w:rPr>
+          <w:b/>
+          <w:bCs/>
+        </w:rPr>
+        <w:t xml:space="preserve"> </w:t>
+      </w:r>
+      <w:r>
+        <w:rPr>
+          <w:b/>
+          <w:bCs/>
+        </w:rPr>
+        <w:t xml:space="preserve">“validating ownership.”</w:t>
+      </w:r>
+      <w:r>
+        <w:t xml:space="preserve"> </w:t>
+      </w:r>
+      <w:r>
+        <w:t xml:space="preserve">Read live values from Railway → web → Settings → Networking if in doubt.</w:t>
       </w:r>
     </w:p>
     <w:p>
@@ -3238,162 +3076,119 @@
           <w:b/>
           <w:bCs/>
         </w:rPr>
-        <w:t xml:space="preserve">Why it’s not up yet (2026-08-19):</w:t>
-      </w:r>
-      <w:r>
-        <w:t xml:space="preserve"> </w:t>
-      </w:r>
-      <w:r>
-        <w:t xml:space="preserve">Railway’s TLS cert for</w:t>
-      </w:r>
-      <w:r>
-        <w:t xml:space="preserve"> </w:t>
-      </w:r>
-      <w:r>
-        <w:rPr>
-          <w:rStyle w:val="VerbatimChar"/>
-        </w:rPr>
-        <w:t xml:space="preserve">fund.kuja.org</w:t>
-      </w:r>
-      <w:r>
-        <w:t xml:space="preserve"> </w:t>
-      </w:r>
-      <w:r>
-        <w:t xml:space="preserve">is still issuing (</w:t>
-      </w:r>
-      <w:r>
-        <w:t xml:space="preserve">“validating ownership”</w:t>
-      </w:r>
-      <w:r>
-        <w:t xml:space="preserve">). It completes automatically; if stuck for hours, remove + re-add the domain in Railway (Part B) — this is a Railway step, not a DNS one.</w:t>
+        <w:t xml:space="preserve">Env to update on</w:t>
+      </w:r>
+      <w:r>
+        <w:rPr>
+          <w:b/>
+          <w:bCs/>
+        </w:rPr>
+        <w:t xml:space="preserve"> </w:t>
+      </w:r>
+      <w:r>
+        <w:rPr>
+          <w:rStyle w:val="VerbatimChar"/>
+          <w:b/>
+          <w:bCs/>
+        </w:rPr>
+        <w:t xml:space="preserve">web</w:t>
+      </w:r>
+      <w:r>
+        <w:rPr>
+          <w:b/>
+          <w:bCs/>
+        </w:rPr>
+        <w:t xml:space="preserve"> </w:t>
+      </w:r>
+      <w:r>
+        <w:rPr>
+          <w:b/>
+          <w:bCs/>
+        </w:rPr>
+        <w:t xml:space="preserve">once Active:</w:t>
+      </w:r>
+      <w:r>
+        <w:t xml:space="preserve"> </w:t>
+      </w:r>
+      <w:r>
+        <w:rPr>
+          <w:rStyle w:val="VerbatimChar"/>
+        </w:rPr>
+        <w:t xml:space="preserve">CORS_ORIGINS</w:t>
+      </w:r>
+      <w:r>
+        <w:t xml:space="preserve">,</w:t>
+      </w:r>
+      <w:r>
+        <w:t xml:space="preserve"> </w:t>
+      </w:r>
+      <w:r>
+        <w:rPr>
+          <w:rStyle w:val="VerbatimChar"/>
+        </w:rPr>
+        <w:t xml:space="preserve">WEBAUTHN_ORIGIN</w:t>
+      </w:r>
+      <w:r>
+        <w:t xml:space="preserve">,</w:t>
+      </w:r>
+      <w:r>
+        <w:t xml:space="preserve"> </w:t>
+      </w:r>
+      <w:r>
+        <w:rPr>
+          <w:rStyle w:val="VerbatimChar"/>
+        </w:rPr>
+        <w:t xml:space="preserve">WEBAUTHN_RP_ID</w:t>
+      </w:r>
+      <w:r>
+        <w:t xml:space="preserve">,</w:t>
+      </w:r>
+      <w:r>
+        <w:t xml:space="preserve"> </w:t>
+      </w:r>
+      <w:r>
+        <w:rPr>
+          <w:rStyle w:val="VerbatimChar"/>
+        </w:rPr>
+        <w:t xml:space="preserve">KUJA_GRANT_BASE_URL</w:t>
+      </w:r>
+      <w:r>
+        <w:t xml:space="preserve">,</w:t>
+      </w:r>
+      <w:r>
+        <w:t xml:space="preserve"> </w:t>
+      </w:r>
+      <w:r>
+        <w:rPr>
+          <w:rStyle w:val="VerbatimChar"/>
+        </w:rPr>
+        <w:t xml:space="preserve">KUJA_PUBLIC_HOST</w:t>
+      </w:r>
+      <w:r>
+        <w:t xml:space="preserve"> </w:t>
+      </w:r>
+      <w:r>
+        <w:t xml:space="preserve">(+</w:t>
+      </w:r>
+      <w:r>
+        <w:t xml:space="preserve"> </w:t>
+      </w:r>
+      <w:r>
+        <w:rPr>
+          <w:rStyle w:val="VerbatimChar"/>
+        </w:rPr>
+        <w:t xml:space="preserve">KUJA_PUBLIC_BASE_URL</w:t>
+      </w:r>
+      <w:r>
+        <w:t xml:space="preserve"> </w:t>
+      </w:r>
+      <w:r>
+        <w:t xml:space="preserve">if present).</w:t>
       </w:r>
     </w:p>
-    <w:p>
-      <w:pPr>
-        <w:pStyle w:val="Compact"/>
-        <w:numPr>
-          <w:ilvl w:val="0"/>
-          <w:numId w:val="1004"/>
-        </w:numPr>
-      </w:pPr>
-      <w:r>
-        <w:rPr>
-          <w:b/>
-          <w:bCs/>
-        </w:rPr>
-        <w:t xml:space="preserve">Env to update on</w:t>
-      </w:r>
-      <w:r>
-        <w:rPr>
-          <w:b/>
-          <w:bCs/>
-        </w:rPr>
-        <w:t xml:space="preserve"> </w:t>
-      </w:r>
-      <w:r>
-        <w:rPr>
-          <w:rStyle w:val="VerbatimChar"/>
-          <w:b/>
-          <w:bCs/>
-        </w:rPr>
-        <w:t xml:space="preserve">web</w:t>
-      </w:r>
-      <w:r>
-        <w:rPr>
-          <w:b/>
-          <w:bCs/>
-        </w:rPr>
-        <w:t xml:space="preserve"> </w:t>
-      </w:r>
-      <w:r>
-        <w:rPr>
-          <w:b/>
-          <w:bCs/>
-        </w:rPr>
-        <w:t xml:space="preserve">once Active:</w:t>
-      </w:r>
-      <w:r>
-        <w:t xml:space="preserve"> </w:t>
-      </w:r>
-      <w:r>
-        <w:rPr>
-          <w:rStyle w:val="VerbatimChar"/>
-        </w:rPr>
-        <w:t xml:space="preserve">CORS_ORIGINS</w:t>
-      </w:r>
-      <w:r>
-        <w:t xml:space="preserve">,</w:t>
-      </w:r>
-      <w:r>
-        <w:t xml:space="preserve"> </w:t>
-      </w:r>
-      <w:r>
-        <w:rPr>
-          <w:rStyle w:val="VerbatimChar"/>
-        </w:rPr>
-        <w:t xml:space="preserve">WEBAUTHN_ORIGIN</w:t>
-      </w:r>
-      <w:r>
-        <w:t xml:space="preserve">,</w:t>
-      </w:r>
-      <w:r>
-        <w:t xml:space="preserve"> </w:t>
-      </w:r>
-      <w:r>
-        <w:rPr>
-          <w:rStyle w:val="VerbatimChar"/>
-        </w:rPr>
-        <w:t xml:space="preserve">WEBAUTHN_RP_ID</w:t>
-      </w:r>
-      <w:r>
-        <w:t xml:space="preserve">,</w:t>
-      </w:r>
-      <w:r>
-        <w:t xml:space="preserve"> </w:t>
-      </w:r>
-      <w:r>
-        <w:rPr>
-          <w:rStyle w:val="VerbatimChar"/>
-        </w:rPr>
-        <w:t xml:space="preserve">KUJA_GRANT_BASE_URL</w:t>
-      </w:r>
-      <w:r>
-        <w:t xml:space="preserve">,</w:t>
-      </w:r>
-      <w:r>
-        <w:t xml:space="preserve"> </w:t>
-      </w:r>
-      <w:r>
-        <w:rPr>
-          <w:rStyle w:val="VerbatimChar"/>
-        </w:rPr>
-        <w:t xml:space="preserve">KUJA_PUBLIC_HOST</w:t>
-      </w:r>
-      <w:r>
-        <w:t xml:space="preserve"> </w:t>
-      </w:r>
-      <w:r>
-        <w:t xml:space="preserve">(+</w:t>
-      </w:r>
-      <w:r>
-        <w:t xml:space="preserve"> </w:t>
-      </w:r>
-      <w:r>
-        <w:rPr>
-          <w:rStyle w:val="VerbatimChar"/>
-        </w:rPr>
-        <w:t xml:space="preserve">KUJA_PUBLIC_BASE_URL</w:t>
-      </w:r>
-      <w:r>
-        <w:t xml:space="preserve"> </w:t>
-      </w:r>
-      <w:r>
-        <w:t xml:space="preserve">if present)</w:t>
-      </w:r>
-    </w:p>
+    <w:bookmarkEnd w:id="15"/>
     <w:bookmarkEnd w:id="16"/>
     <w:bookmarkEnd w:id="17"/>
-    <w:bookmarkEnd w:id="18"/>
     <w:sectPr>
       <w:footnotePr>
         <w:numRestart w:val="eachSect"/>

</xml_diff>